<commit_message>
Add missing exam content: TF-IDF, OLTP, transactions, Jaccard, utility matrix
- TF-IDF full formula + worked example with IDF(t,D)=log((|D|+1)/(DF+1))
- Spark ML NLP pipeline: Tokenizer, StopWordsRemover, NGram, CountVectorizer, IDF
- UDFs (User-Defined Functions) in Spark
- countByKey() vs countByValue() with document frequency pattern
- OLTP vs OLAP comparison; BEGIN/COMMIT/ABORT transactions
- Key-Value store operations (Get/Put/Delete/Multi-get/Range)
- Utility matrix: explicit vs implicit ratings
- Jaccard similarity for binary/implicit recommendation data
- Baseline estimate: b_ui = mu + b_u + b_i
- Coverage metric for recommendation diversity

Co-Authored-By: Claude Sonnet 4.6 <noreply@anthropic.com>
</commit_message>
<xml_diff>
--- a/DSAI4205_Exam_Review.docx
+++ b/DSAI4205_Exam_Review.docx
@@ -5145,7 +5145,7 @@
               <w:rPr>
                 <w:sz w:val="17"/>
               </w:rPr>
-              <w:t>TF × log(N/DF) — weights by rarity across docs</w:t>
+              <w:t>TF × IDF — high score = frequent in ONE doc, rare across docs</w:t>
             </w:r>
           </w:p>
         </w:tc>
@@ -5165,6 +5165,457 @@
       </w:tr>
     </w:tbl>
     <w:p/>
+    <w:p>
+      <w:pPr>
+        <w:spacing w:before="200" w:after="40"/>
+      </w:pPr>
+      <w:r>
+        <w:rPr>
+          <w:b/>
+          <w:color w:val="2563EB"/>
+          <w:sz w:val="22"/>
+        </w:rPr>
+        <w:t>TF-IDF — Full Formula &amp; Worked Example</w:t>
+      </w:r>
+    </w:p>
+    <w:p>
+      <w:pPr>
+        <w:spacing w:before="40" w:after="40"/>
+        <w:ind w:left="283"/>
+        <w:shd w:val="clear" w:color="auto" w:fill="1E293B"/>
+      </w:pPr>
+      <w:r>
+        <w:rPr>
+          <w:rFonts w:ascii="Courier New" w:hAnsi="Courier New"/>
+          <w:color w:val="E2E8F0"/>
+          <w:sz w:val="16"/>
+        </w:rPr>
+        <w:t>IDF(t,D)       = log( (|D|+1) / (DF(t,D)+1) )    ← +1 = Laplace smoothing</w:t>
+        <w:br/>
+        <w:t>TF-IDF(t,d,D)  = TF(t,d) x IDF(t,D)</w:t>
+        <w:br/>
+        <w:t>|D|=total docs, DF(t,D)=docs containing t</w:t>
+        <w:br/>
+        <w:br/>
+        <w:t>Example (|D|=2):  D0="Python python Spark Spark"  D1="Python SQL"</w:t>
+        <w:br/>
+        <w:t xml:space="preserve">  TF(python,D0)=2 TF(spark,D0)=2 TF(python,D1)=1 TF(sql,D1)=1</w:t>
+        <w:br/>
+        <w:t xml:space="preserve">  DF(python)=2    DF(spark)=1    DF(sql)=1</w:t>
+        <w:br/>
+        <w:t xml:space="preserve">  IDF(python)=log(3/3)=0       &lt;- in both docs, not discriminating</w:t>
+        <w:br/>
+        <w:t xml:space="preserve">  IDF(spark) =log(3/2)=0.405</w:t>
+        <w:br/>
+        <w:t xml:space="preserve">  IDF(sql)   =log(3/2)=0.405</w:t>
+        <w:br/>
+        <w:t xml:space="preserve">  TF-IDF(spark,D0)=2x0.405=0.811  &lt;- "spark" is keyword for D0</w:t>
+        <w:br/>
+        <w:t xml:space="preserve">  TF-IDF(sql,D1) =1x0.405=0.405   &lt;- "sql"   is keyword for D1</w:t>
+      </w:r>
+    </w:p>
+    <w:p>
+      <w:pPr>
+        <w:spacing w:before="200" w:after="40"/>
+      </w:pPr>
+      <w:r>
+        <w:rPr>
+          <w:b/>
+          <w:color w:val="2563EB"/>
+          <w:sz w:val="22"/>
+        </w:rPr>
+        <w:t>Spark ML NLP Pipeline</w:t>
+      </w:r>
+    </w:p>
+    <w:tbl>
+      <w:tblPr>
+        <w:tblStyle w:val="TableGrid"/>
+        <w:tblW w:type="auto" w:w="0"/>
+        <w:jc w:val="left"/>
+        <w:tblLook w:firstColumn="1" w:firstRow="1" w:lastColumn="0" w:lastRow="0" w:noHBand="0" w:noVBand="1" w:val="04A0"/>
+      </w:tblPr>
+      <w:tblGrid>
+        <w:gridCol w:w="3324"/>
+        <w:gridCol w:w="3324"/>
+        <w:gridCol w:w="3324"/>
+      </w:tblGrid>
+      <w:tr>
+        <w:tc>
+          <w:tcPr>
+            <w:tcW w:type="dxa" w:w="2268"/>
+            <w:shd w:val="clear" w:color="auto" w:fill="2563EB"/>
+          </w:tcPr>
+          <w:p>
+            <w:r>
+              <w:rPr>
+                <w:b/>
+                <w:color w:val="FFFFFF"/>
+                <w:sz w:val="17"/>
+              </w:rPr>
+              <w:t>Component</w:t>
+            </w:r>
+          </w:p>
+        </w:tc>
+        <w:tc>
+          <w:tcPr>
+            <w:tcW w:type="dxa" w:w="3118"/>
+            <w:shd w:val="clear" w:color="auto" w:fill="2563EB"/>
+          </w:tcPr>
+          <w:p>
+            <w:r>
+              <w:rPr>
+                <w:b/>
+                <w:color w:val="FFFFFF"/>
+                <w:sz w:val="17"/>
+              </w:rPr>
+              <w:t>What it does</w:t>
+            </w:r>
+          </w:p>
+        </w:tc>
+        <w:tc>
+          <w:tcPr>
+            <w:tcW w:type="dxa" w:w="3231"/>
+            <w:shd w:val="clear" w:color="auto" w:fill="2563EB"/>
+          </w:tcPr>
+          <w:p>
+            <w:r>
+              <w:rPr>
+                <w:b/>
+                <w:color w:val="FFFFFF"/>
+                <w:sz w:val="17"/>
+              </w:rPr>
+              <w:t>Key params</w:t>
+            </w:r>
+          </w:p>
+        </w:tc>
+      </w:tr>
+      <w:tr>
+        <w:tc>
+          <w:tcPr>
+            <w:tcW w:type="dxa" w:w="2268"/>
+          </w:tcPr>
+          <w:p>
+            <w:r>
+              <w:rPr>
+                <w:sz w:val="17"/>
+              </w:rPr>
+              <w:t>Tokenizer</w:t>
+            </w:r>
+          </w:p>
+        </w:tc>
+        <w:tc>
+          <w:tcPr>
+            <w:tcW w:type="dxa" w:w="3118"/>
+          </w:tcPr>
+          <w:p>
+            <w:r>
+              <w:rPr>
+                <w:sz w:val="17"/>
+              </w:rPr>
+              <w:t>Split sentence into word tokens</w:t>
+            </w:r>
+          </w:p>
+        </w:tc>
+        <w:tc>
+          <w:tcPr>
+            <w:tcW w:type="dxa" w:w="3231"/>
+          </w:tcPr>
+          <w:p>
+            <w:r>
+              <w:rPr>
+                <w:sz w:val="17"/>
+              </w:rPr>
+              <w:t>inputCol, outputCol</w:t>
+            </w:r>
+          </w:p>
+        </w:tc>
+      </w:tr>
+      <w:tr>
+        <w:tc>
+          <w:tcPr>
+            <w:tcW w:type="dxa" w:w="2268"/>
+            <w:shd w:val="clear" w:color="auto" w:fill="F8FAFC"/>
+          </w:tcPr>
+          <w:p>
+            <w:r>
+              <w:rPr>
+                <w:sz w:val="17"/>
+              </w:rPr>
+              <w:t>StopWordsRemover</w:t>
+            </w:r>
+          </w:p>
+        </w:tc>
+        <w:tc>
+          <w:tcPr>
+            <w:tcW w:type="dxa" w:w="3118"/>
+            <w:shd w:val="clear" w:color="auto" w:fill="F8FAFC"/>
+          </w:tcPr>
+          <w:p>
+            <w:r>
+              <w:rPr>
+                <w:sz w:val="17"/>
+              </w:rPr>
+              <w:t>Remove high-freq, low-info words</w:t>
+            </w:r>
+          </w:p>
+        </w:tc>
+        <w:tc>
+          <w:tcPr>
+            <w:tcW w:type="dxa" w:w="3231"/>
+            <w:shd w:val="clear" w:color="auto" w:fill="F8FAFC"/>
+          </w:tcPr>
+          <w:p>
+            <w:r>
+              <w:rPr>
+                <w:sz w:val="17"/>
+              </w:rPr>
+              <w:t>inputCol, outputCol</w:t>
+            </w:r>
+          </w:p>
+        </w:tc>
+      </w:tr>
+      <w:tr>
+        <w:tc>
+          <w:tcPr>
+            <w:tcW w:type="dxa" w:w="2268"/>
+          </w:tcPr>
+          <w:p>
+            <w:r>
+              <w:rPr>
+                <w:sz w:val="17"/>
+              </w:rPr>
+              <w:t>NGram(n=2)</w:t>
+            </w:r>
+          </w:p>
+        </w:tc>
+        <w:tc>
+          <w:tcPr>
+            <w:tcW w:type="dxa" w:w="3118"/>
+          </w:tcPr>
+          <w:p>
+            <w:r>
+              <w:rPr>
+                <w:sz w:val="17"/>
+              </w:rPr>
+              <w:t>Generate bigrams / n-word phrases</w:t>
+            </w:r>
+          </w:p>
+        </w:tc>
+        <w:tc>
+          <w:tcPr>
+            <w:tcW w:type="dxa" w:w="3231"/>
+          </w:tcPr>
+          <w:p>
+            <w:r>
+              <w:rPr>
+                <w:sz w:val="17"/>
+              </w:rPr>
+              <w:t>n=2 for bigrams</w:t>
+            </w:r>
+          </w:p>
+        </w:tc>
+      </w:tr>
+      <w:tr>
+        <w:tc>
+          <w:tcPr>
+            <w:tcW w:type="dxa" w:w="2268"/>
+            <w:shd w:val="clear" w:color="auto" w:fill="F8FAFC"/>
+          </w:tcPr>
+          <w:p>
+            <w:r>
+              <w:rPr>
+                <w:sz w:val="17"/>
+              </w:rPr>
+              <w:t>CountVectorizer</w:t>
+            </w:r>
+          </w:p>
+        </w:tc>
+        <w:tc>
+          <w:tcPr>
+            <w:tcW w:type="dxa" w:w="3118"/>
+            <w:shd w:val="clear" w:color="auto" w:fill="F8FAFC"/>
+          </w:tcPr>
+          <w:p>
+            <w:r>
+              <w:rPr>
+                <w:sz w:val="17"/>
+              </w:rPr>
+              <w:t>Term frequency sparse vectors</w:t>
+            </w:r>
+          </w:p>
+        </w:tc>
+        <w:tc>
+          <w:tcPr>
+            <w:tcW w:type="dxa" w:w="3231"/>
+            <w:shd w:val="clear" w:color="auto" w:fill="F8FAFC"/>
+          </w:tcPr>
+          <w:p>
+            <w:r>
+              <w:rPr>
+                <w:sz w:val="17"/>
+              </w:rPr>
+              <w:t>minTF, minDF, vocabSize</w:t>
+            </w:r>
+          </w:p>
+        </w:tc>
+      </w:tr>
+      <w:tr>
+        <w:tc>
+          <w:tcPr>
+            <w:tcW w:type="dxa" w:w="2268"/>
+          </w:tcPr>
+          <w:p>
+            <w:r>
+              <w:rPr>
+                <w:sz w:val="17"/>
+              </w:rPr>
+              <w:t>IDF</w:t>
+            </w:r>
+          </w:p>
+        </w:tc>
+        <w:tc>
+          <w:tcPr>
+            <w:tcW w:type="dxa" w:w="3118"/>
+          </w:tcPr>
+          <w:p>
+            <w:r>
+              <w:rPr>
+                <w:sz w:val="17"/>
+              </w:rPr>
+              <w:t>Apply inverse-doc-freq weighting</w:t>
+            </w:r>
+          </w:p>
+        </w:tc>
+        <w:tc>
+          <w:tcPr>
+            <w:tcW w:type="dxa" w:w="3231"/>
+          </w:tcPr>
+          <w:p>
+            <w:r>
+              <w:rPr>
+                <w:sz w:val="17"/>
+              </w:rPr>
+              <w:t>inputCol="tf"</w:t>
+            </w:r>
+          </w:p>
+        </w:tc>
+      </w:tr>
+    </w:tbl>
+    <w:p/>
+    <w:p>
+      <w:pPr>
+        <w:spacing w:before="40" w:after="40"/>
+        <w:ind w:left="283"/>
+        <w:shd w:val="clear" w:color="auto" w:fill="1E293B"/>
+      </w:pPr>
+      <w:r>
+        <w:rPr>
+          <w:rFonts w:ascii="Courier New" w:hAnsi="Courier New"/>
+          <w:color w:val="E2E8F0"/>
+          <w:sz w:val="16"/>
+        </w:rPr>
+        <w:t>from pyspark.ml import Pipeline</w:t>
+        <w:br/>
+        <w:t>from pyspark.ml.feature import Tokenizer, StopWordsRemover, NGram, CountVectorizer, IDF</w:t>
+        <w:br/>
+        <w:br/>
+        <w:t>pipeline = Pipeline(stages=[</w:t>
+        <w:br/>
+        <w:t xml:space="preserve">    Tokenizer(inputCol="sentence", outputCol="words"),</w:t>
+        <w:br/>
+        <w:t xml:space="preserve">    StopWordsRemover(inputCol="words", outputCol="filtered"),</w:t>
+        <w:br/>
+        <w:t xml:space="preserve">    NGram(n=2, inputCol="filtered", outputCol="ngrams"),</w:t>
+        <w:br/>
+        <w:t xml:space="preserve">    CountVectorizer(minTF=1.0, minDF=1.0, vocabSize=20,</w:t>
+        <w:br/>
+        <w:t xml:space="preserve">                    inputCol="ngrams", outputCol="tf"),</w:t>
+        <w:br/>
+        <w:t xml:space="preserve">    IDF(inputCol="tf", outputCol="tfidf")</w:t>
+        <w:br/>
+        <w:t>])</w:t>
+        <w:br/>
+        <w:t>model = pipeline.fit(data)</w:t>
+        <w:br/>
+        <w:t>result = model.transform(data)</w:t>
+      </w:r>
+    </w:p>
+    <w:p>
+      <w:pPr>
+        <w:spacing w:before="200" w:after="40"/>
+      </w:pPr>
+      <w:r>
+        <w:rPr>
+          <w:b/>
+          <w:color w:val="2563EB"/>
+          <w:sz w:val="22"/>
+        </w:rPr>
+        <w:t>UDFs (User-Defined Functions)</w:t>
+      </w:r>
+    </w:p>
+    <w:p>
+      <w:pPr>
+        <w:spacing w:before="40" w:after="40"/>
+        <w:ind w:left="283"/>
+        <w:shd w:val="clear" w:color="auto" w:fill="1E293B"/>
+      </w:pPr>
+      <w:r>
+        <w:rPr>
+          <w:rFonts w:ascii="Courier New" w:hAnsi="Courier New"/>
+          <w:color w:val="E2E8F0"/>
+          <w:sz w:val="16"/>
+        </w:rPr>
+        <w:t>from pyspark.sql.functions import udf</w:t>
+        <w:br/>
+        <w:t>from pyspark.sql.types import StringType</w:t>
+        <w:br/>
+        <w:br/>
+        <w:t>my_udf = udf(lambda text: text.upper(), StringType())</w:t>
+        <w:br/>
+        <w:t>df.withColumn("upper_text", my_udf(df["text"])).show()</w:t>
+      </w:r>
+    </w:p>
+    <w:p>
+      <w:pPr>
+        <w:spacing w:before="200" w:after="40"/>
+      </w:pPr>
+      <w:r>
+        <w:rPr>
+          <w:b/>
+          <w:color w:val="2563EB"/>
+          <w:sz w:val="22"/>
+        </w:rPr>
+        <w:t>countByKey() vs countByValue()</w:t>
+      </w:r>
+    </w:p>
+    <w:p>
+      <w:pPr>
+        <w:spacing w:before="40" w:after="40"/>
+        <w:ind w:left="283"/>
+        <w:shd w:val="clear" w:color="auto" w:fill="1E293B"/>
+      </w:pPr>
+      <w:r>
+        <w:rPr>
+          <w:rFonts w:ascii="Courier New" w:hAnsi="Courier New"/>
+          <w:color w:val="E2E8F0"/>
+          <w:sz w:val="16"/>
+        </w:rPr>
+        <w:t>countByKey()   -&gt; count occurrences of each KEY   {"Mazda":2, "Ferrari":1}</w:t>
+        <w:br/>
+        <w:t>countByValue() -&gt; count occurrences of each (key,value) PAIR</w:t>
+        <w:br/>
+        <w:br/>
+        <w:t># Document Frequency pattern:</w:t>
+        <w:br/>
+        <w:t>tokenized.flatMapValues(lambda x: x)   # one (docID,word) per word</w:t>
+        <w:br/>
+        <w:t xml:space="preserve">         .distinct()                    # unique (docID,word) pairs</w:t>
+        <w:br/>
+        <w:t xml:space="preserve">         .map(lambda x: (x[1],x[0]))   # flip to (word,docID)</w:t>
+        <w:br/>
+        <w:t xml:space="preserve">         .countByKey()                  # how many docs contain each word</w:t>
+      </w:r>
+    </w:p>
     <w:p>
       <w:r>
         <w:br w:type="page"/>
@@ -8575,6 +9026,465 @@
     </w:tbl>
     <w:p/>
     <w:p>
+      <w:pPr>
+        <w:spacing w:before="200" w:after="40"/>
+      </w:pPr>
+      <w:r>
+        <w:rPr>
+          <w:b/>
+          <w:color w:val="2563EB"/>
+          <w:sz w:val="22"/>
+        </w:rPr>
+        <w:t>Transactions &amp; OLTP vs OLAP</w:t>
+      </w:r>
+    </w:p>
+    <w:p>
+      <w:pPr>
+        <w:spacing w:before="40" w:after="40"/>
+        <w:ind w:left="283"/>
+        <w:shd w:val="clear" w:color="auto" w:fill="1E293B"/>
+      </w:pPr>
+      <w:r>
+        <w:rPr>
+          <w:rFonts w:ascii="Courier New" w:hAnsi="Courier New"/>
+          <w:color w:val="E2E8F0"/>
+          <w:sz w:val="16"/>
+        </w:rPr>
+        <w:t>BEGIN TRANSACTION</w:t>
+        <w:br/>
+        <w:t xml:space="preserve">  UPDATE accounts SET balance = balance - 100 WHERE id = "A";</w:t>
+        <w:br/>
+        <w:t xml:space="preserve">  UPDATE accounts SET balance = balance + 100 WHERE id = "B";</w:t>
+        <w:br/>
+        <w:t>COMMIT      &lt;- makes permanent</w:t>
+        <w:br/>
+        <w:t>-- or ABORT/ROLLBACK  &lt;- undoes all changes on failure</w:t>
+      </w:r>
+    </w:p>
+    <w:tbl>
+      <w:tblPr>
+        <w:tblStyle w:val="TableGrid"/>
+        <w:tblW w:type="auto" w:w="0"/>
+        <w:jc w:val="left"/>
+        <w:tblLook w:firstColumn="1" w:firstRow="1" w:lastColumn="0" w:lastRow="0" w:noHBand="0" w:noVBand="1" w:val="04A0"/>
+      </w:tblPr>
+      <w:tblGrid>
+        <w:gridCol w:w="3324"/>
+        <w:gridCol w:w="3324"/>
+        <w:gridCol w:w="3324"/>
+      </w:tblGrid>
+      <w:tr>
+        <w:tc>
+          <w:tcPr>
+            <w:tcW w:type="dxa" w:w="1701"/>
+            <w:shd w:val="clear" w:color="auto" w:fill="2563EB"/>
+          </w:tcPr>
+          <w:p>
+            <w:r>
+              <w:rPr>
+                <w:b/>
+                <w:color w:val="FFFFFF"/>
+                <w:sz w:val="17"/>
+              </w:rPr>
+            </w:r>
+          </w:p>
+        </w:tc>
+        <w:tc>
+          <w:tcPr>
+            <w:tcW w:type="dxa" w:w="3402"/>
+            <w:shd w:val="clear" w:color="auto" w:fill="2563EB"/>
+          </w:tcPr>
+          <w:p>
+            <w:r>
+              <w:rPr>
+                <w:b/>
+                <w:color w:val="FFFFFF"/>
+                <w:sz w:val="17"/>
+              </w:rPr>
+              <w:t>OLTP</w:t>
+            </w:r>
+          </w:p>
+        </w:tc>
+        <w:tc>
+          <w:tcPr>
+            <w:tcW w:type="dxa" w:w="3515"/>
+            <w:shd w:val="clear" w:color="auto" w:fill="2563EB"/>
+          </w:tcPr>
+          <w:p>
+            <w:r>
+              <w:rPr>
+                <w:b/>
+                <w:color w:val="FFFFFF"/>
+                <w:sz w:val="17"/>
+              </w:rPr>
+              <w:t>OLAP</w:t>
+            </w:r>
+          </w:p>
+        </w:tc>
+      </w:tr>
+      <w:tr>
+        <w:tc>
+          <w:tcPr>
+            <w:tcW w:type="dxa" w:w="1701"/>
+          </w:tcPr>
+          <w:p>
+            <w:r>
+              <w:rPr>
+                <w:sz w:val="17"/>
+              </w:rPr>
+              <w:t>Workload</w:t>
+            </w:r>
+          </w:p>
+        </w:tc>
+        <w:tc>
+          <w:tcPr>
+            <w:tcW w:type="dxa" w:w="3402"/>
+          </w:tcPr>
+          <w:p>
+            <w:r>
+              <w:rPr>
+                <w:sz w:val="17"/>
+              </w:rPr>
+              <w:t>Many short read/write transactions (ms)</w:t>
+            </w:r>
+          </w:p>
+        </w:tc>
+        <w:tc>
+          <w:tcPr>
+            <w:tcW w:type="dxa" w:w="3515"/>
+          </w:tcPr>
+          <w:p>
+            <w:r>
+              <w:rPr>
+                <w:sz w:val="17"/>
+              </w:rPr>
+              <w:t>Few complex read-heavy queries over large data</w:t>
+            </w:r>
+          </w:p>
+        </w:tc>
+      </w:tr>
+      <w:tr>
+        <w:tc>
+          <w:tcPr>
+            <w:tcW w:type="dxa" w:w="1701"/>
+            <w:shd w:val="clear" w:color="auto" w:fill="F8FAFC"/>
+          </w:tcPr>
+          <w:p>
+            <w:r>
+              <w:rPr>
+                <w:sz w:val="17"/>
+              </w:rPr>
+              <w:t>Examples</w:t>
+            </w:r>
+          </w:p>
+        </w:tc>
+        <w:tc>
+          <w:tcPr>
+            <w:tcW w:type="dxa" w:w="3402"/>
+            <w:shd w:val="clear" w:color="auto" w:fill="F8FAFC"/>
+          </w:tcPr>
+          <w:p>
+            <w:r>
+              <w:rPr>
+                <w:sz w:val="17"/>
+              </w:rPr>
+              <w:t>Banking, e-commerce, booking systems</w:t>
+            </w:r>
+          </w:p>
+        </w:tc>
+        <w:tc>
+          <w:tcPr>
+            <w:tcW w:type="dxa" w:w="3515"/>
+            <w:shd w:val="clear" w:color="auto" w:fill="F8FAFC"/>
+          </w:tcPr>
+          <w:p>
+            <w:r>
+              <w:rPr>
+                <w:sz w:val="17"/>
+              </w:rPr>
+              <w:t>Data warehouses, reporting, Spark/Hive</w:t>
+            </w:r>
+          </w:p>
+        </w:tc>
+      </w:tr>
+      <w:tr>
+        <w:tc>
+          <w:tcPr>
+            <w:tcW w:type="dxa" w:w="1701"/>
+          </w:tcPr>
+          <w:p>
+            <w:r>
+              <w:rPr>
+                <w:sz w:val="17"/>
+              </w:rPr>
+              <w:t>ACID</w:t>
+            </w:r>
+          </w:p>
+        </w:tc>
+        <w:tc>
+          <w:tcPr>
+            <w:tcW w:type="dxa" w:w="3402"/>
+          </w:tcPr>
+          <w:p>
+            <w:r>
+              <w:rPr>
+                <w:sz w:val="17"/>
+              </w:rPr>
+              <w:t>Requires full ACID</w:t>
+            </w:r>
+          </w:p>
+        </w:tc>
+        <w:tc>
+          <w:tcPr>
+            <w:tcW w:type="dxa" w:w="3515"/>
+          </w:tcPr>
+          <w:p>
+            <w:r>
+              <w:rPr>
+                <w:sz w:val="17"/>
+              </w:rPr>
+              <w:t>Relaxed (eventual consistency acceptable)</w:t>
+            </w:r>
+          </w:p>
+        </w:tc>
+      </w:tr>
+    </w:tbl>
+    <w:p/>
+    <w:p>
+      <w:pPr>
+        <w:spacing w:before="200" w:after="40"/>
+      </w:pPr>
+      <w:r>
+        <w:rPr>
+          <w:b/>
+          <w:color w:val="2563EB"/>
+          <w:sz w:val="22"/>
+        </w:rPr>
+        <w:t>Key-Value Store Operations</w:t>
+      </w:r>
+    </w:p>
+    <w:tbl>
+      <w:tblPr>
+        <w:tblStyle w:val="TableGrid"/>
+        <w:tblW w:type="auto" w:w="0"/>
+        <w:jc w:val="left"/>
+        <w:tblLook w:firstColumn="1" w:firstRow="1" w:lastColumn="0" w:lastRow="0" w:noHBand="0" w:noVBand="1" w:val="04A0"/>
+      </w:tblPr>
+      <w:tblGrid>
+        <w:gridCol w:w="4986"/>
+        <w:gridCol w:w="4986"/>
+      </w:tblGrid>
+      <w:tr>
+        <w:tc>
+          <w:tcPr>
+            <w:tcW w:type="dxa" w:w="2551"/>
+            <w:shd w:val="clear" w:color="auto" w:fill="2563EB"/>
+          </w:tcPr>
+          <w:p>
+            <w:r>
+              <w:rPr>
+                <w:b/>
+                <w:color w:val="FFFFFF"/>
+                <w:sz w:val="17"/>
+              </w:rPr>
+              <w:t>Op</w:t>
+            </w:r>
+          </w:p>
+        </w:tc>
+        <w:tc>
+          <w:tcPr>
+            <w:tcW w:type="dxa" w:w="6066"/>
+            <w:shd w:val="clear" w:color="auto" w:fill="2563EB"/>
+          </w:tcPr>
+          <w:p>
+            <w:r>
+              <w:rPr>
+                <w:b/>
+                <w:color w:val="FFFFFF"/>
+                <w:sz w:val="17"/>
+              </w:rPr>
+              <w:t>Description</w:t>
+            </w:r>
+          </w:p>
+        </w:tc>
+      </w:tr>
+      <w:tr>
+        <w:tc>
+          <w:tcPr>
+            <w:tcW w:type="dxa" w:w="2551"/>
+          </w:tcPr>
+          <w:p>
+            <w:r>
+              <w:rPr>
+                <w:sz w:val="17"/>
+              </w:rPr>
+              <w:t>Get(key)</w:t>
+            </w:r>
+          </w:p>
+        </w:tc>
+        <w:tc>
+          <w:tcPr>
+            <w:tcW w:type="dxa" w:w="6066"/>
+          </w:tcPr>
+          <w:p>
+            <w:r>
+              <w:rPr>
+                <w:sz w:val="17"/>
+              </w:rPr>
+              <w:t>Retrieve value for a single key</w:t>
+            </w:r>
+          </w:p>
+        </w:tc>
+      </w:tr>
+      <w:tr>
+        <w:tc>
+          <w:tcPr>
+            <w:tcW w:type="dxa" w:w="2551"/>
+            <w:shd w:val="clear" w:color="auto" w:fill="F8FAFC"/>
+          </w:tcPr>
+          <w:p>
+            <w:r>
+              <w:rPr>
+                <w:sz w:val="17"/>
+              </w:rPr>
+              <w:t>Put(key, value)</w:t>
+            </w:r>
+          </w:p>
+        </w:tc>
+        <w:tc>
+          <w:tcPr>
+            <w:tcW w:type="dxa" w:w="6066"/>
+            <w:shd w:val="clear" w:color="auto" w:fill="F8FAFC"/>
+          </w:tcPr>
+          <w:p>
+            <w:r>
+              <w:rPr>
+                <w:sz w:val="17"/>
+              </w:rPr>
+              <w:t>Insert or update a key-value pair</w:t>
+            </w:r>
+          </w:p>
+        </w:tc>
+      </w:tr>
+      <w:tr>
+        <w:tc>
+          <w:tcPr>
+            <w:tcW w:type="dxa" w:w="2551"/>
+          </w:tcPr>
+          <w:p>
+            <w:r>
+              <w:rPr>
+                <w:sz w:val="17"/>
+              </w:rPr>
+              <w:t>Delete(key)</w:t>
+            </w:r>
+          </w:p>
+        </w:tc>
+        <w:tc>
+          <w:tcPr>
+            <w:tcW w:type="dxa" w:w="6066"/>
+          </w:tcPr>
+          <w:p>
+            <w:r>
+              <w:rPr>
+                <w:sz w:val="17"/>
+              </w:rPr>
+              <w:t>Remove a key-value pair</w:t>
+            </w:r>
+          </w:p>
+        </w:tc>
+      </w:tr>
+      <w:tr>
+        <w:tc>
+          <w:tcPr>
+            <w:tcW w:type="dxa" w:w="2551"/>
+            <w:shd w:val="clear" w:color="auto" w:fill="F8FAFC"/>
+          </w:tcPr>
+          <w:p>
+            <w:r>
+              <w:rPr>
+                <w:sz w:val="17"/>
+              </w:rPr>
+              <w:t>Multi-get([keys])</w:t>
+            </w:r>
+          </w:p>
+        </w:tc>
+        <w:tc>
+          <w:tcPr>
+            <w:tcW w:type="dxa" w:w="6066"/>
+            <w:shd w:val="clear" w:color="auto" w:fill="F8FAFC"/>
+          </w:tcPr>
+          <w:p>
+            <w:r>
+              <w:rPr>
+                <w:sz w:val="17"/>
+              </w:rPr>
+              <w:t>Batch retrieve multiple values in one call</w:t>
+            </w:r>
+          </w:p>
+        </w:tc>
+      </w:tr>
+      <w:tr>
+        <w:tc>
+          <w:tcPr>
+            <w:tcW w:type="dxa" w:w="2551"/>
+          </w:tcPr>
+          <w:p>
+            <w:r>
+              <w:rPr>
+                <w:sz w:val="17"/>
+              </w:rPr>
+              <w:t>Multi-put({k:v})</w:t>
+            </w:r>
+          </w:p>
+        </w:tc>
+        <w:tc>
+          <w:tcPr>
+            <w:tcW w:type="dxa" w:w="6066"/>
+          </w:tcPr>
+          <w:p>
+            <w:r>
+              <w:rPr>
+                <w:sz w:val="17"/>
+              </w:rPr>
+              <w:t>Batch insert/update multiple pairs</w:t>
+            </w:r>
+          </w:p>
+        </w:tc>
+      </w:tr>
+      <w:tr>
+        <w:tc>
+          <w:tcPr>
+            <w:tcW w:type="dxa" w:w="2551"/>
+            <w:shd w:val="clear" w:color="auto" w:fill="F8FAFC"/>
+          </w:tcPr>
+          <w:p>
+            <w:r>
+              <w:rPr>
+                <w:sz w:val="17"/>
+              </w:rPr>
+              <w:t>Range(k1, k2)</w:t>
+            </w:r>
+          </w:p>
+        </w:tc>
+        <w:tc>
+          <w:tcPr>
+            <w:tcW w:type="dxa" w:w="6066"/>
+            <w:shd w:val="clear" w:color="auto" w:fill="F8FAFC"/>
+          </w:tcPr>
+          <w:p>
+            <w:r>
+              <w:rPr>
+                <w:sz w:val="17"/>
+              </w:rPr>
+              <w:t>Retrieve all keys between k1 and k2 (sorted store only)</w:t>
+            </w:r>
+          </w:p>
+        </w:tc>
+      </w:tr>
+    </w:tbl>
+    <w:p/>
+    <w:p>
       <w:r>
         <w:br w:type="page"/>
       </w:r>
@@ -8591,6 +9501,192 @@
           <w:sz w:val="26"/>
         </w:rPr>
         <w:t xml:space="preserve">  L10 · Recommendation Systems  </w:t>
+      </w:r>
+    </w:p>
+    <w:p>
+      <w:pPr>
+        <w:spacing w:before="200" w:after="40"/>
+      </w:pPr>
+      <w:r>
+        <w:rPr>
+          <w:b/>
+          <w:color w:val="2563EB"/>
+          <w:sz w:val="22"/>
+        </w:rPr>
+        <w:t>Utility Matrix &amp; Ratings</w:t>
+      </w:r>
+    </w:p>
+    <w:p>
+      <w:pPr>
+        <w:spacing w:before="20" w:after="20"/>
+        <w:ind w:left="0"/>
+      </w:pPr>
+      <w:r>
+        <w:rPr>
+          <w:sz w:val="19"/>
+        </w:rPr>
+        <w:t>Utility matrix: rows=users, columns=items, entries=ratings. Most entries empty (sparsity problem).</w:t>
+      </w:r>
+    </w:p>
+    <w:tbl>
+      <w:tblPr>
+        <w:tblStyle w:val="TableGrid"/>
+        <w:tblW w:type="auto" w:w="0"/>
+        <w:jc w:val="left"/>
+        <w:tblLook w:firstColumn="1" w:firstRow="1" w:lastColumn="0" w:lastRow="0" w:noHBand="0" w:noVBand="1" w:val="04A0"/>
+      </w:tblPr>
+      <w:tblGrid>
+        <w:gridCol w:w="3324"/>
+        <w:gridCol w:w="3324"/>
+        <w:gridCol w:w="3324"/>
+      </w:tblGrid>
+      <w:tr>
+        <w:tc>
+          <w:tcPr>
+            <w:tcW w:type="dxa" w:w="1701"/>
+            <w:shd w:val="clear" w:color="auto" w:fill="2563EB"/>
+          </w:tcPr>
+          <w:p>
+            <w:r>
+              <w:rPr>
+                <w:b/>
+                <w:color w:val="FFFFFF"/>
+                <w:sz w:val="17"/>
+              </w:rPr>
+              <w:t>Rating type</w:t>
+            </w:r>
+          </w:p>
+        </w:tc>
+        <w:tc>
+          <w:tcPr>
+            <w:tcW w:type="dxa" w:w="3685"/>
+            <w:shd w:val="clear" w:color="auto" w:fill="2563EB"/>
+          </w:tcPr>
+          <w:p>
+            <w:r>
+              <w:rPr>
+                <w:b/>
+                <w:color w:val="FFFFFF"/>
+                <w:sz w:val="17"/>
+              </w:rPr>
+              <w:t>Description</w:t>
+            </w:r>
+          </w:p>
+        </w:tc>
+        <w:tc>
+          <w:tcPr>
+            <w:tcW w:type="dxa" w:w="3231"/>
+            <w:shd w:val="clear" w:color="auto" w:fill="2563EB"/>
+          </w:tcPr>
+          <w:p>
+            <w:r>
+              <w:rPr>
+                <w:b/>
+                <w:color w:val="FFFFFF"/>
+                <w:sz w:val="17"/>
+              </w:rPr>
+              <w:t>Examples</w:t>
+            </w:r>
+          </w:p>
+        </w:tc>
+      </w:tr>
+      <w:tr>
+        <w:tc>
+          <w:tcPr>
+            <w:tcW w:type="dxa" w:w="1701"/>
+          </w:tcPr>
+          <w:p>
+            <w:r>
+              <w:rPr>
+                <w:sz w:val="17"/>
+              </w:rPr>
+              <w:t>Explicit</w:t>
+            </w:r>
+          </w:p>
+        </w:tc>
+        <w:tc>
+          <w:tcPr>
+            <w:tcW w:type="dxa" w:w="3685"/>
+          </w:tcPr>
+          <w:p>
+            <w:r>
+              <w:rPr>
+                <w:sz w:val="17"/>
+              </w:rPr>
+              <w:t>User deliberately provides rating</w:t>
+            </w:r>
+          </w:p>
+        </w:tc>
+        <w:tc>
+          <w:tcPr>
+            <w:tcW w:type="dxa" w:w="3231"/>
+          </w:tcPr>
+          <w:p>
+            <w:r>
+              <w:rPr>
+                <w:sz w:val="17"/>
+              </w:rPr>
+              <w:t>Stars 1-5, thumbs up/down, written review</w:t>
+            </w:r>
+          </w:p>
+        </w:tc>
+      </w:tr>
+      <w:tr>
+        <w:tc>
+          <w:tcPr>
+            <w:tcW w:type="dxa" w:w="1701"/>
+            <w:shd w:val="clear" w:color="auto" w:fill="F8FAFC"/>
+          </w:tcPr>
+          <w:p>
+            <w:r>
+              <w:rPr>
+                <w:sz w:val="17"/>
+              </w:rPr>
+              <w:t>Implicit</w:t>
+            </w:r>
+          </w:p>
+        </w:tc>
+        <w:tc>
+          <w:tcPr>
+            <w:tcW w:type="dxa" w:w="3685"/>
+            <w:shd w:val="clear" w:color="auto" w:fill="F8FAFC"/>
+          </w:tcPr>
+          <w:p>
+            <w:r>
+              <w:rPr>
+                <w:sz w:val="17"/>
+              </w:rPr>
+              <w:t>Inferred from behaviour (no direct rating)</w:t>
+            </w:r>
+          </w:p>
+        </w:tc>
+        <w:tc>
+          <w:tcPr>
+            <w:tcW w:type="dxa" w:w="3231"/>
+            <w:shd w:val="clear" w:color="auto" w:fill="F8FAFC"/>
+          </w:tcPr>
+          <w:p>
+            <w:r>
+              <w:rPr>
+                <w:sz w:val="17"/>
+              </w:rPr>
+              <w:t>Watch time, clicks, purchases, search history</w:t>
+            </w:r>
+          </w:p>
+        </w:tc>
+      </w:tr>
+    </w:tbl>
+    <w:p/>
+    <w:p>
+      <w:pPr>
+        <w:ind w:left="170"/>
+        <w:shd w:val="clear" w:color="auto" w:fill="DBEAFE"/>
+      </w:pPr>
+      <w:r>
+        <w:rPr>
+          <w:sz w:val="18"/>
+        </w:rPr>
+        <w:t>Trade-off:  Explicit = accurate but sparse (users rarely rate). Implicit = dense but noisy (watching != liking).</w:t>
       </w:r>
     </w:p>
     <w:p>
@@ -9110,16 +10206,25 @@
           <w:color w:val="E2E8F0"/>
           <w:sz w:val="16"/>
         </w:rPr>
+        <w:t>Jaccard Similarity (binary / implicit data):</w:t>
+        <w:br/>
+        <w:t xml:space="preserve">  sim(A,B) = |A intersect B| / |A union B|</w:t>
+        <w:br/>
+        <w:t xml:space="preserve">  Items rated by BOTH / Items rated by EITHER</w:t>
+        <w:br/>
+        <w:t xml:space="preserve">  Range [0,1]; ignores rating VALUES -&gt; good for implicit</w:t>
+        <w:br/>
+        <w:br/>
         <w:t>Cosine Similarity:</w:t>
         <w:br/>
-        <w:t xml:space="preserve">  sim(u,v) = (u·v) / (||u|| · ||v||)</w:t>
+        <w:t xml:space="preserve">  sim(u,v) = (u.v) / (||u|| * ||v||)</w:t>
         <w:br/>
-        <w:t xml:space="preserve">  Range [-1,1]; 1=identical direction, 0=orthogonal, -1=opposite</w:t>
+        <w:t xml:space="preserve">  Range [-1,1]; 1=identical, 0=orthogonal, -1=opposite</w:t>
         <w:br/>
         <w:br/>
-        <w:t>Pearson Correlation (mean-centred):</w:t>
+        <w:t>Pearson Correlation (mean-centred cosine):</w:t>
         <w:br/>
-        <w:t xml:space="preserve">  sim(u,v) = Σ(r_ui − r̄_u)(r_vi − r̄_v) / (σ_u · σ_v)</w:t>
+        <w:t xml:space="preserve">  sim(u,v) = Sum(r_ui - r_u_bar)(r_vi - r_v_bar) / (sigma_u * sigma_v)</w:t>
         <w:br/>
         <w:t xml:space="preserve">  Adjusts for harsh vs generous raters</w:t>
       </w:r>
@@ -9288,6 +10393,43 @@
           <w:color w:val="2563EB"/>
           <w:sz w:val="22"/>
         </w:rPr>
+        <w:t>Baseline Estimate</w:t>
+      </w:r>
+    </w:p>
+    <w:p>
+      <w:pPr>
+        <w:spacing w:before="40" w:after="40"/>
+        <w:ind w:left="283"/>
+        <w:shd w:val="clear" w:color="auto" w:fill="1E293B"/>
+      </w:pPr>
+      <w:r>
+        <w:rPr>
+          <w:rFonts w:ascii="Courier New" w:hAnsi="Courier New"/>
+          <w:color w:val="E2E8F0"/>
+          <w:sz w:val="16"/>
+        </w:rPr>
+        <w:t>b_ui = mu + b_u + b_i</w:t>
+        <w:br/>
+        <w:t xml:space="preserve">  mu  = global average rating</w:t>
+        <w:br/>
+        <w:t xml:space="preserve">  b_u = user bias (harsh/generous vs average)</w:t>
+        <w:br/>
+        <w:t xml:space="preserve">  b_i = item bias (popular/unpopular vs average)</w:t>
+        <w:br/>
+        <w:br/>
+        <w:t>Improved CF prediction: r_hat_ui = b_ui + (CF adjustment from neighbours)</w:t>
+      </w:r>
+    </w:p>
+    <w:p>
+      <w:pPr>
+        <w:spacing w:before="200" w:after="40"/>
+      </w:pPr>
+      <w:r>
+        <w:rPr>
+          <w:b/>
+          <w:color w:val="2563EB"/>
+          <w:sz w:val="22"/>
+        </w:rPr>
         <w:t>Evaluation Metrics</w:t>
       </w:r>
     </w:p>
@@ -9376,7 +10518,7 @@
               <w:rPr>
                 <w:sz w:val="17"/>
               </w:rPr>
-              <w:t>√(Σ(r̂−r)²/n)</w:t>
+              <w:t>sqrt(Sum(r_hat-r)^2/n)</w:t>
             </w:r>
           </w:p>
         </w:tc>
@@ -9419,7 +10561,7 @@
               <w:rPr>
                 <w:sz w:val="17"/>
               </w:rPr>
-              <w:t>Σ|r̂−r|/n</w:t>
+              <w:t>Sum|r_hat-r|/n</w:t>
             </w:r>
           </w:p>
         </w:tc>
@@ -9474,7 +10616,7 @@
               <w:rPr>
                 <w:sz w:val="17"/>
               </w:rPr>
-              <w:t>What fraction of recommendations are good?</w:t>
+              <w:t>What fraction of top-K are actually good?</w:t>
             </w:r>
           </w:p>
         </w:tc>
@@ -9504,7 +10646,7 @@
               <w:rPr>
                 <w:sz w:val="17"/>
               </w:rPr>
-              <w:t>Relevant in top-K / total rel</w:t>
+              <w:t>Relevant in top-K / total</w:t>
             </w:r>
           </w:p>
         </w:tc>
@@ -9518,7 +10660,48 @@
               <w:rPr>
                 <w:sz w:val="17"/>
               </w:rPr>
-              <w:t>Did we find all the good items?</w:t>
+              <w:t>Did we surface all the good items?</w:t>
+            </w:r>
+          </w:p>
+        </w:tc>
+      </w:tr>
+      <w:tr>
+        <w:tc>
+          <w:tcPr>
+            <w:tcW w:type="dxa" w:w="1701"/>
+          </w:tcPr>
+          <w:p>
+            <w:r>
+              <w:rPr>
+                <w:sz w:val="17"/>
+              </w:rPr>
+              <w:t>Coverage</w:t>
+            </w:r>
+          </w:p>
+        </w:tc>
+        <w:tc>
+          <w:tcPr>
+            <w:tcW w:type="dxa" w:w="2268"/>
+          </w:tcPr>
+          <w:p>
+            <w:r>
+              <w:rPr>
+                <w:sz w:val="17"/>
+              </w:rPr>
+              <w:t>Distinct items rec / total</w:t>
+            </w:r>
+          </w:p>
+        </w:tc>
+        <w:tc>
+          <w:tcPr>
+            <w:tcW w:type="dxa" w:w="4649"/>
+          </w:tcPr>
+          <w:p>
+            <w:r>
+              <w:rPr>
+                <w:sz w:val="17"/>
+              </w:rPr>
+              <w:t>Diversity — avoids always recommending popular items</w:t>
             </w:r>
           </w:p>
         </w:tc>
@@ -10465,6 +11648,64 @@
               <w:rPr>
                 <w:sz w:val="17"/>
               </w:rPr>
+              <w:t>TF-IDF</w:t>
+            </w:r>
+          </w:p>
+        </w:tc>
+        <w:tc>
+          <w:tcPr>
+            <w:tcW w:type="dxa" w:w="5499"/>
+          </w:tcPr>
+          <w:p>
+            <w:r>
+              <w:rPr>
+                <w:sz w:val="17"/>
+              </w:rPr>
+              <w:t>TF(t,d) x log((|D|+1)/(DF(t,D)+1))</w:t>
+            </w:r>
+          </w:p>
+        </w:tc>
+      </w:tr>
+      <w:tr>
+        <w:tc>
+          <w:tcPr>
+            <w:tcW w:type="dxa" w:w="3118"/>
+            <w:shd w:val="clear" w:color="auto" w:fill="F8FAFC"/>
+          </w:tcPr>
+          <w:p>
+            <w:r>
+              <w:rPr>
+                <w:sz w:val="17"/>
+              </w:rPr>
+              <w:t>Jaccard similarity</w:t>
+            </w:r>
+          </w:p>
+        </w:tc>
+        <w:tc>
+          <w:tcPr>
+            <w:tcW w:type="dxa" w:w="5499"/>
+            <w:shd w:val="clear" w:color="auto" w:fill="F8FAFC"/>
+          </w:tcPr>
+          <w:p>
+            <w:r>
+              <w:rPr>
+                <w:sz w:val="17"/>
+              </w:rPr>
+              <w:t>|A intersect B| / |A union B|</w:t>
+            </w:r>
+          </w:p>
+        </w:tc>
+      </w:tr>
+      <w:tr>
+        <w:tc>
+          <w:tcPr>
+            <w:tcW w:type="dxa" w:w="3118"/>
+          </w:tcPr>
+          <w:p>
+            <w:r>
+              <w:rPr>
+                <w:sz w:val="17"/>
+              </w:rPr>
               <w:t>Cosine similarity</w:t>
             </w:r>
           </w:p>
@@ -11607,7 +12848,7 @@
         <w:rPr>
           <w:sz w:val="19"/>
         </w:rPr>
-        <w:t>11. BPE tokenization steps</w:t>
+        <w:t>11. TF-IDF formula + worked example (IDF uses log with Laplace smoothing)</w:t>
       </w:r>
     </w:p>
     <w:p>
@@ -11620,7 +12861,7 @@
         <w:rPr>
           <w:sz w:val="19"/>
         </w:rPr>
-        <w:t>12. Porter's stemmer 5 phases with example rules</w:t>
+        <w:t>12. Jaccard vs Cosine vs Pearson — when to use each</w:t>
       </w:r>
     </w:p>
     <w:p>
@@ -11633,7 +12874,7 @@
         <w:rPr>
           <w:sz w:val="19"/>
         </w:rPr>
-        <w:t>13. MapReduce 5 steps + word count example</w:t>
+        <w:t>13. Explicit vs implicit ratings; utility matrix sparsity</w:t>
       </w:r>
     </w:p>
     <w:p>
@@ -11646,7 +12887,7 @@
         <w:rPr>
           <w:sz w:val="19"/>
         </w:rPr>
-        <w:t>14. HDFS: 3-way replication, write-once, fixed-size blocks</w:t>
+        <w:t>14. Transactions: BEGIN/COMMIT/ABORT; OLTP vs OLAP</w:t>
       </w:r>
     </w:p>
     <w:p>
@@ -11659,7 +12900,59 @@
         <w:rPr>
           <w:sz w:val="19"/>
         </w:rPr>
-        <w:t>15. Inverted index — flatMap + groupByKey pattern</w:t>
+        <w:t>15. BPE tokenization steps</w:t>
+      </w:r>
+    </w:p>
+    <w:p>
+      <w:pPr>
+        <w:pStyle w:val="ListBullet"/>
+        <w:spacing w:before="20" w:after="20"/>
+        <w:ind w:left="283"/>
+      </w:pPr>
+      <w:r>
+        <w:rPr>
+          <w:sz w:val="19"/>
+        </w:rPr>
+        <w:t>16. Porter's stemmer 5 phases with example rules</w:t>
+      </w:r>
+    </w:p>
+    <w:p>
+      <w:pPr>
+        <w:pStyle w:val="ListBullet"/>
+        <w:spacing w:before="20" w:after="20"/>
+        <w:ind w:left="283"/>
+      </w:pPr>
+      <w:r>
+        <w:rPr>
+          <w:sz w:val="19"/>
+        </w:rPr>
+        <w:t>17. MapReduce 5 steps + word count example</w:t>
+      </w:r>
+    </w:p>
+    <w:p>
+      <w:pPr>
+        <w:pStyle w:val="ListBullet"/>
+        <w:spacing w:before="20" w:after="20"/>
+        <w:ind w:left="283"/>
+      </w:pPr>
+      <w:r>
+        <w:rPr>
+          <w:sz w:val="19"/>
+        </w:rPr>
+        <w:t>18. HDFS: 3-way replication, write-once, fixed-size blocks</w:t>
+      </w:r>
+    </w:p>
+    <w:p>
+      <w:pPr>
+        <w:pStyle w:val="ListBullet"/>
+        <w:spacing w:before="20" w:after="20"/>
+        <w:ind w:left="283"/>
+      </w:pPr>
+      <w:r>
+        <w:rPr>
+          <w:sz w:val="19"/>
+        </w:rPr>
+        <w:t>19. Inverted index — flatMap + groupByKey pattern</w:t>
       </w:r>
     </w:p>
     <w:sectPr>

</xml_diff>

<commit_message>
Add missing L5-L8 content: linguistics framework, NLP apps, NLTK, GloVe, distributional hypothesis, CBOW architecture, text similarity algorithms, PageRank random walk, directed/undirected graphs, eigenvector centrality power iteration, edge betweenness, MSN case study, centrality limitations, NetworkX code patterns
Co-Authored-By: Claude Sonnet 4.6 <noreply@anthropic.com>
</commit_message>
<xml_diff>
--- a/DSAI4205_Exam_Review.docx
+++ b/DSAI4205_Exam_Review.docx
@@ -4233,6 +4233,658 @@
           <w:color w:val="2563EB"/>
           <w:sz w:val="22"/>
         </w:rPr>
+        <w:t>Linguistics Framework (NLP Subfields)</w:t>
+      </w:r>
+    </w:p>
+    <w:tbl>
+      <w:tblPr>
+        <w:tblStyle w:val="TableGrid"/>
+        <w:tblW w:type="auto" w:w="0"/>
+        <w:jc w:val="left"/>
+        <w:tblLook w:firstColumn="1" w:firstRow="1" w:lastColumn="0" w:lastRow="0" w:noHBand="0" w:noVBand="1" w:val="04A0"/>
+      </w:tblPr>
+      <w:tblGrid>
+        <w:gridCol w:w="3324"/>
+        <w:gridCol w:w="3324"/>
+        <w:gridCol w:w="3324"/>
+      </w:tblGrid>
+      <w:tr>
+        <w:tc>
+          <w:tcPr>
+            <w:tcW w:type="dxa" w:w="1587"/>
+            <w:shd w:val="clear" w:color="auto" w:fill="2563EB"/>
+          </w:tcPr>
+          <w:p>
+            <w:r>
+              <w:rPr>
+                <w:b/>
+                <w:color w:val="FFFFFF"/>
+                <w:sz w:val="17"/>
+              </w:rPr>
+              <w:t>Subfield</w:t>
+            </w:r>
+          </w:p>
+        </w:tc>
+        <w:tc>
+          <w:tcPr>
+            <w:tcW w:type="dxa" w:w="2835"/>
+            <w:shd w:val="clear" w:color="auto" w:fill="2563EB"/>
+          </w:tcPr>
+          <w:p>
+            <w:r>
+              <w:rPr>
+                <w:b/>
+                <w:color w:val="FFFFFF"/>
+                <w:sz w:val="17"/>
+              </w:rPr>
+              <w:t>What it studies</w:t>
+            </w:r>
+          </w:p>
+        </w:tc>
+        <w:tc>
+          <w:tcPr>
+            <w:tcW w:type="dxa" w:w="4195"/>
+            <w:shd w:val="clear" w:color="auto" w:fill="2563EB"/>
+          </w:tcPr>
+          <w:p>
+            <w:r>
+              <w:rPr>
+                <w:b/>
+                <w:color w:val="FFFFFF"/>
+                <w:sz w:val="17"/>
+              </w:rPr>
+              <w:t>Example</w:t>
+            </w:r>
+          </w:p>
+        </w:tc>
+      </w:tr>
+      <w:tr>
+        <w:tc>
+          <w:tcPr>
+            <w:tcW w:type="dxa" w:w="1587"/>
+          </w:tcPr>
+          <w:p>
+            <w:r>
+              <w:rPr>
+                <w:sz w:val="17"/>
+              </w:rPr>
+              <w:t>Phonetics</w:t>
+            </w:r>
+          </w:p>
+        </w:tc>
+        <w:tc>
+          <w:tcPr>
+            <w:tcW w:type="dxa" w:w="2835"/>
+          </w:tcPr>
+          <w:p>
+            <w:r>
+              <w:rPr>
+                <w:sz w:val="17"/>
+              </w:rPr>
+              <w:t>Physical sounds of speech</w:t>
+            </w:r>
+          </w:p>
+        </w:tc>
+        <w:tc>
+          <w:tcPr>
+            <w:tcW w:type="dxa" w:w="4195"/>
+          </w:tcPr>
+          <w:p>
+            <w:r>
+              <w:rPr>
+                <w:sz w:val="17"/>
+              </w:rPr>
+              <w:t>IPA transcription, acoustic signals</w:t>
+            </w:r>
+          </w:p>
+        </w:tc>
+      </w:tr>
+      <w:tr>
+        <w:tc>
+          <w:tcPr>
+            <w:tcW w:type="dxa" w:w="1587"/>
+            <w:shd w:val="clear" w:color="auto" w:fill="F8FAFC"/>
+          </w:tcPr>
+          <w:p>
+            <w:r>
+              <w:rPr>
+                <w:sz w:val="17"/>
+              </w:rPr>
+              <w:t>Phonology</w:t>
+            </w:r>
+          </w:p>
+        </w:tc>
+        <w:tc>
+          <w:tcPr>
+            <w:tcW w:type="dxa" w:w="2835"/>
+            <w:shd w:val="clear" w:color="auto" w:fill="F8FAFC"/>
+          </w:tcPr>
+          <w:p>
+            <w:r>
+              <w:rPr>
+                <w:sz w:val="17"/>
+              </w:rPr>
+              <w:t>Sound patterns and rules in a language</w:t>
+            </w:r>
+          </w:p>
+        </w:tc>
+        <w:tc>
+          <w:tcPr>
+            <w:tcW w:type="dxa" w:w="4195"/>
+            <w:shd w:val="clear" w:color="auto" w:fill="F8FAFC"/>
+          </w:tcPr>
+          <w:p>
+            <w:r>
+              <w:rPr>
+                <w:sz w:val="17"/>
+              </w:rPr>
+              <w:t>"cats" → /kæts/ not /kætz/</w:t>
+            </w:r>
+          </w:p>
+        </w:tc>
+      </w:tr>
+      <w:tr>
+        <w:tc>
+          <w:tcPr>
+            <w:tcW w:type="dxa" w:w="1587"/>
+          </w:tcPr>
+          <w:p>
+            <w:r>
+              <w:rPr>
+                <w:sz w:val="17"/>
+              </w:rPr>
+              <w:t>Morphology</w:t>
+            </w:r>
+          </w:p>
+        </w:tc>
+        <w:tc>
+          <w:tcPr>
+            <w:tcW w:type="dxa" w:w="2835"/>
+          </w:tcPr>
+          <w:p>
+            <w:r>
+              <w:rPr>
+                <w:sz w:val="17"/>
+              </w:rPr>
+              <w:t>Word structure and formation</w:t>
+            </w:r>
+          </w:p>
+        </w:tc>
+        <w:tc>
+          <w:tcPr>
+            <w:tcW w:type="dxa" w:w="4195"/>
+          </w:tcPr>
+          <w:p>
+            <w:r>
+              <w:rPr>
+                <w:sz w:val="17"/>
+              </w:rPr>
+              <w:t>"un-help-ful" = prefix + root + suffix</w:t>
+            </w:r>
+          </w:p>
+        </w:tc>
+      </w:tr>
+      <w:tr>
+        <w:tc>
+          <w:tcPr>
+            <w:tcW w:type="dxa" w:w="1587"/>
+            <w:shd w:val="clear" w:color="auto" w:fill="F8FAFC"/>
+          </w:tcPr>
+          <w:p>
+            <w:r>
+              <w:rPr>
+                <w:sz w:val="17"/>
+              </w:rPr>
+              <w:t>Syntax</w:t>
+            </w:r>
+          </w:p>
+        </w:tc>
+        <w:tc>
+          <w:tcPr>
+            <w:tcW w:type="dxa" w:w="2835"/>
+            <w:shd w:val="clear" w:color="auto" w:fill="F8FAFC"/>
+          </w:tcPr>
+          <w:p>
+            <w:r>
+              <w:rPr>
+                <w:sz w:val="17"/>
+              </w:rPr>
+              <w:t>Grammar rules for combining words</w:t>
+            </w:r>
+          </w:p>
+        </w:tc>
+        <w:tc>
+          <w:tcPr>
+            <w:tcW w:type="dxa" w:w="4195"/>
+            <w:shd w:val="clear" w:color="auto" w:fill="F8FAFC"/>
+          </w:tcPr>
+          <w:p>
+            <w:r>
+              <w:rPr>
+                <w:sz w:val="17"/>
+              </w:rPr>
+              <w:t>Subject-Verb-Object order in English</w:t>
+            </w:r>
+          </w:p>
+        </w:tc>
+      </w:tr>
+      <w:tr>
+        <w:tc>
+          <w:tcPr>
+            <w:tcW w:type="dxa" w:w="1587"/>
+          </w:tcPr>
+          <w:p>
+            <w:r>
+              <w:rPr>
+                <w:sz w:val="17"/>
+              </w:rPr>
+              <w:t>Semantics</w:t>
+            </w:r>
+          </w:p>
+        </w:tc>
+        <w:tc>
+          <w:tcPr>
+            <w:tcW w:type="dxa" w:w="2835"/>
+          </w:tcPr>
+          <w:p>
+            <w:r>
+              <w:rPr>
+                <w:sz w:val="17"/>
+              </w:rPr>
+              <w:t>Meaning of words and sentences</w:t>
+            </w:r>
+          </w:p>
+        </w:tc>
+        <w:tc>
+          <w:tcPr>
+            <w:tcW w:type="dxa" w:w="4195"/>
+          </w:tcPr>
+          <w:p>
+            <w:r>
+              <w:rPr>
+                <w:sz w:val="17"/>
+              </w:rPr>
+              <w:t>Synonymy, antonymy, word sense disambiguation</w:t>
+            </w:r>
+          </w:p>
+        </w:tc>
+      </w:tr>
+      <w:tr>
+        <w:tc>
+          <w:tcPr>
+            <w:tcW w:type="dxa" w:w="1587"/>
+            <w:shd w:val="clear" w:color="auto" w:fill="F8FAFC"/>
+          </w:tcPr>
+          <w:p>
+            <w:r>
+              <w:rPr>
+                <w:sz w:val="17"/>
+              </w:rPr>
+              <w:t>Pragmatics</w:t>
+            </w:r>
+          </w:p>
+        </w:tc>
+        <w:tc>
+          <w:tcPr>
+            <w:tcW w:type="dxa" w:w="2835"/>
+            <w:shd w:val="clear" w:color="auto" w:fill="F8FAFC"/>
+          </w:tcPr>
+          <w:p>
+            <w:r>
+              <w:rPr>
+                <w:sz w:val="17"/>
+              </w:rPr>
+              <w:t>Language use in context / speaker intent</w:t>
+            </w:r>
+          </w:p>
+        </w:tc>
+        <w:tc>
+          <w:tcPr>
+            <w:tcW w:type="dxa" w:w="4195"/>
+            <w:shd w:val="clear" w:color="auto" w:fill="F8FAFC"/>
+          </w:tcPr>
+          <w:p>
+            <w:r>
+              <w:rPr>
+                <w:sz w:val="17"/>
+              </w:rPr>
+              <w:t>"Can you pass the salt?" = request</w:t>
+            </w:r>
+          </w:p>
+        </w:tc>
+      </w:tr>
+    </w:tbl>
+    <w:p/>
+    <w:p>
+      <w:pPr>
+        <w:spacing w:before="120" w:after="20"/>
+      </w:pPr>
+      <w:r>
+        <w:rPr>
+          <w:b/>
+          <w:color w:val="7C3AED"/>
+          <w:sz w:val="20"/>
+        </w:rPr>
+        <w:t>Morphology: Inflectional vs Derivational</w:t>
+      </w:r>
+    </w:p>
+    <w:tbl>
+      <w:tblPr>
+        <w:tblStyle w:val="TableGrid"/>
+        <w:tblW w:type="auto" w:w="0"/>
+        <w:jc w:val="left"/>
+        <w:tblLook w:firstColumn="1" w:firstRow="1" w:lastColumn="0" w:lastRow="0" w:noHBand="0" w:noVBand="1" w:val="04A0"/>
+      </w:tblPr>
+      <w:tblGrid>
+        <w:gridCol w:w="3324"/>
+        <w:gridCol w:w="3324"/>
+        <w:gridCol w:w="3324"/>
+      </w:tblGrid>
+      <w:tr>
+        <w:tc>
+          <w:tcPr>
+            <w:tcW w:type="dxa" w:w="1984"/>
+            <w:shd w:val="clear" w:color="auto" w:fill="2563EB"/>
+          </w:tcPr>
+          <w:p>
+            <w:r>
+              <w:rPr>
+                <w:b/>
+                <w:color w:val="FFFFFF"/>
+                <w:sz w:val="17"/>
+              </w:rPr>
+              <w:t>Type</w:t>
+            </w:r>
+          </w:p>
+        </w:tc>
+        <w:tc>
+          <w:tcPr>
+            <w:tcW w:type="dxa" w:w="3118"/>
+            <w:shd w:val="clear" w:color="auto" w:fill="2563EB"/>
+          </w:tcPr>
+          <w:p>
+            <w:r>
+              <w:rPr>
+                <w:b/>
+                <w:color w:val="FFFFFF"/>
+                <w:sz w:val="17"/>
+              </w:rPr>
+              <w:t>Description</w:t>
+            </w:r>
+          </w:p>
+        </w:tc>
+        <w:tc>
+          <w:tcPr>
+            <w:tcW w:type="dxa" w:w="3515"/>
+            <w:shd w:val="clear" w:color="auto" w:fill="2563EB"/>
+          </w:tcPr>
+          <w:p>
+            <w:r>
+              <w:rPr>
+                <w:b/>
+                <w:color w:val="FFFFFF"/>
+                <w:sz w:val="17"/>
+              </w:rPr>
+              <w:t>Example</w:t>
+            </w:r>
+          </w:p>
+        </w:tc>
+      </w:tr>
+      <w:tr>
+        <w:tc>
+          <w:tcPr>
+            <w:tcW w:type="dxa" w:w="1984"/>
+          </w:tcPr>
+          <w:p>
+            <w:r>
+              <w:rPr>
+                <w:sz w:val="17"/>
+              </w:rPr>
+              <w:t>Inflectional</w:t>
+            </w:r>
+          </w:p>
+        </w:tc>
+        <w:tc>
+          <w:tcPr>
+            <w:tcW w:type="dxa" w:w="3118"/>
+          </w:tcPr>
+          <w:p>
+            <w:r>
+              <w:rPr>
+                <w:sz w:val="17"/>
+              </w:rPr>
+              <w:t>Changes grammatical form, same word class</w:t>
+            </w:r>
+          </w:p>
+        </w:tc>
+        <w:tc>
+          <w:tcPr>
+            <w:tcW w:type="dxa" w:w="3515"/>
+          </w:tcPr>
+          <w:p>
+            <w:r>
+              <w:rPr>
+                <w:sz w:val="17"/>
+              </w:rPr>
+              <w:t>dog→dogs (plural), walk→walked (past)</w:t>
+            </w:r>
+          </w:p>
+        </w:tc>
+      </w:tr>
+      <w:tr>
+        <w:tc>
+          <w:tcPr>
+            <w:tcW w:type="dxa" w:w="1984"/>
+            <w:shd w:val="clear" w:color="auto" w:fill="F8FAFC"/>
+          </w:tcPr>
+          <w:p>
+            <w:r>
+              <w:rPr>
+                <w:sz w:val="17"/>
+              </w:rPr>
+              <w:t>Derivational</w:t>
+            </w:r>
+          </w:p>
+        </w:tc>
+        <w:tc>
+          <w:tcPr>
+            <w:tcW w:type="dxa" w:w="3118"/>
+            <w:shd w:val="clear" w:color="auto" w:fill="F8FAFC"/>
+          </w:tcPr>
+          <w:p>
+            <w:r>
+              <w:rPr>
+                <w:sz w:val="17"/>
+              </w:rPr>
+              <w:t>Creates new words, often changes class</w:t>
+            </w:r>
+          </w:p>
+        </w:tc>
+        <w:tc>
+          <w:tcPr>
+            <w:tcW w:type="dxa" w:w="3515"/>
+            <w:shd w:val="clear" w:color="auto" w:fill="F8FAFC"/>
+          </w:tcPr>
+          <w:p>
+            <w:r>
+              <w:rPr>
+                <w:sz w:val="17"/>
+              </w:rPr>
+              <w:t>happy→happiness (adj→noun), teach→teacher</w:t>
+            </w:r>
+          </w:p>
+        </w:tc>
+      </w:tr>
+    </w:tbl>
+    <w:p/>
+    <w:p>
+      <w:pPr>
+        <w:spacing w:before="200" w:after="40"/>
+      </w:pPr>
+      <w:r>
+        <w:rPr>
+          <w:b/>
+          <w:color w:val="2563EB"/>
+          <w:sz w:val="22"/>
+        </w:rPr>
+        <w:t>NLP Applications</w:t>
+      </w:r>
+    </w:p>
+    <w:p>
+      <w:pPr>
+        <w:pStyle w:val="ListBullet"/>
+        <w:spacing w:before="20" w:after="20"/>
+        <w:ind w:left="283"/>
+      </w:pPr>
+      <w:r>
+        <w:rPr>
+          <w:sz w:val="19"/>
+        </w:rPr>
+        <w:t>Sentiment Analysis: classify opinions as positive/negative/neutral</w:t>
+      </w:r>
+    </w:p>
+    <w:p>
+      <w:pPr>
+        <w:pStyle w:val="ListBullet"/>
+        <w:spacing w:before="20" w:after="20"/>
+        <w:ind w:left="283"/>
+      </w:pPr>
+      <w:r>
+        <w:rPr>
+          <w:sz w:val="19"/>
+        </w:rPr>
+        <w:t>Machine Translation: Google Translate, DeepL</w:t>
+      </w:r>
+    </w:p>
+    <w:p>
+      <w:pPr>
+        <w:pStyle w:val="ListBullet"/>
+        <w:spacing w:before="20" w:after="20"/>
+        <w:ind w:left="283"/>
+      </w:pPr>
+      <w:r>
+        <w:rPr>
+          <w:sz w:val="19"/>
+        </w:rPr>
+        <w:t>Chatbots &amp; Virtual Assistants: Siri, Alexa, ChatGPT</w:t>
+      </w:r>
+    </w:p>
+    <w:p>
+      <w:pPr>
+        <w:pStyle w:val="ListBullet"/>
+        <w:spacing w:before="20" w:after="20"/>
+        <w:ind w:left="283"/>
+      </w:pPr>
+      <w:r>
+        <w:rPr>
+          <w:sz w:val="19"/>
+        </w:rPr>
+        <w:t>Speech Recognition: Whisper, Dragon NaturallySpeaking</w:t>
+      </w:r>
+    </w:p>
+    <w:p>
+      <w:pPr>
+        <w:pStyle w:val="ListBullet"/>
+        <w:spacing w:before="20" w:after="20"/>
+        <w:ind w:left="283"/>
+      </w:pPr>
+      <w:r>
+        <w:rPr>
+          <w:sz w:val="19"/>
+        </w:rPr>
+        <w:t>Named Entity Recognition (NER): extract persons, places, organisations</w:t>
+      </w:r>
+    </w:p>
+    <w:p>
+      <w:pPr>
+        <w:pStyle w:val="ListBullet"/>
+        <w:spacing w:before="20" w:after="20"/>
+        <w:ind w:left="283"/>
+      </w:pPr>
+      <w:r>
+        <w:rPr>
+          <w:sz w:val="19"/>
+        </w:rPr>
+        <w:t>Information Retrieval: search engines</w:t>
+      </w:r>
+    </w:p>
+    <w:p>
+      <w:pPr>
+        <w:pStyle w:val="ListBullet"/>
+        <w:spacing w:before="20" w:after="20"/>
+        <w:ind w:left="283"/>
+      </w:pPr>
+      <w:r>
+        <w:rPr>
+          <w:sz w:val="19"/>
+        </w:rPr>
+        <w:t>Text Summarisation: abstractive vs extractive</w:t>
+      </w:r>
+    </w:p>
+    <w:p>
+      <w:pPr>
+        <w:spacing w:before="200" w:after="40"/>
+      </w:pPr>
+      <w:r>
+        <w:rPr>
+          <w:b/>
+          <w:color w:val="2563EB"/>
+          <w:sz w:val="22"/>
+        </w:rPr>
+        <w:t>NLTK Library Overview</w:t>
+      </w:r>
+    </w:p>
+    <w:p>
+      <w:pPr>
+        <w:spacing w:before="40" w:after="40"/>
+        <w:ind w:left="283"/>
+        <w:shd w:val="clear" w:color="auto" w:fill="1E293B"/>
+      </w:pPr>
+      <w:r>
+        <w:rPr>
+          <w:rFonts w:ascii="Courier New" w:hAnsi="Courier New"/>
+          <w:color w:val="E2E8F0"/>
+          <w:sz w:val="16"/>
+        </w:rPr>
+        <w:t>import nltk</w:t>
+        <w:br/>
+        <w:t>from nltk.tokenize import word_tokenize</w:t>
+        <w:br/>
+        <w:t>from nltk.corpus import stopwords</w:t>
+        <w:br/>
+        <w:t>from nltk.stem import PorterStemmer, WordNetLemmatizer</w:t>
+        <w:br/>
+        <w:br/>
+        <w:t>tokens = word_tokenize("I am running fast.")</w:t>
+        <w:br/>
+        <w:t># ['I','am','running','fast','.']</w:t>
+        <w:br/>
+        <w:br/>
+        <w:t>sw = set(stopwords.words('english'))</w:t>
+        <w:br/>
+        <w:t>filtered = [w for w in tokens if w.lower() not in sw]</w:t>
+        <w:br/>
+        <w:br/>
+        <w:t>ps = PorterStemmer()</w:t>
+        <w:br/>
+        <w:t>ps.stem('computational')   # 'comput'</w:t>
+        <w:br/>
+        <w:br/>
+        <w:t>wnl = WordNetLemmatizer()</w:t>
+        <w:br/>
+        <w:t>wnl.lemmatize('better', pos='a')   # 'good' (needs POS tag)</w:t>
+      </w:r>
+    </w:p>
+    <w:p>
+      <w:pPr>
+        <w:spacing w:before="200" w:after="40"/>
+      </w:pPr>
+      <w:r>
+        <w:rPr>
+          <w:b/>
+          <w:color w:val="2563EB"/>
+          <w:sz w:val="22"/>
+        </w:rPr>
         <w:t>Text Preprocessing Pipeline</w:t>
       </w:r>
     </w:p>
@@ -5633,6 +6285,748 @@
           <w:sz w:val="26"/>
         </w:rPr>
         <w:t xml:space="preserve">  L6 · LLMs &amp; Word Embeddings (Word2Vec)  </w:t>
+      </w:r>
+    </w:p>
+    <w:p>
+      <w:pPr>
+        <w:spacing w:before="200" w:after="40"/>
+      </w:pPr>
+      <w:r>
+        <w:rPr>
+          <w:b/>
+          <w:color w:val="2563EB"/>
+          <w:sz w:val="22"/>
+        </w:rPr>
+        <w:t>Distributional Hypothesis</w:t>
+      </w:r>
+    </w:p>
+    <w:p>
+      <w:pPr>
+        <w:ind w:left="170"/>
+        <w:shd w:val="clear" w:color="auto" w:fill="DBEAFE"/>
+      </w:pPr>
+      <w:r>
+        <w:rPr>
+          <w:sz w:val="18"/>
+        </w:rPr>
+        <w:t>"A word is characterized by the company it keeps."  Firth (1957); Harris (1954): words in similar contexts have similar meanings. Underpins Word2Vec, GloVe, and all distributional models.</w:t>
+      </w:r>
+    </w:p>
+    <w:p>
+      <w:pPr>
+        <w:spacing w:before="200" w:after="40"/>
+      </w:pPr>
+      <w:r>
+        <w:rPr>
+          <w:b/>
+          <w:color w:val="2563EB"/>
+          <w:sz w:val="22"/>
+        </w:rPr>
+        <w:t>Word Vector Analogy Arithmetic</w:t>
+      </w:r>
+    </w:p>
+    <w:p>
+      <w:pPr>
+        <w:spacing w:before="40" w:after="40"/>
+        <w:ind w:left="283"/>
+        <w:shd w:val="clear" w:color="auto" w:fill="1E293B"/>
+      </w:pPr>
+      <w:r>
+        <w:rPr>
+          <w:rFonts w:ascii="Courier New" w:hAnsi="Courier New"/>
+          <w:color w:val="E2E8F0"/>
+          <w:sz w:val="16"/>
+        </w:rPr>
+        <w:t>vec("king") - vec("man") + vec("woman") ~ vec("queen")</w:t>
+        <w:br/>
+        <w:t>vec("Paris") - vec("France") + vec("Italy") ~ vec("Rome")</w:t>
+        <w:br/>
+        <w:br/>
+        <w:t>Embeddings encode relational structure:</w:t>
+        <w:br/>
+        <w:t xml:space="preserve">  Royalty offset = king - man ~ queen - woman</w:t>
+        <w:br/>
+        <w:t xml:space="preserve">  Capital-of offset = Paris - France ~ Rome - Italy</w:t>
+      </w:r>
+    </w:p>
+    <w:p>
+      <w:pPr>
+        <w:ind w:left="170"/>
+        <w:shd w:val="clear" w:color="auto" w:fill="FFFBEB"/>
+      </w:pPr>
+      <w:r>
+        <w:rPr>
+          <w:sz w:val="18"/>
+        </w:rPr>
+        <w:t>One-hot limitation:  cosine similarity between ANY two distinct one-hot vectors = 0 (orthogonal). Embeddings place semantically similar words nearby in vector space.</w:t>
+      </w:r>
+    </w:p>
+    <w:p>
+      <w:pPr>
+        <w:spacing w:before="200" w:after="40"/>
+      </w:pPr>
+      <w:r>
+        <w:rPr>
+          <w:b/>
+          <w:color w:val="2563EB"/>
+          <w:sz w:val="22"/>
+        </w:rPr>
+        <w:t>Special Tokens</w:t>
+      </w:r>
+    </w:p>
+    <w:tbl>
+      <w:tblPr>
+        <w:tblStyle w:val="TableGrid"/>
+        <w:tblW w:type="auto" w:w="0"/>
+        <w:jc w:val="left"/>
+        <w:tblLook w:firstColumn="1" w:firstRow="1" w:lastColumn="0" w:lastRow="0" w:noHBand="0" w:noVBand="1" w:val="04A0"/>
+      </w:tblPr>
+      <w:tblGrid>
+        <w:gridCol w:w="4986"/>
+        <w:gridCol w:w="4986"/>
+      </w:tblGrid>
+      <w:tr>
+        <w:tc>
+          <w:tcPr>
+            <w:tcW w:type="dxa" w:w="1984"/>
+            <w:shd w:val="clear" w:color="auto" w:fill="2563EB"/>
+          </w:tcPr>
+          <w:p>
+            <w:r>
+              <w:rPr>
+                <w:b/>
+                <w:color w:val="FFFFFF"/>
+                <w:sz w:val="17"/>
+              </w:rPr>
+              <w:t>Token</w:t>
+            </w:r>
+          </w:p>
+        </w:tc>
+        <w:tc>
+          <w:tcPr>
+            <w:tcW w:type="dxa" w:w="6633"/>
+            <w:shd w:val="clear" w:color="auto" w:fill="2563EB"/>
+          </w:tcPr>
+          <w:p>
+            <w:r>
+              <w:rPr>
+                <w:b/>
+                <w:color w:val="FFFFFF"/>
+                <w:sz w:val="17"/>
+              </w:rPr>
+              <w:t>Purpose</w:t>
+            </w:r>
+          </w:p>
+        </w:tc>
+      </w:tr>
+      <w:tr>
+        <w:tc>
+          <w:tcPr>
+            <w:tcW w:type="dxa" w:w="1984"/>
+          </w:tcPr>
+          <w:p>
+            <w:r>
+              <w:rPr>
+                <w:sz w:val="17"/>
+              </w:rPr>
+              <w:t>&lt;PAD&gt;</w:t>
+            </w:r>
+          </w:p>
+        </w:tc>
+        <w:tc>
+          <w:tcPr>
+            <w:tcW w:type="dxa" w:w="6633"/>
+          </w:tcPr>
+          <w:p>
+            <w:r>
+              <w:rPr>
+                <w:sz w:val="17"/>
+              </w:rPr>
+              <w:t>Pad shorter sequences to equal length for batching</w:t>
+            </w:r>
+          </w:p>
+        </w:tc>
+      </w:tr>
+      <w:tr>
+        <w:tc>
+          <w:tcPr>
+            <w:tcW w:type="dxa" w:w="1984"/>
+            <w:shd w:val="clear" w:color="auto" w:fill="F8FAFC"/>
+          </w:tcPr>
+          <w:p>
+            <w:r>
+              <w:rPr>
+                <w:sz w:val="17"/>
+              </w:rPr>
+              <w:t>&lt;UNK&gt;</w:t>
+            </w:r>
+          </w:p>
+        </w:tc>
+        <w:tc>
+          <w:tcPr>
+            <w:tcW w:type="dxa" w:w="6633"/>
+            <w:shd w:val="clear" w:color="auto" w:fill="F8FAFC"/>
+          </w:tcPr>
+          <w:p>
+            <w:r>
+              <w:rPr>
+                <w:sz w:val="17"/>
+              </w:rPr>
+              <w:t>Replace rare / out-of-vocabulary words</w:t>
+            </w:r>
+          </w:p>
+        </w:tc>
+      </w:tr>
+      <w:tr>
+        <w:tc>
+          <w:tcPr>
+            <w:tcW w:type="dxa" w:w="1984"/>
+          </w:tcPr>
+          <w:p>
+            <w:r>
+              <w:rPr>
+                <w:sz w:val="17"/>
+              </w:rPr>
+              <w:t>&lt;BOS&gt;/&lt;EOS&gt;</w:t>
+            </w:r>
+          </w:p>
+        </w:tc>
+        <w:tc>
+          <w:tcPr>
+            <w:tcW w:type="dxa" w:w="6633"/>
+          </w:tcPr>
+          <w:p>
+            <w:r>
+              <w:rPr>
+                <w:sz w:val="17"/>
+              </w:rPr>
+              <w:t>Mark beginning / end of a sequence</w:t>
+            </w:r>
+          </w:p>
+        </w:tc>
+      </w:tr>
+    </w:tbl>
+    <w:p/>
+    <w:p>
+      <w:pPr>
+        <w:spacing w:before="200" w:after="40"/>
+      </w:pPr>
+      <w:r>
+        <w:rPr>
+          <w:b/>
+          <w:color w:val="2563EB"/>
+          <w:sz w:val="22"/>
+        </w:rPr>
+        <w:t>GloVe — Global Vectors (Stanford)</w:t>
+      </w:r>
+    </w:p>
+    <w:tbl>
+      <w:tblPr>
+        <w:tblStyle w:val="TableGrid"/>
+        <w:tblW w:type="auto" w:w="0"/>
+        <w:jc w:val="left"/>
+        <w:tblLook w:firstColumn="1" w:firstRow="1" w:lastColumn="0" w:lastRow="0" w:noHBand="0" w:noVBand="1" w:val="04A0"/>
+      </w:tblPr>
+      <w:tblGrid>
+        <w:gridCol w:w="3324"/>
+        <w:gridCol w:w="3324"/>
+        <w:gridCol w:w="3324"/>
+      </w:tblGrid>
+      <w:tr>
+        <w:tc>
+          <w:tcPr>
+            <w:tcW w:type="dxa" w:w="1984"/>
+            <w:shd w:val="clear" w:color="auto" w:fill="2563EB"/>
+          </w:tcPr>
+          <w:p>
+            <w:r>
+              <w:rPr>
+                <w:b/>
+                <w:color w:val="FFFFFF"/>
+                <w:sz w:val="17"/>
+              </w:rPr>
+            </w:r>
+          </w:p>
+        </w:tc>
+        <w:tc>
+          <w:tcPr>
+            <w:tcW w:type="dxa" w:w="3288"/>
+            <w:shd w:val="clear" w:color="auto" w:fill="2563EB"/>
+          </w:tcPr>
+          <w:p>
+            <w:r>
+              <w:rPr>
+                <w:b/>
+                <w:color w:val="FFFFFF"/>
+                <w:sz w:val="17"/>
+              </w:rPr>
+              <w:t>Word2Vec</w:t>
+            </w:r>
+          </w:p>
+        </w:tc>
+        <w:tc>
+          <w:tcPr>
+            <w:tcW w:type="dxa" w:w="3345"/>
+            <w:shd w:val="clear" w:color="auto" w:fill="2563EB"/>
+          </w:tcPr>
+          <w:p>
+            <w:r>
+              <w:rPr>
+                <w:b/>
+                <w:color w:val="FFFFFF"/>
+                <w:sz w:val="17"/>
+              </w:rPr>
+              <w:t>GloVe</w:t>
+            </w:r>
+          </w:p>
+        </w:tc>
+      </w:tr>
+      <w:tr>
+        <w:tc>
+          <w:tcPr>
+            <w:tcW w:type="dxa" w:w="1984"/>
+          </w:tcPr>
+          <w:p>
+            <w:r>
+              <w:rPr>
+                <w:sz w:val="17"/>
+              </w:rPr>
+              <w:t>Training signal</w:t>
+            </w:r>
+          </w:p>
+        </w:tc>
+        <w:tc>
+          <w:tcPr>
+            <w:tcW w:type="dxa" w:w="3288"/>
+          </w:tcPr>
+          <w:p>
+            <w:r>
+              <w:rPr>
+                <w:sz w:val="17"/>
+              </w:rPr>
+              <w:t>Local context window</w:t>
+            </w:r>
+          </w:p>
+        </w:tc>
+        <w:tc>
+          <w:tcPr>
+            <w:tcW w:type="dxa" w:w="3345"/>
+          </w:tcPr>
+          <w:p>
+            <w:r>
+              <w:rPr>
+                <w:sz w:val="17"/>
+              </w:rPr>
+              <w:t>Global co-occurrence matrix X</w:t>
+            </w:r>
+          </w:p>
+        </w:tc>
+      </w:tr>
+      <w:tr>
+        <w:tc>
+          <w:tcPr>
+            <w:tcW w:type="dxa" w:w="1984"/>
+            <w:shd w:val="clear" w:color="auto" w:fill="F8FAFC"/>
+          </w:tcPr>
+          <w:p>
+            <w:r>
+              <w:rPr>
+                <w:sz w:val="17"/>
+              </w:rPr>
+              <w:t>Method</w:t>
+            </w:r>
+          </w:p>
+        </w:tc>
+        <w:tc>
+          <w:tcPr>
+            <w:tcW w:type="dxa" w:w="3288"/>
+            <w:shd w:val="clear" w:color="auto" w:fill="F8FAFC"/>
+          </w:tcPr>
+          <w:p>
+            <w:r>
+              <w:rPr>
+                <w:sz w:val="17"/>
+              </w:rPr>
+              <w:t>Predictive neural, SGD</w:t>
+            </w:r>
+          </w:p>
+        </w:tc>
+        <w:tc>
+          <w:tcPr>
+            <w:tcW w:type="dxa" w:w="3345"/>
+            <w:shd w:val="clear" w:color="auto" w:fill="F8FAFC"/>
+          </w:tcPr>
+          <w:p>
+            <w:r>
+              <w:rPr>
+                <w:sz w:val="17"/>
+              </w:rPr>
+              <w:t>Matrix factorization (least squares)</w:t>
+            </w:r>
+          </w:p>
+        </w:tc>
+      </w:tr>
+      <w:tr>
+        <w:tc>
+          <w:tcPr>
+            <w:tcW w:type="dxa" w:w="1984"/>
+          </w:tcPr>
+          <w:p>
+            <w:r>
+              <w:rPr>
+                <w:sz w:val="17"/>
+              </w:rPr>
+              <w:t>Key advantage</w:t>
+            </w:r>
+          </w:p>
+        </w:tc>
+        <w:tc>
+          <w:tcPr>
+            <w:tcW w:type="dxa" w:w="3288"/>
+          </w:tcPr>
+          <w:p>
+            <w:r>
+              <w:rPr>
+                <w:sz w:val="17"/>
+              </w:rPr>
+              <w:t>Efficient, streams data</w:t>
+            </w:r>
+          </w:p>
+        </w:tc>
+        <w:tc>
+          <w:tcPr>
+            <w:tcW w:type="dxa" w:w="3345"/>
+          </w:tcPr>
+          <w:p>
+            <w:r>
+              <w:rPr>
+                <w:sz w:val="17"/>
+              </w:rPr>
+              <w:t>Captures full corpus statistics</w:t>
+            </w:r>
+          </w:p>
+        </w:tc>
+      </w:tr>
+    </w:tbl>
+    <w:p/>
+    <w:p>
+      <w:pPr>
+        <w:spacing w:before="40" w:after="40"/>
+        <w:ind w:left="283"/>
+        <w:shd w:val="clear" w:color="auto" w:fill="1E293B"/>
+      </w:pPr>
+      <w:r>
+        <w:rPr>
+          <w:rFonts w:ascii="Courier New" w:hAnsi="Courier New"/>
+          <w:color w:val="E2E8F0"/>
+          <w:sz w:val="16"/>
+        </w:rPr>
+        <w:t>GloVe objective:</w:t>
+        <w:br/>
+        <w:t xml:space="preserve">  J = Σ_{i,j} f(X_ij)(w_i^T w_j + b_i + b_j − log X_ij)^2</w:t>
+        <w:br/>
+        <w:br/>
+        <w:t>X_ij = co-occurrence count of word j in context of word i</w:t>
+        <w:br/>
+        <w:t>f(x)  = weighting function (caps frequent pairs)</w:t>
+      </w:r>
+    </w:p>
+    <w:p>
+      <w:pPr>
+        <w:spacing w:before="200" w:after="40"/>
+      </w:pPr>
+      <w:r>
+        <w:rPr>
+          <w:b/>
+          <w:color w:val="2563EB"/>
+          <w:sz w:val="22"/>
+        </w:rPr>
+        <w:t>CBOW Neural Architecture</w:t>
+      </w:r>
+    </w:p>
+    <w:p>
+      <w:pPr>
+        <w:spacing w:before="40" w:after="40"/>
+        <w:ind w:left="283"/>
+        <w:shd w:val="clear" w:color="auto" w:fill="1E293B"/>
+      </w:pPr>
+      <w:r>
+        <w:rPr>
+          <w:rFonts w:ascii="Courier New" w:hAnsi="Courier New"/>
+          <w:color w:val="E2E8F0"/>
+          <w:sz w:val="16"/>
+        </w:rPr>
+        <w:t>Layer 1: Embedding lookup  → one vector per context word (dim=d)</w:t>
+        <w:br/>
+        <w:t>Layer 2: Lambda mean pool   → x = mean(v_{w-m}, ..., v_{w+m})</w:t>
+        <w:br/>
+        <w:t>Layer 3: Dense (softmax)    → P(center | context) = softmax(W·x + b)</w:t>
+        <w:br/>
+        <w:br/>
+        <w:t>- Input: 2m one-hot context vectors (m = window size)</w:t>
+        <w:br/>
+        <w:t>- Shared embedding matrix across all context words</w:t>
+        <w:br/>
+        <w:t>- Mean pooling loses word order ("bag" of words)</w:t>
+      </w:r>
+    </w:p>
+    <w:p>
+      <w:pPr>
+        <w:spacing w:before="200" w:after="40"/>
+      </w:pPr>
+      <w:r>
+        <w:rPr>
+          <w:b/>
+          <w:color w:val="2563EB"/>
+          <w:sz w:val="22"/>
+        </w:rPr>
+        <w:t>Text Similarity Algorithms</w:t>
+      </w:r>
+    </w:p>
+    <w:tbl>
+      <w:tblPr>
+        <w:tblStyle w:val="TableGrid"/>
+        <w:tblW w:type="auto" w:w="0"/>
+        <w:jc w:val="left"/>
+        <w:tblLook w:firstColumn="1" w:firstRow="1" w:lastColumn="0" w:lastRow="0" w:noHBand="0" w:noVBand="1" w:val="04A0"/>
+      </w:tblPr>
+      <w:tblGrid>
+        <w:gridCol w:w="3324"/>
+        <w:gridCol w:w="3324"/>
+        <w:gridCol w:w="3324"/>
+      </w:tblGrid>
+      <w:tr>
+        <w:tc>
+          <w:tcPr>
+            <w:tcW w:type="dxa" w:w="2154"/>
+            <w:shd w:val="clear" w:color="auto" w:fill="2563EB"/>
+          </w:tcPr>
+          <w:p>
+            <w:r>
+              <w:rPr>
+                <w:b/>
+                <w:color w:val="FFFFFF"/>
+                <w:sz w:val="17"/>
+              </w:rPr>
+              <w:t>Algorithm</w:t>
+            </w:r>
+          </w:p>
+        </w:tc>
+        <w:tc>
+          <w:tcPr>
+            <w:tcW w:type="dxa" w:w="2721"/>
+            <w:shd w:val="clear" w:color="auto" w:fill="2563EB"/>
+          </w:tcPr>
+          <w:p>
+            <w:r>
+              <w:rPr>
+                <w:b/>
+                <w:color w:val="FFFFFF"/>
+                <w:sz w:val="17"/>
+              </w:rPr>
+              <w:t>Formula</w:t>
+            </w:r>
+          </w:p>
+        </w:tc>
+        <w:tc>
+          <w:tcPr>
+            <w:tcW w:type="dxa" w:w="3742"/>
+            <w:shd w:val="clear" w:color="auto" w:fill="2563EB"/>
+          </w:tcPr>
+          <w:p>
+            <w:r>
+              <w:rPr>
+                <w:b/>
+                <w:color w:val="FFFFFF"/>
+                <w:sz w:val="17"/>
+              </w:rPr>
+              <w:t>Key constraint</w:t>
+            </w:r>
+          </w:p>
+        </w:tc>
+      </w:tr>
+      <w:tr>
+        <w:tc>
+          <w:tcPr>
+            <w:tcW w:type="dxa" w:w="2154"/>
+          </w:tcPr>
+          <w:p>
+            <w:r>
+              <w:rPr>
+                <w:sz w:val="17"/>
+              </w:rPr>
+              <w:t>Hamming Distance</w:t>
+            </w:r>
+          </w:p>
+        </w:tc>
+        <w:tc>
+          <w:tcPr>
+            <w:tcW w:type="dxa" w:w="2721"/>
+          </w:tcPr>
+          <w:p>
+            <w:r>
+              <w:rPr>
+                <w:sz w:val="17"/>
+              </w:rPr>
+              <w:t>Count positions where characters differ</w:t>
+            </w:r>
+          </w:p>
+        </w:tc>
+        <w:tc>
+          <w:tcPr>
+            <w:tcW w:type="dxa" w:w="3742"/>
+          </w:tcPr>
+          <w:p>
+            <w:r>
+              <w:rPr>
+                <w:sz w:val="17"/>
+              </w:rPr>
+              <w:t>Strings must be SAME length; substitutions only (no insert/delete)</w:t>
+            </w:r>
+          </w:p>
+        </w:tc>
+      </w:tr>
+      <w:tr>
+        <w:tc>
+          <w:tcPr>
+            <w:tcW w:type="dxa" w:w="2154"/>
+            <w:shd w:val="clear" w:color="auto" w:fill="F8FAFC"/>
+          </w:tcPr>
+          <w:p>
+            <w:r>
+              <w:rPr>
+                <w:sz w:val="17"/>
+              </w:rPr>
+              <w:t>Sorensen-Dice</w:t>
+            </w:r>
+          </w:p>
+        </w:tc>
+        <w:tc>
+          <w:tcPr>
+            <w:tcW w:type="dxa" w:w="2721"/>
+            <w:shd w:val="clear" w:color="auto" w:fill="F8FAFC"/>
+          </w:tcPr>
+          <w:p>
+            <w:r>
+              <w:rPr>
+                <w:sz w:val="17"/>
+              </w:rPr>
+              <w:t>2|A∩B| / (|A|+|B|)</w:t>
+            </w:r>
+          </w:p>
+        </w:tc>
+        <w:tc>
+          <w:tcPr>
+            <w:tcW w:type="dxa" w:w="3742"/>
+            <w:shd w:val="clear" w:color="auto" w:fill="F8FAFC"/>
+          </w:tcPr>
+          <w:p>
+            <w:r>
+              <w:rPr>
+                <w:sz w:val="17"/>
+              </w:rPr>
+              <w:t>Uses bigram sets; range [0,1]; symmetric</w:t>
+            </w:r>
+          </w:p>
+        </w:tc>
+      </w:tr>
+      <w:tr>
+        <w:tc>
+          <w:tcPr>
+            <w:tcW w:type="dxa" w:w="2154"/>
+          </w:tcPr>
+          <w:p>
+            <w:r>
+              <w:rPr>
+                <w:sz w:val="17"/>
+              </w:rPr>
+              <w:t>Tversky Index</w:t>
+            </w:r>
+          </w:p>
+        </w:tc>
+        <w:tc>
+          <w:tcPr>
+            <w:tcW w:type="dxa" w:w="2721"/>
+          </w:tcPr>
+          <w:p>
+            <w:r>
+              <w:rPr>
+                <w:sz w:val="17"/>
+              </w:rPr>
+              <w:t>|A∩B| / (|A∩B| + α|A\B| + β|B\A|)</w:t>
+            </w:r>
+          </w:p>
+        </w:tc>
+        <w:tc>
+          <w:tcPr>
+            <w:tcW w:type="dxa" w:w="3742"/>
+          </w:tcPr>
+          <w:p>
+            <w:r>
+              <w:rPr>
+                <w:sz w:val="17"/>
+              </w:rPr>
+              <w:t>Asymmetric; α=β=0.5→Dice, α=β=1→Jaccard</w:t>
+            </w:r>
+          </w:p>
+        </w:tc>
+      </w:tr>
+      <w:tr>
+        <w:tc>
+          <w:tcPr>
+            <w:tcW w:type="dxa" w:w="2154"/>
+            <w:shd w:val="clear" w:color="auto" w:fill="F8FAFC"/>
+          </w:tcPr>
+          <w:p>
+            <w:r>
+              <w:rPr>
+                <w:sz w:val="17"/>
+              </w:rPr>
+              <w:t>Overlap Coefficient</w:t>
+            </w:r>
+          </w:p>
+        </w:tc>
+        <w:tc>
+          <w:tcPr>
+            <w:tcW w:type="dxa" w:w="2721"/>
+            <w:shd w:val="clear" w:color="auto" w:fill="F8FAFC"/>
+          </w:tcPr>
+          <w:p>
+            <w:r>
+              <w:rPr>
+                <w:sz w:val="17"/>
+              </w:rPr>
+              <w:t>|A∩B| / min(|A|,|B|)</w:t>
+            </w:r>
+          </w:p>
+        </w:tc>
+        <w:tc>
+          <w:tcPr>
+            <w:tcW w:type="dxa" w:w="3742"/>
+            <w:shd w:val="clear" w:color="auto" w:fill="F8FAFC"/>
+          </w:tcPr>
+          <w:p>
+            <w:r>
+              <w:rPr>
+                <w:sz w:val="17"/>
+              </w:rPr>
+              <w:t>=1.0 if one set is subset of the other</w:t>
+            </w:r>
+          </w:p>
+        </w:tc>
+      </w:tr>
+    </w:tbl>
+    <w:p/>
+    <w:p>
+      <w:pPr>
+        <w:spacing w:before="20" w:after="20"/>
+        <w:ind w:left="0"/>
+      </w:pPr>
+      <w:r>
+        <w:rPr>
+          <w:sz w:val="19"/>
+        </w:rPr>
+        <w:t>Levenshtein: character sequences. Hamming: equal-length strings only. Dice/Tversky/Overlap: token/bigram sets — fuzzy document matching.</w:t>
       </w:r>
     </w:p>
     <w:p>
@@ -6151,6 +7545,142 @@
           <w:color w:val="2563EB"/>
           <w:sz w:val="22"/>
         </w:rPr>
+        <w:t>Web as a Graph &amp; Links as Votes</w:t>
+      </w:r>
+    </w:p>
+    <w:p>
+      <w:pPr>
+        <w:pStyle w:val="ListBullet"/>
+        <w:spacing w:before="20" w:after="20"/>
+        <w:ind w:left="283"/>
+      </w:pPr>
+      <w:r>
+        <w:rPr>
+          <w:sz w:val="19"/>
+        </w:rPr>
+        <w:t>Nodes = web pages;  Edges = hyperlinks (directed)</w:t>
+      </w:r>
+    </w:p>
+    <w:p>
+      <w:pPr>
+        <w:pStyle w:val="ListBullet"/>
+        <w:spacing w:before="20" w:after="20"/>
+        <w:ind w:left="283"/>
+      </w:pPr>
+      <w:r>
+        <w:rPr>
+          <w:sz w:val="19"/>
+        </w:rPr>
+        <w:t>Links as Votes: a link from page A to page B = a vote by A for B</w:t>
+      </w:r>
+    </w:p>
+    <w:p>
+      <w:pPr>
+        <w:pStyle w:val="ListBullet"/>
+        <w:spacing w:before="20" w:after="20"/>
+        <w:ind w:left="283"/>
+      </w:pPr>
+      <w:r>
+        <w:rPr>
+          <w:sz w:val="19"/>
+        </w:rPr>
+        <w:t>Weighted votes: a link from an important page is worth more → recursive definition → PageRank</w:t>
+      </w:r>
+    </w:p>
+    <w:p>
+      <w:pPr>
+        <w:pStyle w:val="ListBullet"/>
+        <w:spacing w:before="20" w:after="20"/>
+        <w:ind w:left="283"/>
+      </w:pPr>
+      <w:r>
+        <w:rPr>
+          <w:sz w:val="19"/>
+        </w:rPr>
+        <w:t>More in-links = more important; link from important source = stronger vote</w:t>
+      </w:r>
+    </w:p>
+    <w:p>
+      <w:pPr>
+        <w:spacing w:before="200" w:after="40"/>
+      </w:pPr>
+      <w:r>
+        <w:rPr>
+          <w:b/>
+          <w:color w:val="2563EB"/>
+          <w:sz w:val="22"/>
+        </w:rPr>
+        <w:t>Random Walk Interpretation</w:t>
+      </w:r>
+    </w:p>
+    <w:p>
+      <w:pPr>
+        <w:pStyle w:val="ListBullet"/>
+        <w:spacing w:before="20" w:after="20"/>
+        <w:ind w:left="283"/>
+      </w:pPr>
+      <w:r>
+        <w:rPr>
+          <w:sz w:val="19"/>
+        </w:rPr>
+        <w:t>Imagine a random surfer: with prob β follow a random outgoing link; with prob (1−β) teleport to any page uniformly</w:t>
+      </w:r>
+    </w:p>
+    <w:p>
+      <w:pPr>
+        <w:pStyle w:val="ListBullet"/>
+        <w:spacing w:before="20" w:after="20"/>
+        <w:ind w:left="283"/>
+      </w:pPr>
+      <w:r>
+        <w:rPr>
+          <w:sz w:val="19"/>
+        </w:rPr>
+        <w:t>PageRank(page) = long-run fraction of time the surfer spends on that page</w:t>
+      </w:r>
+    </w:p>
+    <w:p>
+      <w:pPr>
+        <w:pStyle w:val="ListBullet"/>
+        <w:spacing w:before="20" w:after="20"/>
+        <w:ind w:left="283"/>
+      </w:pPr>
+      <w:r>
+        <w:rPr>
+          <w:sz w:val="19"/>
+        </w:rPr>
+        <w:t>This is the stationary distribution π of the Markov chain defined by the Google Matrix A</w:t>
+      </w:r>
+    </w:p>
+    <w:p>
+      <w:pPr>
+        <w:spacing w:before="40" w:after="40"/>
+        <w:ind w:left="283"/>
+        <w:shd w:val="clear" w:color="auto" w:fill="1E293B"/>
+      </w:pPr>
+      <w:r>
+        <w:rPr>
+          <w:rFonts w:ascii="Courier New" w:hAnsi="Courier New"/>
+          <w:color w:val="E2E8F0"/>
+          <w:sz w:val="16"/>
+        </w:rPr>
+        <w:t>Stationary distribution: π = A · π</w:t>
+        <w:br/>
+        <w:t>Power iteration finds it: r converges to π regardless of start</w:t>
+        <w:br/>
+        <w:t>(Ergodicity guaranteed by teleport term — every state reachable from every other state)</w:t>
+      </w:r>
+    </w:p>
+    <w:p>
+      <w:pPr>
+        <w:spacing w:before="200" w:after="40"/>
+      </w:pPr>
+      <w:r>
+        <w:rPr>
+          <w:b/>
+          <w:color w:val="2563EB"/>
+          <w:sz w:val="22"/>
+        </w:rPr>
         <w:t>Core Idea</w:t>
       </w:r>
     </w:p>
@@ -6585,6 +8115,343 @@
           <w:color w:val="2563EB"/>
           <w:sz w:val="22"/>
         </w:rPr>
+        <w:t>Graph Types</w:t>
+      </w:r>
+    </w:p>
+    <w:tbl>
+      <w:tblPr>
+        <w:tblStyle w:val="TableGrid"/>
+        <w:tblW w:type="auto" w:w="0"/>
+        <w:jc w:val="left"/>
+        <w:tblLook w:firstColumn="1" w:firstRow="1" w:lastColumn="0" w:lastRow="0" w:noHBand="0" w:noVBand="1" w:val="04A0"/>
+      </w:tblPr>
+      <w:tblGrid>
+        <w:gridCol w:w="2493"/>
+        <w:gridCol w:w="2493"/>
+        <w:gridCol w:w="2493"/>
+        <w:gridCol w:w="2493"/>
+      </w:tblGrid>
+      <w:tr>
+        <w:tc>
+          <w:tcPr>
+            <w:tcW w:type="dxa" w:w="1417"/>
+            <w:shd w:val="clear" w:color="auto" w:fill="2563EB"/>
+          </w:tcPr>
+          <w:p>
+            <w:r>
+              <w:rPr>
+                <w:b/>
+                <w:color w:val="FFFFFF"/>
+                <w:sz w:val="17"/>
+              </w:rPr>
+              <w:t>Type</w:t>
+            </w:r>
+          </w:p>
+        </w:tc>
+        <w:tc>
+          <w:tcPr>
+            <w:tcW w:type="dxa" w:w="2835"/>
+            <w:shd w:val="clear" w:color="auto" w:fill="2563EB"/>
+          </w:tcPr>
+          <w:p>
+            <w:r>
+              <w:rPr>
+                <w:b/>
+                <w:color w:val="FFFFFF"/>
+                <w:sz w:val="17"/>
+              </w:rPr>
+              <w:t>Description</w:t>
+            </w:r>
+          </w:p>
+        </w:tc>
+        <w:tc>
+          <w:tcPr>
+            <w:tcW w:type="dxa" w:w="1984"/>
+            <w:shd w:val="clear" w:color="auto" w:fill="2563EB"/>
+          </w:tcPr>
+          <w:p>
+            <w:r>
+              <w:rPr>
+                <w:b/>
+                <w:color w:val="FFFFFF"/>
+                <w:sz w:val="17"/>
+              </w:rPr>
+              <w:t>Degree concept</w:t>
+            </w:r>
+          </w:p>
+        </w:tc>
+        <w:tc>
+          <w:tcPr>
+            <w:tcW w:type="dxa" w:w="2381"/>
+            <w:shd w:val="clear" w:color="auto" w:fill="2563EB"/>
+          </w:tcPr>
+          <w:p>
+            <w:r>
+              <w:rPr>
+                <w:b/>
+                <w:color w:val="FFFFFF"/>
+                <w:sz w:val="17"/>
+              </w:rPr>
+              <w:t>Examples</w:t>
+            </w:r>
+          </w:p>
+        </w:tc>
+      </w:tr>
+      <w:tr>
+        <w:tc>
+          <w:tcPr>
+            <w:tcW w:type="dxa" w:w="1417"/>
+          </w:tcPr>
+          <w:p>
+            <w:r>
+              <w:rPr>
+                <w:sz w:val="17"/>
+              </w:rPr>
+              <w:t>Undirected</w:t>
+            </w:r>
+          </w:p>
+        </w:tc>
+        <w:tc>
+          <w:tcPr>
+            <w:tcW w:type="dxa" w:w="2835"/>
+          </w:tcPr>
+          <w:p>
+            <w:r>
+              <w:rPr>
+                <w:sz w:val="17"/>
+              </w:rPr>
+              <w:t>Edges have no direction; A–B = B–A</w:t>
+            </w:r>
+          </w:p>
+        </w:tc>
+        <w:tc>
+          <w:tcPr>
+            <w:tcW w:type="dxa" w:w="1984"/>
+          </w:tcPr>
+          <w:p>
+            <w:r>
+              <w:rPr>
+                <w:sz w:val="17"/>
+              </w:rPr>
+              <w:t>Single degree d(v)</w:t>
+            </w:r>
+          </w:p>
+        </w:tc>
+        <w:tc>
+          <w:tcPr>
+            <w:tcW w:type="dxa" w:w="2381"/>
+          </w:tcPr>
+          <w:p>
+            <w:r>
+              <w:rPr>
+                <w:sz w:val="17"/>
+              </w:rPr>
+              <w:t>Friendship, co-authorship</w:t>
+            </w:r>
+          </w:p>
+        </w:tc>
+      </w:tr>
+      <w:tr>
+        <w:tc>
+          <w:tcPr>
+            <w:tcW w:type="dxa" w:w="1417"/>
+            <w:shd w:val="clear" w:color="auto" w:fill="F8FAFC"/>
+          </w:tcPr>
+          <w:p>
+            <w:r>
+              <w:rPr>
+                <w:sz w:val="17"/>
+              </w:rPr>
+              <w:t>Directed</w:t>
+            </w:r>
+          </w:p>
+        </w:tc>
+        <w:tc>
+          <w:tcPr>
+            <w:tcW w:type="dxa" w:w="2835"/>
+            <w:shd w:val="clear" w:color="auto" w:fill="F8FAFC"/>
+          </w:tcPr>
+          <w:p>
+            <w:r>
+              <w:rPr>
+                <w:sz w:val="17"/>
+              </w:rPr>
+              <w:t>Edges have direction; A→B ≠ B→A</w:t>
+            </w:r>
+          </w:p>
+        </w:tc>
+        <w:tc>
+          <w:tcPr>
+            <w:tcW w:type="dxa" w:w="1984"/>
+            <w:shd w:val="clear" w:color="auto" w:fill="F8FAFC"/>
+          </w:tcPr>
+          <w:p>
+            <w:r>
+              <w:rPr>
+                <w:sz w:val="17"/>
+              </w:rPr>
+              <w:t>In-degree (edges TO v) + Out-degree (FROM v)</w:t>
+            </w:r>
+          </w:p>
+        </w:tc>
+        <w:tc>
+          <w:tcPr>
+            <w:tcW w:type="dxa" w:w="2381"/>
+            <w:shd w:val="clear" w:color="auto" w:fill="F8FAFC"/>
+          </w:tcPr>
+          <w:p>
+            <w:r>
+              <w:rPr>
+                <w:sz w:val="17"/>
+              </w:rPr>
+              <w:t>Twitter follow, hyperlinks, citations</w:t>
+            </w:r>
+          </w:p>
+        </w:tc>
+      </w:tr>
+      <w:tr>
+        <w:tc>
+          <w:tcPr>
+            <w:tcW w:type="dxa" w:w="1417"/>
+          </w:tcPr>
+          <w:p>
+            <w:r>
+              <w:rPr>
+                <w:sz w:val="17"/>
+              </w:rPr>
+              <w:t>Unweighted</w:t>
+            </w:r>
+          </w:p>
+        </w:tc>
+        <w:tc>
+          <w:tcPr>
+            <w:tcW w:type="dxa" w:w="2835"/>
+          </w:tcPr>
+          <w:p>
+            <w:r>
+              <w:rPr>
+                <w:sz w:val="17"/>
+              </w:rPr>
+              <w:t>All edges have equal weight (1)</w:t>
+            </w:r>
+          </w:p>
+        </w:tc>
+        <w:tc>
+          <w:tcPr>
+            <w:tcW w:type="dxa" w:w="1984"/>
+          </w:tcPr>
+          <w:p>
+            <w:r>
+              <w:rPr>
+                <w:sz w:val="17"/>
+              </w:rPr>
+              <w:t>Distance = hop count</w:t>
+            </w:r>
+          </w:p>
+        </w:tc>
+        <w:tc>
+          <w:tcPr>
+            <w:tcW w:type="dxa" w:w="2381"/>
+          </w:tcPr>
+          <w:p>
+            <w:r>
+              <w:rPr>
+                <w:sz w:val="17"/>
+              </w:rPr>
+              <w:t>Basic social graphs</w:t>
+            </w:r>
+          </w:p>
+        </w:tc>
+      </w:tr>
+      <w:tr>
+        <w:tc>
+          <w:tcPr>
+            <w:tcW w:type="dxa" w:w="1417"/>
+            <w:shd w:val="clear" w:color="auto" w:fill="F8FAFC"/>
+          </w:tcPr>
+          <w:p>
+            <w:r>
+              <w:rPr>
+                <w:sz w:val="17"/>
+              </w:rPr>
+              <w:t>Weighted</w:t>
+            </w:r>
+          </w:p>
+        </w:tc>
+        <w:tc>
+          <w:tcPr>
+            <w:tcW w:type="dxa" w:w="2835"/>
+            <w:shd w:val="clear" w:color="auto" w:fill="F8FAFC"/>
+          </w:tcPr>
+          <w:p>
+            <w:r>
+              <w:rPr>
+                <w:sz w:val="17"/>
+              </w:rPr>
+              <w:t>Edges carry numeric weights</w:t>
+            </w:r>
+          </w:p>
+        </w:tc>
+        <w:tc>
+          <w:tcPr>
+            <w:tcW w:type="dxa" w:w="1984"/>
+            <w:shd w:val="clear" w:color="auto" w:fill="F8FAFC"/>
+          </w:tcPr>
+          <w:p>
+            <w:r>
+              <w:rPr>
+                <w:sz w:val="17"/>
+              </w:rPr>
+              <w:t>Use Dijkstra for shortest weighted paths</w:t>
+            </w:r>
+          </w:p>
+        </w:tc>
+        <w:tc>
+          <w:tcPr>
+            <w:tcW w:type="dxa" w:w="2381"/>
+            <w:shd w:val="clear" w:color="auto" w:fill="F8FAFC"/>
+          </w:tcPr>
+          <w:p>
+            <w:r>
+              <w:rPr>
+                <w:sz w:val="17"/>
+              </w:rPr>
+              <w:t>Road networks, airline routes</w:t>
+            </w:r>
+          </w:p>
+        </w:tc>
+      </w:tr>
+    </w:tbl>
+    <w:p/>
+    <w:p>
+      <w:pPr>
+        <w:spacing w:before="40" w:after="40"/>
+        <w:ind w:left="283"/>
+        <w:shd w:val="clear" w:color="auto" w:fill="1E293B"/>
+      </w:pPr>
+      <w:r>
+        <w:rPr>
+          <w:rFonts w:ascii="Courier New" w:hAnsi="Courier New"/>
+          <w:color w:val="E2E8F0"/>
+          <w:sz w:val="16"/>
+        </w:rPr>
+        <w:t>For directed graphs:</w:t>
+        <w:br/>
+        <w:t xml:space="preserve">  Σ in-degree(v)  =  Σ out-degree(v)  =  |E|</w:t>
+        <w:br/>
+        <w:t xml:space="preserve">  (each edge contributes 1 to in-degree of target AND 1 to out-degree of source)</w:t>
+      </w:r>
+    </w:p>
+    <w:p>
+      <w:pPr>
+        <w:spacing w:before="200" w:after="40"/>
+      </w:pPr>
+      <w:r>
+        <w:rPr>
+          <w:b/>
+          <w:color w:val="2563EB"/>
+          <w:sz w:val="22"/>
+        </w:rPr>
         <w:t>Graph Basics</w:t>
       </w:r>
     </w:p>
@@ -7199,6 +9066,548 @@
           <w:sz w:val="19"/>
         </w:rPr>
         <w:t>σ_st = total shortest paths from s to t; σ_st(v) = those passing through v</w:t>
+      </w:r>
+    </w:p>
+    <w:p>
+      <w:pPr>
+        <w:spacing w:before="200" w:after="40"/>
+      </w:pPr>
+      <w:r>
+        <w:rPr>
+          <w:b/>
+          <w:color w:val="2563EB"/>
+          <w:sz w:val="22"/>
+        </w:rPr>
+        <w:t>Eigenvector Centrality — Power Iteration</w:t>
+      </w:r>
+    </w:p>
+    <w:p>
+      <w:pPr>
+        <w:spacing w:before="40" w:after="40"/>
+        <w:ind w:left="283"/>
+        <w:shd w:val="clear" w:color="auto" w:fill="1E293B"/>
+      </w:pPr>
+      <w:r>
+        <w:rPr>
+          <w:rFonts w:ascii="Courier New" w:hAnsi="Courier New"/>
+          <w:color w:val="E2E8F0"/>
+          <w:sz w:val="16"/>
+        </w:rPr>
+        <w:t>c^(0) = [1, 1, ..., 1]^T   (initialise uniformly)</w:t>
+        <w:br/>
+        <w:t>c^(t+1) = A · c^(t)  /  || A · c^(t) ||   (multiply then normalise)</w:t>
+        <w:br/>
+        <w:br/>
+        <w:t>Repeat until convergence.</w:t>
+        <w:br/>
+        <w:t>Result = eigenvector for largest eigenvalue of adjacency matrix A.</w:t>
+        <w:br/>
+        <w:br/>
+        <w:t>A[i][j]=1 if edge exists; captures global influence (PageRank is a variant)</w:t>
+      </w:r>
+    </w:p>
+    <w:p>
+      <w:pPr>
+        <w:pStyle w:val="ListBullet"/>
+        <w:spacing w:before="20" w:after="20"/>
+        <w:ind w:left="283"/>
+      </w:pPr>
+      <w:r>
+        <w:rPr>
+          <w:sz w:val="19"/>
+        </w:rPr>
+        <w:t>Low-degree node can have high eigenvector centrality if connected to hubs</w:t>
+      </w:r>
+    </w:p>
+    <w:p>
+      <w:pPr>
+        <w:spacing w:before="200" w:after="40"/>
+      </w:pPr>
+      <w:r>
+        <w:rPr>
+          <w:b/>
+          <w:color w:val="2563EB"/>
+          <w:sz w:val="22"/>
+        </w:rPr>
+        <w:t>Edge Betweenness &amp; Community Detection</w:t>
+      </w:r>
+    </w:p>
+    <w:p>
+      <w:pPr>
+        <w:spacing w:before="40" w:after="40"/>
+        <w:ind w:left="283"/>
+        <w:shd w:val="clear" w:color="auto" w:fill="1E293B"/>
+      </w:pPr>
+      <w:r>
+        <w:rPr>
+          <w:rFonts w:ascii="Courier New" w:hAnsi="Courier New"/>
+          <w:color w:val="E2E8F0"/>
+          <w:sz w:val="16"/>
+        </w:rPr>
+        <w:t>EB(u,v) = Σ_{s≠t}  σ_st(u,v) / σ_st</w:t>
+        <w:br/>
+        <w:br/>
+        <w:t>Algorithm (BFS fractional counting):</w:t>
+        <w:br/>
+        <w:t xml:space="preserve">  1. Run BFS from each source s</w:t>
+        <w:br/>
+        <w:t xml:space="preserve">  2. For each target t: credit = 1 / σ_st</w:t>
+        <w:br/>
+        <w:t xml:space="preserve">  3. Distribute credit backwards along BFS tree edges</w:t>
+        <w:br/>
+        <w:t xml:space="preserve">  4. Edges on more shortest paths accumulate higher EB</w:t>
+        <w:br/>
+        <w:br/>
+        <w:t>Girvan-Newman community detection:</w:t>
+        <w:br/>
+        <w:t xml:space="preserve">  Repeatedly remove highest-EB edge → graph splits into communities</w:t>
+      </w:r>
+    </w:p>
+    <w:p>
+      <w:pPr>
+        <w:spacing w:before="200" w:after="40"/>
+      </w:pPr>
+      <w:r>
+        <w:rPr>
+          <w:b/>
+          <w:color w:val="2563EB"/>
+          <w:sz w:val="22"/>
+        </w:rPr>
+        <w:t>Real-World Case Study: MSN Messenger (2006)</w:t>
+      </w:r>
+    </w:p>
+    <w:tbl>
+      <w:tblPr>
+        <w:tblStyle w:val="TableGrid"/>
+        <w:tblW w:type="auto" w:w="0"/>
+        <w:jc w:val="left"/>
+        <w:tblLook w:firstColumn="1" w:firstRow="1" w:lastColumn="0" w:lastRow="0" w:noHBand="0" w:noVBand="1" w:val="04A0"/>
+      </w:tblPr>
+      <w:tblGrid>
+        <w:gridCol w:w="4986"/>
+        <w:gridCol w:w="4986"/>
+      </w:tblGrid>
+      <w:tr>
+        <w:tc>
+          <w:tcPr>
+            <w:tcW w:type="dxa" w:w="3118"/>
+            <w:shd w:val="clear" w:color="auto" w:fill="2563EB"/>
+          </w:tcPr>
+          <w:p>
+            <w:r>
+              <w:rPr>
+                <w:b/>
+                <w:color w:val="FFFFFF"/>
+                <w:sz w:val="17"/>
+              </w:rPr>
+              <w:t>Property</w:t>
+            </w:r>
+          </w:p>
+        </w:tc>
+        <w:tc>
+          <w:tcPr>
+            <w:tcW w:type="dxa" w:w="5499"/>
+            <w:shd w:val="clear" w:color="auto" w:fill="2563EB"/>
+          </w:tcPr>
+          <w:p>
+            <w:r>
+              <w:rPr>
+                <w:b/>
+                <w:color w:val="FFFFFF"/>
+                <w:sz w:val="17"/>
+              </w:rPr>
+              <w:t>Value</w:t>
+            </w:r>
+          </w:p>
+        </w:tc>
+      </w:tr>
+      <w:tr>
+        <w:tc>
+          <w:tcPr>
+            <w:tcW w:type="dxa" w:w="3118"/>
+          </w:tcPr>
+          <w:p>
+            <w:r>
+              <w:rPr>
+                <w:sz w:val="17"/>
+              </w:rPr>
+              <w:t>Nodes (users)</w:t>
+            </w:r>
+          </w:p>
+        </w:tc>
+        <w:tc>
+          <w:tcPr>
+            <w:tcW w:type="dxa" w:w="5499"/>
+          </w:tcPr>
+          <w:p>
+            <w:r>
+              <w:rPr>
+                <w:sz w:val="17"/>
+              </w:rPr>
+              <w:t>~180 million</w:t>
+            </w:r>
+          </w:p>
+        </w:tc>
+      </w:tr>
+      <w:tr>
+        <w:tc>
+          <w:tcPr>
+            <w:tcW w:type="dxa" w:w="3118"/>
+            <w:shd w:val="clear" w:color="auto" w:fill="F8FAFC"/>
+          </w:tcPr>
+          <w:p>
+            <w:r>
+              <w:rPr>
+                <w:sz w:val="17"/>
+              </w:rPr>
+              <w:t>Edges (communication pairs)</w:t>
+            </w:r>
+          </w:p>
+        </w:tc>
+        <w:tc>
+          <w:tcPr>
+            <w:tcW w:type="dxa" w:w="5499"/>
+            <w:shd w:val="clear" w:color="auto" w:fill="F8FAFC"/>
+          </w:tcPr>
+          <w:p>
+            <w:r>
+              <w:rPr>
+                <w:sz w:val="17"/>
+              </w:rPr>
+              <w:t>~1.3 billion</w:t>
+            </w:r>
+          </w:p>
+        </w:tc>
+      </w:tr>
+      <w:tr>
+        <w:tc>
+          <w:tcPr>
+            <w:tcW w:type="dxa" w:w="3118"/>
+          </w:tcPr>
+          <w:p>
+            <w:r>
+              <w:rPr>
+                <w:sz w:val="17"/>
+              </w:rPr>
+              <w:t>Average path length</w:t>
+            </w:r>
+          </w:p>
+        </w:tc>
+        <w:tc>
+          <w:tcPr>
+            <w:tcW w:type="dxa" w:w="5499"/>
+          </w:tcPr>
+          <w:p>
+            <w:r>
+              <w:rPr>
+                <w:sz w:val="17"/>
+              </w:rPr>
+              <w:t>6.6 hops</w:t>
+            </w:r>
+          </w:p>
+        </w:tc>
+      </w:tr>
+      <w:tr>
+        <w:tc>
+          <w:tcPr>
+            <w:tcW w:type="dxa" w:w="3118"/>
+            <w:shd w:val="clear" w:color="auto" w:fill="F8FAFC"/>
+          </w:tcPr>
+          <w:p>
+            <w:r>
+              <w:rPr>
+                <w:sz w:val="17"/>
+              </w:rPr>
+              <w:t>% within 8 hops</w:t>
+            </w:r>
+          </w:p>
+        </w:tc>
+        <w:tc>
+          <w:tcPr>
+            <w:tcW w:type="dxa" w:w="5499"/>
+            <w:shd w:val="clear" w:color="auto" w:fill="F8FAFC"/>
+          </w:tcPr>
+          <w:p>
+            <w:r>
+              <w:rPr>
+                <w:sz w:val="17"/>
+              </w:rPr>
+              <w:t>~90%</w:t>
+            </w:r>
+          </w:p>
+        </w:tc>
+      </w:tr>
+    </w:tbl>
+    <w:p/>
+    <w:p>
+      <w:pPr>
+        <w:ind w:left="170"/>
+        <w:shd w:val="clear" w:color="auto" w:fill="D1FAE5"/>
+      </w:pPr>
+      <w:r>
+        <w:rPr>
+          <w:sz w:val="18"/>
+        </w:rPr>
+        <w:t>Six Degrees of Separation:  Confirms small-world property at massive scale. Most pairs of people connected through ~6 intermediaries.</w:t>
+      </w:r>
+    </w:p>
+    <w:p>
+      <w:pPr>
+        <w:spacing w:before="200" w:after="40"/>
+      </w:pPr>
+      <w:r>
+        <w:rPr>
+          <w:b/>
+          <w:color w:val="2563EB"/>
+          <w:sz w:val="22"/>
+        </w:rPr>
+        <w:t>Centrality Limitations — Krackhardt's Kite Graph</w:t>
+      </w:r>
+    </w:p>
+    <w:tbl>
+      <w:tblPr>
+        <w:tblStyle w:val="TableGrid"/>
+        <w:tblW w:type="auto" w:w="0"/>
+        <w:jc w:val="left"/>
+        <w:tblLook w:firstColumn="1" w:firstRow="1" w:lastColumn="0" w:lastRow="0" w:noHBand="0" w:noVBand="1" w:val="04A0"/>
+      </w:tblPr>
+      <w:tblGrid>
+        <w:gridCol w:w="3324"/>
+        <w:gridCol w:w="3324"/>
+        <w:gridCol w:w="3324"/>
+      </w:tblGrid>
+      <w:tr>
+        <w:tc>
+          <w:tcPr>
+            <w:tcW w:type="dxa" w:w="1984"/>
+            <w:shd w:val="clear" w:color="auto" w:fill="2563EB"/>
+          </w:tcPr>
+          <w:p>
+            <w:r>
+              <w:rPr>
+                <w:b/>
+                <w:color w:val="FFFFFF"/>
+                <w:sz w:val="17"/>
+              </w:rPr>
+              <w:t>Centrality</w:t>
+            </w:r>
+          </w:p>
+        </w:tc>
+        <w:tc>
+          <w:tcPr>
+            <w:tcW w:type="dxa" w:w="2835"/>
+            <w:shd w:val="clear" w:color="auto" w:fill="2563EB"/>
+          </w:tcPr>
+          <w:p>
+            <w:r>
+              <w:rPr>
+                <w:b/>
+                <w:color w:val="FFFFFF"/>
+                <w:sz w:val="17"/>
+              </w:rPr>
+              <w:t>Identifies</w:t>
+            </w:r>
+          </w:p>
+        </w:tc>
+        <w:tc>
+          <w:tcPr>
+            <w:tcW w:type="dxa" w:w="3798"/>
+            <w:shd w:val="clear" w:color="auto" w:fill="2563EB"/>
+          </w:tcPr>
+          <w:p>
+            <w:r>
+              <w:rPr>
+                <w:b/>
+                <w:color w:val="FFFFFF"/>
+                <w:sz w:val="17"/>
+              </w:rPr>
+              <w:t>Highest-scoring node role</w:t>
+            </w:r>
+          </w:p>
+        </w:tc>
+      </w:tr>
+      <w:tr>
+        <w:tc>
+          <w:tcPr>
+            <w:tcW w:type="dxa" w:w="1984"/>
+          </w:tcPr>
+          <w:p>
+            <w:r>
+              <w:rPr>
+                <w:sz w:val="17"/>
+              </w:rPr>
+              <w:t>Degree</w:t>
+            </w:r>
+          </w:p>
+        </w:tc>
+        <w:tc>
+          <w:tcPr>
+            <w:tcW w:type="dxa" w:w="2835"/>
+          </w:tcPr>
+          <w:p>
+            <w:r>
+              <w:rPr>
+                <w:sz w:val="17"/>
+              </w:rPr>
+              <w:t>Most directly connected</w:t>
+            </w:r>
+          </w:p>
+        </w:tc>
+        <w:tc>
+          <w:tcPr>
+            <w:tcW w:type="dxa" w:w="3798"/>
+          </w:tcPr>
+          <w:p>
+            <w:r>
+              <w:rPr>
+                <w:sz w:val="17"/>
+              </w:rPr>
+              <w:t>Hub node (many neighbours)</w:t>
+            </w:r>
+          </w:p>
+        </w:tc>
+      </w:tr>
+      <w:tr>
+        <w:tc>
+          <w:tcPr>
+            <w:tcW w:type="dxa" w:w="1984"/>
+            <w:shd w:val="clear" w:color="auto" w:fill="F8FAFC"/>
+          </w:tcPr>
+          <w:p>
+            <w:r>
+              <w:rPr>
+                <w:sz w:val="17"/>
+              </w:rPr>
+              <w:t>Closeness</w:t>
+            </w:r>
+          </w:p>
+        </w:tc>
+        <w:tc>
+          <w:tcPr>
+            <w:tcW w:type="dxa" w:w="2835"/>
+            <w:shd w:val="clear" w:color="auto" w:fill="F8FAFC"/>
+          </w:tcPr>
+          <w:p>
+            <w:r>
+              <w:rPr>
+                <w:sz w:val="17"/>
+              </w:rPr>
+              <w:t>Fastest info spreader</w:t>
+            </w:r>
+          </w:p>
+        </w:tc>
+        <w:tc>
+          <w:tcPr>
+            <w:tcW w:type="dxa" w:w="3798"/>
+            <w:shd w:val="clear" w:color="auto" w:fill="F8FAFC"/>
+          </w:tcPr>
+          <w:p>
+            <w:r>
+              <w:rPr>
+                <w:sz w:val="17"/>
+              </w:rPr>
+              <w:t>Central node (short paths to all)</w:t>
+            </w:r>
+          </w:p>
+        </w:tc>
+      </w:tr>
+      <w:tr>
+        <w:tc>
+          <w:tcPr>
+            <w:tcW w:type="dxa" w:w="1984"/>
+          </w:tcPr>
+          <w:p>
+            <w:r>
+              <w:rPr>
+                <w:sz w:val="17"/>
+              </w:rPr>
+              <w:t>Betweenness</w:t>
+            </w:r>
+          </w:p>
+        </w:tc>
+        <w:tc>
+          <w:tcPr>
+            <w:tcW w:type="dxa" w:w="2835"/>
+          </w:tcPr>
+          <w:p>
+            <w:r>
+              <w:rPr>
+                <w:sz w:val="17"/>
+              </w:rPr>
+              <w:t>Controls information flow</w:t>
+            </w:r>
+          </w:p>
+        </w:tc>
+        <w:tc>
+          <w:tcPr>
+            <w:tcW w:type="dxa" w:w="3798"/>
+          </w:tcPr>
+          <w:p>
+            <w:r>
+              <w:rPr>
+                <w:sz w:val="17"/>
+              </w:rPr>
+              <w:t>Bridge / broker between clusters</w:t>
+            </w:r>
+          </w:p>
+        </w:tc>
+      </w:tr>
+      <w:tr>
+        <w:tc>
+          <w:tcPr>
+            <w:tcW w:type="dxa" w:w="1984"/>
+            <w:shd w:val="clear" w:color="auto" w:fill="F8FAFC"/>
+          </w:tcPr>
+          <w:p>
+            <w:r>
+              <w:rPr>
+                <w:sz w:val="17"/>
+              </w:rPr>
+              <w:t>Eigenvector</w:t>
+            </w:r>
+          </w:p>
+        </w:tc>
+        <w:tc>
+          <w:tcPr>
+            <w:tcW w:type="dxa" w:w="2835"/>
+            <w:shd w:val="clear" w:color="auto" w:fill="F8FAFC"/>
+          </w:tcPr>
+          <w:p>
+            <w:r>
+              <w:rPr>
+                <w:sz w:val="17"/>
+              </w:rPr>
+              <w:t>Most globally influential</w:t>
+            </w:r>
+          </w:p>
+        </w:tc>
+        <w:tc>
+          <w:tcPr>
+            <w:tcW w:type="dxa" w:w="3798"/>
+            <w:shd w:val="clear" w:color="auto" w:fill="F8FAFC"/>
+          </w:tcPr>
+          <w:p>
+            <w:r>
+              <w:rPr>
+                <w:sz w:val="17"/>
+              </w:rPr>
+              <w:t>Node connected to other influencers</w:t>
+            </w:r>
+          </w:p>
+        </w:tc>
+      </w:tr>
+    </w:tbl>
+    <w:p/>
+    <w:p>
+      <w:pPr>
+        <w:ind w:left="170"/>
+        <w:shd w:val="clear" w:color="auto" w:fill="FFFBEB"/>
+      </w:pPr>
+      <w:r>
+        <w:rPr>
+          <w:sz w:val="18"/>
+        </w:rPr>
+        <w:t>Key insight:  No single centrality is "best" — four measures give four different rankings in the Krackhardt kite graph. Choose based on what "important" means.</w:t>
       </w:r>
     </w:p>
     <w:p>
@@ -11211,6 +13620,96 @@
         <w:t>doc_freq = tokenized.flatMapValues(lambda x: x).distinct()\</w:t>
         <w:br/>
         <w:t xml:space="preserve">                    .map(lambda x:(x[1],x[0])).countByKey()</w:t>
+      </w:r>
+    </w:p>
+    <w:p>
+      <w:pPr>
+        <w:spacing w:before="200" w:after="40"/>
+      </w:pPr>
+      <w:r>
+        <w:rPr>
+          <w:b/>
+          <w:color w:val="2563EB"/>
+          <w:sz w:val="22"/>
+        </w:rPr>
+        <w:t>Tutorial 8 — NetworkX Graph Analytics</w:t>
+      </w:r>
+    </w:p>
+    <w:p>
+      <w:pPr>
+        <w:spacing w:before="40" w:after="40"/>
+        <w:ind w:left="283"/>
+        <w:shd w:val="clear" w:color="auto" w:fill="1E293B"/>
+      </w:pPr>
+      <w:r>
+        <w:rPr>
+          <w:rFonts w:ascii="Courier New" w:hAnsi="Courier New"/>
+          <w:color w:val="E2E8F0"/>
+          <w:sz w:val="16"/>
+        </w:rPr>
+        <w:t>import networkx as nx</w:t>
+        <w:br/>
+        <w:br/>
+        <w:t># Build graph</w:t>
+        <w:br/>
+        <w:t>G = nx.Graph()                  # undirected; nx.DiGraph() for directed</w:t>
+        <w:br/>
+        <w:t>G.add_edge("Alice","Bob")</w:t>
+        <w:br/>
+        <w:t>G.add_edge("Bob","Carol")</w:t>
+        <w:br/>
+        <w:t>G.add_edges_from([("Dave","Eve"),("Eve","Frank")])</w:t>
+        <w:br/>
+        <w:br/>
+        <w:t># Basic properties</w:t>
+        <w:br/>
+        <w:t>G.number_of_nodes(), G.number_of_edges()</w:t>
+        <w:br/>
+        <w:t>nx.density(G)                   # 2|E| / (N(N-1))</w:t>
+        <w:br/>
+        <w:br/>
+        <w:t># Degrees</w:t>
+        <w:br/>
+        <w:t>dict(G.degree())                # {node: degree}</w:t>
+        <w:br/>
+        <w:br/>
+        <w:t># Centrality</w:t>
+        <w:br/>
+        <w:t>cc = nx.closeness_centrality(G)</w:t>
+        <w:br/>
+        <w:t>hc = nx.harmonic_centrality(G)  # handles disconnected graphs</w:t>
+        <w:br/>
+        <w:t>bc = nx.betweenness_centrality(G, normalized=True)</w:t>
+        <w:br/>
+        <w:t>ec = nx.eigenvector_centrality(G, max_iter=100)</w:t>
+        <w:br/>
+        <w:br/>
+        <w:t># Clustering</w:t>
+        <w:br/>
+        <w:t>nx.clustering(G)                # per-node C(v)</w:t>
+        <w:br/>
+        <w:t>nx.average_clustering(G)</w:t>
+        <w:br/>
+        <w:br/>
+        <w:t># Shortest paths</w:t>
+        <w:br/>
+        <w:t>nx.shortest_path(G, "Alice", "Frank")</w:t>
+        <w:br/>
+        <w:t>nx.shortest_path_length(G, "Alice", "Frank")</w:t>
+        <w:br/>
+        <w:br/>
+        <w:t># Famous test graph</w:t>
+        <w:br/>
+        <w:t>K = nx.karate_club_graph()      # Zachary's karate club (34 nodes)</w:t>
+        <w:br/>
+        <w:br/>
+        <w:t># Girvan-Newman community detection</w:t>
+        <w:br/>
+        <w:t>from networkx.algorithms.community import girvan_newman</w:t>
+        <w:br/>
+        <w:t>comp = girvan_newman(G)</w:t>
+        <w:br/>
+        <w:t>communities = tuple(next(comp))</w:t>
       </w:r>
     </w:p>
     <w:p>

</xml_diff>

<commit_message>
Add all remaining gaps: HiveQL/buckets, text normalisation/chunking/POS filtering, PageRank dead-end detail + at-scale facts, weakly/strongly connected, global clustering coeff, 3-tier architecture, XML vs JSON, RecSys three problems + implicit asymmetry + CF assumption + KNN, Tutorial 6 Keras embedding + Tutorial 7 nx.pagerank convergence
Co-Authored-By: Claude Sonnet 4.6 <noreply@anthropic.com>
</commit_message>
<xml_diff>
--- a/DSAI4205_Exam_Review.docx
+++ b/DSAI4205_Exam_Review.docx
@@ -3932,6 +3932,118 @@
           <w:color w:val="2563EB"/>
           <w:sz w:val="22"/>
         </w:rPr>
+        <w:t>HiveQL — Key Commands</w:t>
+      </w:r>
+    </w:p>
+    <w:p>
+      <w:pPr>
+        <w:spacing w:before="40" w:after="40"/>
+        <w:ind w:left="283"/>
+        <w:shd w:val="clear" w:color="auto" w:fill="1E293B"/>
+      </w:pPr>
+      <w:r>
+        <w:rPr>
+          <w:rFonts w:ascii="Courier New" w:hAnsi="Courier New"/>
+          <w:color w:val="E2E8F0"/>
+          <w:sz w:val="16"/>
+        </w:rPr>
+        <w:t>-- Load local file into Hive table</w:t>
+        <w:br/>
+        <w:t>LOAD DATA LOCAL INPATH '/home/user/data.csv' INTO TABLE sales;</w:t>
+        <w:br/>
+        <w:br/>
+        <w:t>-- Load HDFS file into Hive table (moves the file)</w:t>
+        <w:br/>
+        <w:t>LOAD DATA INPATH '/hdfs/data/sales.csv' INTO TABLE sales;</w:t>
+        <w:br/>
+        <w:br/>
+        <w:t>-- Load into a specific partition</w:t>
+        <w:br/>
+        <w:t>LOAD DATA INPATH '/hdfs/data/jan.csv'</w:t>
+        <w:br/>
+        <w:t>INTO TABLE sales PARTITION (year=2024, month=1);</w:t>
+        <w:br/>
+        <w:br/>
+        <w:t>-- Create partitioned table</w:t>
+        <w:br/>
+        <w:t>CREATE TABLE logs (user_id STRING, action STRING)</w:t>
+        <w:br/>
+        <w:t>PARTITIONED BY (dt STRING) STORED AS PARQUET;</w:t>
+        <w:br/>
+        <w:br/>
+        <w:t>-- Query single partition (avoids full scan)</w:t>
+        <w:br/>
+        <w:t>SELECT * FROM logs WHERE dt = '2024-01-01';</w:t>
+      </w:r>
+    </w:p>
+    <w:p>
+      <w:pPr>
+        <w:spacing w:before="200" w:after="40"/>
+      </w:pPr>
+      <w:r>
+        <w:rPr>
+          <w:b/>
+          <w:color w:val="2563EB"/>
+          <w:sz w:val="22"/>
+        </w:rPr>
+        <w:t>Hive Buckets (Bucketing)</w:t>
+      </w:r>
+    </w:p>
+    <w:p>
+      <w:pPr>
+        <w:spacing w:before="20" w:after="20"/>
+        <w:ind w:left="0"/>
+      </w:pPr>
+      <w:r>
+        <w:rPr>
+          <w:sz w:val="19"/>
+        </w:rPr>
+        <w:t>Partitioning divides data into directories by value. Bucketing further divides each partition into fixed files via hash on a column.</w:t>
+      </w:r>
+    </w:p>
+    <w:p>
+      <w:pPr>
+        <w:spacing w:before="40" w:after="40"/>
+        <w:ind w:left="283"/>
+        <w:shd w:val="clear" w:color="auto" w:fill="1E293B"/>
+      </w:pPr>
+      <w:r>
+        <w:rPr>
+          <w:rFonts w:ascii="Courier New" w:hAnsi="Courier New"/>
+          <w:color w:val="E2E8F0"/>
+          <w:sz w:val="16"/>
+        </w:rPr>
+        <w:t>Bucket assignment:  bucket_id = hash(column_value) % num_buckets</w:t>
+        <w:br/>
+        <w:br/>
+        <w:t>Benefits:</w:t>
+        <w:br/>
+        <w:t xml:space="preserve">  - Efficient TABLESAMPLE queries</w:t>
+        <w:br/>
+        <w:t xml:space="preserve">  - Faster joins when both tables bucketed on join key (bucket map join)</w:t>
+        <w:br/>
+        <w:t xml:space="preserve">  - Avoids data skew vs pure range partitioning</w:t>
+        <w:br/>
+        <w:br/>
+        <w:t>CREATE TABLE orders (order_id INT, customer STRING, amount DOUBLE)</w:t>
+        <w:br/>
+        <w:t>PARTITIONED BY (year INT)</w:t>
+        <w:br/>
+        <w:t>CLUSTERED BY (customer) INTO 32 BUCKETS</w:t>
+        <w:br/>
+        <w:t>STORED AS ORC;</w:t>
+      </w:r>
+    </w:p>
+    <w:p>
+      <w:pPr>
+        <w:spacing w:before="200" w:after="40"/>
+      </w:pPr>
+      <w:r>
+        <w:rPr>
+          <w:b/>
+          <w:color w:val="2563EB"/>
+          <w:sz w:val="22"/>
+        </w:rPr>
         <w:t>Data Lake vs Data Warehouse</w:t>
       </w:r>
     </w:p>
@@ -4885,6 +4997,147 @@
           <w:color w:val="2563EB"/>
           <w:sz w:val="22"/>
         </w:rPr>
+        <w:t>Text Normalisation — Regex Patterns</w:t>
+      </w:r>
+    </w:p>
+    <w:p>
+      <w:pPr>
+        <w:spacing w:before="40" w:after="40"/>
+        <w:ind w:left="283"/>
+        <w:shd w:val="clear" w:color="auto" w:fill="1E293B"/>
+      </w:pPr>
+      <w:r>
+        <w:rPr>
+          <w:rFonts w:ascii="Courier New" w:hAnsi="Courier New"/>
+          <w:color w:val="E2E8F0"/>
+          <w:sz w:val="16"/>
+        </w:rPr>
+        <w:t>import re</w:t>
+        <w:br/>
+        <w:br/>
+        <w:t>def normalise(text):</w:t>
+        <w:br/>
+        <w:t xml:space="preserve">    text = text.lower()</w:t>
+        <w:br/>
+        <w:t xml:space="preserve">    text = re.sub(r'http\S+|www\S+', '', text)   # remove URLs</w:t>
+        <w:br/>
+        <w:t xml:space="preserve">    text = re.sub(r'@\w+', '', text)               # remove @mentions</w:t>
+        <w:br/>
+        <w:t xml:space="preserve">    text = re.sub(r'[^a-z0-9\s]', '', text)       # alphanumeric only</w:t>
+        <w:br/>
+        <w:t xml:space="preserve">    text = re.sub(r'\d+', '', text)                # remove numerics</w:t>
+        <w:br/>
+        <w:t xml:space="preserve">    tokens = text.split()</w:t>
+        <w:br/>
+        <w:t xml:space="preserve">    tokens = [w for w in tokens if len(w) &gt;= 3]    # min length filter</w:t>
+        <w:br/>
+        <w:t xml:space="preserve">    return tokens</w:t>
+      </w:r>
+    </w:p>
+    <w:p>
+      <w:pPr>
+        <w:spacing w:before="200" w:after="40"/>
+      </w:pPr>
+      <w:r>
+        <w:rPr>
+          <w:b/>
+          <w:color w:val="2563EB"/>
+          <w:sz w:val="22"/>
+        </w:rPr>
+        <w:t>Chunking — Noun Phrase Extraction</w:t>
+      </w:r>
+    </w:p>
+    <w:p>
+      <w:pPr>
+        <w:spacing w:before="40" w:after="40"/>
+        <w:ind w:left="283"/>
+        <w:shd w:val="clear" w:color="auto" w:fill="1E293B"/>
+      </w:pPr>
+      <w:r>
+        <w:rPr>
+          <w:rFonts w:ascii="Courier New" w:hAnsi="Courier New"/>
+          <w:color w:val="E2E8F0"/>
+          <w:sz w:val="16"/>
+        </w:rPr>
+        <w:t>import nltk</w:t>
+        <w:br/>
+        <w:t>from nltk import RegexpParser, pos_tag, word_tokenize</w:t>
+        <w:br/>
+        <w:br/>
+        <w:t># Grammar: optional DT + any JJ + noun</w:t>
+        <w:br/>
+        <w:t>grammar = "NP: {&lt;DT&gt;?&lt;JJ&gt;*&lt;NN&gt;}"</w:t>
+        <w:br/>
+        <w:t>parser  = RegexpParser(grammar)</w:t>
+        <w:br/>
+        <w:br/>
+        <w:t>tokens = word_tokenize("The quick brown fox jumped over the lazy dog")</w:t>
+        <w:br/>
+        <w:t>tagged = pos_tag(tokens)    # [('The','DT'),('quick','JJ'),('fox','NN'),...]</w:t>
+        <w:br/>
+        <w:t>tree   = parser.parse(tagged)</w:t>
+        <w:br/>
+        <w:br/>
+        <w:t># Extract noun phrase chunks</w:t>
+        <w:br/>
+        <w:t>for subtree in tree.subtrees():</w:t>
+        <w:br/>
+        <w:t xml:space="preserve">    if subtree.label() == 'NP':</w:t>
+        <w:br/>
+        <w:t xml:space="preserve">        print(' '.join(w for w,t in subtree.leaves()))</w:t>
+      </w:r>
+    </w:p>
+    <w:p>
+      <w:pPr>
+        <w:spacing w:before="200" w:after="40"/>
+      </w:pPr>
+      <w:r>
+        <w:rPr>
+          <w:b/>
+          <w:color w:val="2563EB"/>
+          <w:sz w:val="22"/>
+        </w:rPr>
+        <w:t>POS-Tag Filtering (Keep Content Words Only)</w:t>
+      </w:r>
+    </w:p>
+    <w:p>
+      <w:pPr>
+        <w:spacing w:before="40" w:after="40"/>
+        <w:ind w:left="283"/>
+        <w:shd w:val="clear" w:color="auto" w:fill="1E293B"/>
+      </w:pPr>
+      <w:r>
+        <w:rPr>
+          <w:rFonts w:ascii="Courier New" w:hAnsi="Courier New"/>
+          <w:color w:val="E2E8F0"/>
+          <w:sz w:val="16"/>
+        </w:rPr>
+        <w:t>KEEP_TAGS = {'NN','NNS','NNP','NNPS',          # nouns</w:t>
+        <w:br/>
+        <w:t xml:space="preserve">             'VB','VBD','VBG','VBN','VBP','VBZ', # verbs</w:t>
+        <w:br/>
+        <w:t xml:space="preserve">             'JJ','JJR','JJS'}                   # adjectives</w:t>
+        <w:br/>
+        <w:br/>
+        <w:t>def pos_filter(text):</w:t>
+        <w:br/>
+        <w:t xml:space="preserve">    tokens = word_tokenize(text.lower())</w:t>
+        <w:br/>
+        <w:t xml:space="preserve">    tagged = pos_tag(tokens)</w:t>
+        <w:br/>
+        <w:t xml:space="preserve">    return [word for word, tag in tagged if tag in KEEP_TAGS]</w:t>
+      </w:r>
+    </w:p>
+    <w:p>
+      <w:pPr>
+        <w:spacing w:before="200" w:after="40"/>
+      </w:pPr>
+      <w:r>
+        <w:rPr>
+          <w:b/>
+          <w:color w:val="2563EB"/>
+          <w:sz w:val="22"/>
+        </w:rPr>
         <w:t>Text Preprocessing Pipeline</w:t>
       </w:r>
     </w:p>
@@ -7893,6 +8146,101 @@
       </w:tr>
     </w:tbl>
     <w:p/>
+    <w:p>
+      <w:pPr>
+        <w:spacing w:before="120" w:after="20"/>
+      </w:pPr>
+      <w:r>
+        <w:rPr>
+          <w:b/>
+          <w:color w:val="7C3AED"/>
+          <w:sz w:val="20"/>
+        </w:rPr>
+        <w:t>Dead-End Rank Redistribution (detail)</w:t>
+      </w:r>
+    </w:p>
+    <w:p>
+      <w:pPr>
+        <w:pStyle w:val="ListBullet"/>
+        <w:spacing w:before="20" w:after="20"/>
+        <w:ind w:left="283"/>
+      </w:pPr>
+      <w:r>
+        <w:rPr>
+          <w:sz w:val="19"/>
+        </w:rPr>
+        <w:t>Dead ends cause rank leakage — their accumulated rank is never passed on</w:t>
+      </w:r>
+    </w:p>
+    <w:p>
+      <w:pPr>
+        <w:pStyle w:val="ListBullet"/>
+        <w:spacing w:before="20" w:after="20"/>
+        <w:ind w:left="283"/>
+      </w:pPr>
+      <w:r>
+        <w:rPr>
+          <w:sz w:val="19"/>
+        </w:rPr>
+        <w:t>Per-iteration fix: leaked = (1 - sum(r_new)) / N; add this back to every page</w:t>
+      </w:r>
+    </w:p>
+    <w:p>
+      <w:pPr>
+        <w:pStyle w:val="ListBullet"/>
+        <w:spacing w:before="20" w:after="20"/>
+        <w:ind w:left="283"/>
+      </w:pPr>
+      <w:r>
+        <w:rPr>
+          <w:sz w:val="19"/>
+        </w:rPr>
+        <w:t>Google Matrix (1-β)/N term achieves same effect globally for all nodes</w:t>
+      </w:r>
+    </w:p>
+    <w:p>
+      <w:pPr>
+        <w:spacing w:before="200" w:after="40"/>
+      </w:pPr>
+      <w:r>
+        <w:rPr>
+          <w:b/>
+          <w:color w:val="2563EB"/>
+          <w:sz w:val="22"/>
+        </w:rPr>
+        <w:t>PageRank at Scale</w:t>
+      </w:r>
+    </w:p>
+    <w:p>
+      <w:pPr>
+        <w:spacing w:before="40" w:after="40"/>
+        <w:ind w:left="283"/>
+        <w:shd w:val="clear" w:color="auto" w:fill="1E293B"/>
+      </w:pPr>
+      <w:r>
+        <w:rPr>
+          <w:rFonts w:ascii="Courier New" w:hAnsi="Courier New"/>
+          <w:color w:val="E2E8F0"/>
+          <w:sz w:val="16"/>
+        </w:rPr>
+        <w:t>Web scale (1998):</w:t>
+        <w:br/>
+        <w:t xml:space="preserve">  ~1 billion pages</w:t>
+        <w:br/>
+        <w:t xml:space="preserve">  Rank vector: one float64 per page → ~8 GB for one copy of r</w:t>
+        <w:br/>
+        <w:t xml:space="preserve">  Two copies per iteration (r_old + r_new) → ~16 GB minimum</w:t>
+        <w:br/>
+        <w:br/>
+        <w:t>Why distributed:</w:t>
+        <w:br/>
+        <w:t xml:space="preserve">  Single machine cannot hold rank vector in RAM (1998)</w:t>
+        <w:br/>
+        <w:t xml:space="preserve">  Spark/Hadoop: partition adjacency list + rank vector across nodes</w:t>
+        <w:br/>
+        <w:t xml:space="preserve">  Only rank contributions (src→dst pairs) cross nodes each iteration</w:t>
+      </w:r>
+    </w:p>
     <w:p>
       <w:pPr>
         <w:spacing w:before="200" w:after="40"/>
@@ -8784,6 +9132,168 @@
           <w:color w:val="2563EB"/>
           <w:sz w:val="22"/>
         </w:rPr>
+        <w:t>Graph Connectivity — Weakly vs Strongly Connected</w:t>
+      </w:r>
+    </w:p>
+    <w:tbl>
+      <w:tblPr>
+        <w:tblStyle w:val="TableGrid"/>
+        <w:tblW w:type="auto" w:w="0"/>
+        <w:jc w:val="left"/>
+        <w:tblLook w:firstColumn="1" w:firstRow="1" w:lastColumn="0" w:lastRow="0" w:noHBand="0" w:noVBand="1" w:val="04A0"/>
+      </w:tblPr>
+      <w:tblGrid>
+        <w:gridCol w:w="3324"/>
+        <w:gridCol w:w="3324"/>
+        <w:gridCol w:w="3324"/>
+      </w:tblGrid>
+      <w:tr>
+        <w:tc>
+          <w:tcPr>
+            <w:tcW w:type="dxa" w:w="1984"/>
+            <w:shd w:val="clear" w:color="auto" w:fill="2563EB"/>
+          </w:tcPr>
+          <w:p>
+            <w:r>
+              <w:rPr>
+                <w:b/>
+                <w:color w:val="FFFFFF"/>
+                <w:sz w:val="17"/>
+              </w:rPr>
+              <w:t>Type</w:t>
+            </w:r>
+          </w:p>
+        </w:tc>
+        <w:tc>
+          <w:tcPr>
+            <w:tcW w:type="dxa" w:w="3969"/>
+            <w:shd w:val="clear" w:color="auto" w:fill="2563EB"/>
+          </w:tcPr>
+          <w:p>
+            <w:r>
+              <w:rPr>
+                <w:b/>
+                <w:color w:val="FFFFFF"/>
+                <w:sz w:val="17"/>
+              </w:rPr>
+              <w:t>Definition</w:t>
+            </w:r>
+          </w:p>
+        </w:tc>
+        <w:tc>
+          <w:tcPr>
+            <w:tcW w:type="dxa" w:w="2665"/>
+            <w:shd w:val="clear" w:color="auto" w:fill="2563EB"/>
+          </w:tcPr>
+          <w:p>
+            <w:r>
+              <w:rPr>
+                <w:b/>
+                <w:color w:val="FFFFFF"/>
+                <w:sz w:val="17"/>
+              </w:rPr>
+              <w:t>Example</w:t>
+            </w:r>
+          </w:p>
+        </w:tc>
+      </w:tr>
+      <w:tr>
+        <w:tc>
+          <w:tcPr>
+            <w:tcW w:type="dxa" w:w="1984"/>
+          </w:tcPr>
+          <w:p>
+            <w:r>
+              <w:rPr>
+                <w:sz w:val="17"/>
+              </w:rPr>
+              <w:t>Weakly connected</w:t>
+            </w:r>
+          </w:p>
+        </w:tc>
+        <w:tc>
+          <w:tcPr>
+            <w:tcW w:type="dxa" w:w="3969"/>
+          </w:tcPr>
+          <w:p>
+            <w:r>
+              <w:rPr>
+                <w:sz w:val="17"/>
+              </w:rPr>
+              <w:t>Connected if edge directions are ignored (undirected path exists)</w:t>
+            </w:r>
+          </w:p>
+        </w:tc>
+        <w:tc>
+          <w:tcPr>
+            <w:tcW w:type="dxa" w:w="2665"/>
+          </w:tcPr>
+          <w:p>
+            <w:r>
+              <w:rPr>
+                <w:sz w:val="17"/>
+              </w:rPr>
+              <w:t>Most real directed graphs (web, Twitter)</w:t>
+            </w:r>
+          </w:p>
+        </w:tc>
+      </w:tr>
+      <w:tr>
+        <w:tc>
+          <w:tcPr>
+            <w:tcW w:type="dxa" w:w="1984"/>
+            <w:shd w:val="clear" w:color="auto" w:fill="F8FAFC"/>
+          </w:tcPr>
+          <w:p>
+            <w:r>
+              <w:rPr>
+                <w:sz w:val="17"/>
+              </w:rPr>
+              <w:t>Strongly connected</w:t>
+            </w:r>
+          </w:p>
+        </w:tc>
+        <w:tc>
+          <w:tcPr>
+            <w:tcW w:type="dxa" w:w="3969"/>
+            <w:shd w:val="clear" w:color="auto" w:fill="F8FAFC"/>
+          </w:tcPr>
+          <w:p>
+            <w:r>
+              <w:rPr>
+                <w:sz w:val="17"/>
+              </w:rPr>
+              <w:t>Directed path from EVERY node to EVERY other node</w:t>
+            </w:r>
+          </w:p>
+        </w:tc>
+        <w:tc>
+          <w:tcPr>
+            <w:tcW w:type="dxa" w:w="2665"/>
+            <w:shd w:val="clear" w:color="auto" w:fill="F8FAFC"/>
+          </w:tcPr>
+          <w:p>
+            <w:r>
+              <w:rPr>
+                <w:sz w:val="17"/>
+              </w:rPr>
+              <w:t>Stricter; web graph is not strongly connected</w:t>
+            </w:r>
+          </w:p>
+        </w:tc>
+      </w:tr>
+    </w:tbl>
+    <w:p/>
+    <w:p>
+      <w:pPr>
+        <w:spacing w:before="200" w:after="40"/>
+      </w:pPr>
+      <w:r>
+        <w:rPr>
+          <w:b/>
+          <w:color w:val="2563EB"/>
+          <w:sz w:val="22"/>
+        </w:rPr>
         <w:t>Clustering Coefficient</w:t>
       </w:r>
     </w:p>
@@ -8799,14 +9309,24 @@
           <w:color w:val="E2E8F0"/>
           <w:sz w:val="16"/>
         </w:rPr>
-        <w:t>C(v) = 2·m_v / (d_v · (d_v − 1))</w:t>
-        <w:br/>
-        <w:br/>
-        <w:t>m_v  = edges between v's neighbors</w:t>
-        <w:br/>
-        <w:t>d_v  = degree of v</w:t>
-        <w:br/>
-        <w:t>Range [0,1]:  1 = all neighbors connected; 0 = none</w:t>
+        <w:t>Local (per-node):</w:t>
+        <w:br/>
+        <w:t xml:space="preserve">  C(v) = 2·m_v / (d_v · (d_v - 1))</w:t>
+        <w:br/>
+        <w:t xml:space="preserve">  m_v = edges between v's neighbors</w:t>
+        <w:br/>
+        <w:t xml:space="preserve">  d_v = degree of v  (need d_v &gt;= 2)</w:t>
+        <w:br/>
+        <w:t xml:space="preserve">  Range [0,1]:  1 = all neighbors connected; 0 = none</w:t>
+        <w:br/>
+        <w:br/>
+        <w:t>Global (graph-wide):</w:t>
+        <w:br/>
+        <w:t xml:space="preserve">  C_global = (1/N) · Σ_v C(v)   &lt;- average of all local coefficients</w:t>
+        <w:br/>
+        <w:t xml:space="preserve">  Measures overall "cliquishness" of the network</w:t>
+        <w:br/>
+        <w:t xml:space="preserve">  Small-world networks: high C_global + small average path length</w:t>
       </w:r>
     </w:p>
     <w:p>
@@ -11894,25 +12414,6 @@
     </w:tbl>
     <w:p/>
     <w:p>
-      <w:r>
-        <w:br w:type="page"/>
-      </w:r>
-    </w:p>
-    <w:p>
-      <w:pPr>
-        <w:spacing w:before="280" w:after="40"/>
-        <w:shd w:val="clear" w:color="auto" w:fill="2563EB"/>
-      </w:pPr>
-      <w:r>
-        <w:rPr>
-          <w:b/>
-          <w:color w:val="FFFFFF"/>
-          <w:sz w:val="26"/>
-        </w:rPr>
-        <w:t xml:space="preserve">  L10 · Recommendation Systems  </w:t>
-      </w:r>
-    </w:p>
-    <w:p>
       <w:pPr>
         <w:spacing w:before="200" w:after="40"/>
       </w:pPr>
@@ -11922,19 +12423,52 @@
           <w:color w:val="2563EB"/>
           <w:sz w:val="22"/>
         </w:rPr>
-        <w:t>Utility Matrix &amp; Ratings</w:t>
+        <w:t>3-Tiered Web Architecture</w:t>
       </w:r>
     </w:p>
     <w:p>
       <w:pPr>
-        <w:spacing w:before="20" w:after="20"/>
-        <w:ind w:left="0"/>
+        <w:spacing w:before="40" w:after="40"/>
+        <w:ind w:left="283"/>
+        <w:shd w:val="clear" w:color="auto" w:fill="1E293B"/>
       </w:pPr>
       <w:r>
         <w:rPr>
-          <w:sz w:val="19"/>
+          <w:rFonts w:ascii="Courier New" w:hAnsi="Courier New"/>
+          <w:color w:val="E2E8F0"/>
+          <w:sz w:val="16"/>
         </w:rPr>
-        <w:t>Utility matrix: rows=users, columns=items, entries=ratings. Most entries empty (sparsity problem).</w:t>
+        <w:t>Tier 1: Client (browser / mobile app)</w:t>
+        <w:br/>
+        <w:t xml:space="preserve">       ↕  HTTP</w:t>
+        <w:br/>
+        <w:t>Tier 2: Application Server (business logic, stateless)</w:t>
+        <w:br/>
+        <w:t xml:space="preserve">       ↕  DB queries</w:t>
+        <w:br/>
+        <w:t>Tier 3: Database (persistence layer)</w:t>
+        <w:br/>
+        <w:br/>
+        <w:t>Why it matters:</w:t>
+        <w:br/>
+        <w:t xml:space="preserve">  App servers are stateless → horizontally scalable</w:t>
+        <w:br/>
+        <w:t xml:space="preserve">  DB becomes bottleneck at scale → motivates NoSQL + caching</w:t>
+        <w:br/>
+        <w:t xml:space="preserve">  NoSQL removes strict ACID so Tier 3 also scales horizontally</w:t>
+      </w:r>
+    </w:p>
+    <w:p>
+      <w:pPr>
+        <w:spacing w:before="200" w:after="40"/>
+      </w:pPr>
+      <w:r>
+        <w:rPr>
+          <w:b/>
+          <w:color w:val="2563EB"/>
+          <w:sz w:val="22"/>
+        </w:rPr>
+        <w:t>XML vs JSON</w:t>
       </w:r>
     </w:p>
     <w:tbl>
@@ -11952,7 +12486,7 @@
       <w:tr>
         <w:tc>
           <w:tcPr>
-            <w:tcW w:type="dxa" w:w="1701"/>
+            <w:tcW w:type="dxa" w:w="1984"/>
             <w:shd w:val="clear" w:color="auto" w:fill="2563EB"/>
           </w:tcPr>
           <w:p>
@@ -11962,13 +12496,12 @@
                 <w:color w:val="FFFFFF"/>
                 <w:sz w:val="17"/>
               </w:rPr>
-              <w:t>Rating type</w:t>
-            </w:r>
-          </w:p>
-        </w:tc>
-        <w:tc>
-          <w:tcPr>
-            <w:tcW w:type="dxa" w:w="3685"/>
+            </w:r>
+          </w:p>
+        </w:tc>
+        <w:tc>
+          <w:tcPr>
+            <w:tcW w:type="dxa" w:w="3118"/>
             <w:shd w:val="clear" w:color="auto" w:fill="2563EB"/>
           </w:tcPr>
           <w:p>
@@ -11978,13 +12511,13 @@
                 <w:color w:val="FFFFFF"/>
                 <w:sz w:val="17"/>
               </w:rPr>
-              <w:t>Description</w:t>
-            </w:r>
-          </w:p>
-        </w:tc>
-        <w:tc>
-          <w:tcPr>
-            <w:tcW w:type="dxa" w:w="3231"/>
+              <w:t>XML</w:t>
+            </w:r>
+          </w:p>
+        </w:tc>
+        <w:tc>
+          <w:tcPr>
+            <w:tcW w:type="dxa" w:w="3515"/>
             <w:shd w:val="clear" w:color="auto" w:fill="2563EB"/>
           </w:tcPr>
           <w:p>
@@ -11994,7 +12527,7 @@
                 <w:color w:val="FFFFFF"/>
                 <w:sz w:val="17"/>
               </w:rPr>
-              <w:t>Examples</w:t>
+              <w:t>JSON</w:t>
             </w:r>
           </w:p>
         </w:tc>
@@ -12002,40 +12535,40 @@
       <w:tr>
         <w:tc>
           <w:tcPr>
-            <w:tcW w:type="dxa" w:w="1701"/>
-          </w:tcPr>
-          <w:p>
-            <w:r>
-              <w:rPr>
-                <w:sz w:val="17"/>
-              </w:rPr>
-              <w:t>Explicit</w:t>
-            </w:r>
-          </w:p>
-        </w:tc>
-        <w:tc>
-          <w:tcPr>
-            <w:tcW w:type="dxa" w:w="3685"/>
-          </w:tcPr>
-          <w:p>
-            <w:r>
-              <w:rPr>
-                <w:sz w:val="17"/>
-              </w:rPr>
-              <w:t>User deliberately provides rating</w:t>
-            </w:r>
-          </w:p>
-        </w:tc>
-        <w:tc>
-          <w:tcPr>
-            <w:tcW w:type="dxa" w:w="3231"/>
-          </w:tcPr>
-          <w:p>
-            <w:r>
-              <w:rPr>
-                <w:sz w:val="17"/>
-              </w:rPr>
-              <w:t>Stars 1-5, thumbs up/down, written review</w:t>
+            <w:tcW w:type="dxa" w:w="1984"/>
+          </w:tcPr>
+          <w:p>
+            <w:r>
+              <w:rPr>
+                <w:sz w:val="17"/>
+              </w:rPr>
+              <w:t>Verbosity</w:t>
+            </w:r>
+          </w:p>
+        </w:tc>
+        <w:tc>
+          <w:tcPr>
+            <w:tcW w:type="dxa" w:w="3118"/>
+          </w:tcPr>
+          <w:p>
+            <w:r>
+              <w:rPr>
+                <w:sz w:val="17"/>
+              </w:rPr>
+              <w:t>Every value needs open+close tags</w:t>
+            </w:r>
+          </w:p>
+        </w:tc>
+        <w:tc>
+          <w:tcPr>
+            <w:tcW w:type="dxa" w:w="3515"/>
+          </w:tcPr>
+          <w:p>
+            <w:r>
+              <w:rPr>
+                <w:sz w:val="17"/>
+              </w:rPr>
+              <w:t>Compact key-value pairs</w:t>
             </w:r>
           </w:p>
         </w:tc>
@@ -12043,7 +12576,7 @@
       <w:tr>
         <w:tc>
           <w:tcPr>
-            <w:tcW w:type="dxa" w:w="1701"/>
+            <w:tcW w:type="dxa" w:w="1984"/>
             <w:shd w:val="clear" w:color="auto" w:fill="F8FAFC"/>
           </w:tcPr>
           <w:p>
@@ -12051,13 +12584,13 @@
               <w:rPr>
                 <w:sz w:val="17"/>
               </w:rPr>
-              <w:t>Implicit</w:t>
-            </w:r>
-          </w:p>
-        </w:tc>
-        <w:tc>
-          <w:tcPr>
-            <w:tcW w:type="dxa" w:w="3685"/>
+              <w:t>Parsing</w:t>
+            </w:r>
+          </w:p>
+        </w:tc>
+        <w:tc>
+          <w:tcPr>
+            <w:tcW w:type="dxa" w:w="3118"/>
             <w:shd w:val="clear" w:color="auto" w:fill="F8FAFC"/>
           </w:tcPr>
           <w:p>
@@ -12065,13 +12598,13 @@
               <w:rPr>
                 <w:sz w:val="17"/>
               </w:rPr>
-              <w:t>Inferred from behaviour (no direct rating)</w:t>
-            </w:r>
-          </w:p>
-        </w:tc>
-        <w:tc>
-          <w:tcPr>
-            <w:tcW w:type="dxa" w:w="3231"/>
+              <w:t>Heavier, slower</w:t>
+            </w:r>
+          </w:p>
+        </w:tc>
+        <w:tc>
+          <w:tcPr>
+            <w:tcW w:type="dxa" w:w="3515"/>
             <w:shd w:val="clear" w:color="auto" w:fill="F8FAFC"/>
           </w:tcPr>
           <w:p>
@@ -12079,7 +12612,92 @@
               <w:rPr>
                 <w:sz w:val="17"/>
               </w:rPr>
-              <w:t>Watch time, clicks, purchases, search history</w:t>
+              <w:t>Native to JavaScript, lighter</w:t>
+            </w:r>
+          </w:p>
+        </w:tc>
+      </w:tr>
+      <w:tr>
+        <w:tc>
+          <w:tcPr>
+            <w:tcW w:type="dxa" w:w="1984"/>
+          </w:tcPr>
+          <w:p>
+            <w:r>
+              <w:rPr>
+                <w:sz w:val="17"/>
+              </w:rPr>
+              <w:t>Usage</w:t>
+            </w:r>
+          </w:p>
+        </w:tc>
+        <w:tc>
+          <w:tcPr>
+            <w:tcW w:type="dxa" w:w="3118"/>
+          </w:tcPr>
+          <w:p>
+            <w:r>
+              <w:rPr>
+                <w:sz w:val="17"/>
+              </w:rPr>
+              <w:t>Legacy enterprise (SOAP, config)</w:t>
+            </w:r>
+          </w:p>
+        </w:tc>
+        <w:tc>
+          <w:tcPr>
+            <w:tcW w:type="dxa" w:w="3515"/>
+          </w:tcPr>
+          <w:p>
+            <w:r>
+              <w:rPr>
+                <w:sz w:val="17"/>
+              </w:rPr>
+              <w:t>REST APIs, MongoDB, Elasticsearch</w:t>
+            </w:r>
+          </w:p>
+        </w:tc>
+      </w:tr>
+      <w:tr>
+        <w:tc>
+          <w:tcPr>
+            <w:tcW w:type="dxa" w:w="1984"/>
+            <w:shd w:val="clear" w:color="auto" w:fill="F8FAFC"/>
+          </w:tcPr>
+          <w:p>
+            <w:r>
+              <w:rPr>
+                <w:sz w:val="17"/>
+              </w:rPr>
+              <w:t>Trend</w:t>
+            </w:r>
+          </w:p>
+        </w:tc>
+        <w:tc>
+          <w:tcPr>
+            <w:tcW w:type="dxa" w:w="3118"/>
+            <w:shd w:val="clear" w:color="auto" w:fill="F8FAFC"/>
+          </w:tcPr>
+          <w:p>
+            <w:r>
+              <w:rPr>
+                <w:sz w:val="17"/>
+              </w:rPr>
+              <w:t>Being phased out</w:t>
+            </w:r>
+          </w:p>
+        </w:tc>
+        <w:tc>
+          <w:tcPr>
+            <w:tcW w:type="dxa" w:w="3515"/>
+            <w:shd w:val="clear" w:color="auto" w:fill="F8FAFC"/>
+          </w:tcPr>
+          <w:p>
+            <w:r>
+              <w:rPr>
+                <w:sz w:val="17"/>
+              </w:rPr>
+              <w:t>"Many apps have replaced XML with JSON"</w:t>
             </w:r>
           </w:p>
         </w:tc>
@@ -12087,15 +12705,304 @@
     </w:tbl>
     <w:p/>
     <w:p>
+      <w:r>
+        <w:br w:type="page"/>
+      </w:r>
+    </w:p>
+    <w:p>
+      <w:pPr>
+        <w:spacing w:before="280" w:after="40"/>
+        <w:shd w:val="clear" w:color="auto" w:fill="2563EB"/>
+      </w:pPr>
+      <w:r>
+        <w:rPr>
+          <w:b/>
+          <w:color w:val="FFFFFF"/>
+          <w:sz w:val="26"/>
+        </w:rPr>
+        <w:t xml:space="preserve">  L10 · Recommendation Systems  </w:t>
+      </w:r>
+    </w:p>
+    <w:p>
+      <w:pPr>
+        <w:spacing w:before="200" w:after="40"/>
+      </w:pPr>
+      <w:r>
+        <w:rPr>
+          <w:b/>
+          <w:color w:val="2563EB"/>
+          <w:sz w:val="22"/>
+        </w:rPr>
+        <w:t>Three Key Problems</w:t>
+      </w:r>
+    </w:p>
+    <w:p>
+      <w:pPr>
+        <w:pStyle w:val="ListBullet"/>
+        <w:spacing w:before="20" w:after="20"/>
+        <w:ind w:left="283"/>
+      </w:pPr>
+      <w:r>
+        <w:rPr>
+          <w:sz w:val="19"/>
+        </w:rPr>
+        <w:t>1. Gathering ratings: collecting known user-item data (explicit asks vs implicit inference)</w:t>
+      </w:r>
+    </w:p>
+    <w:p>
+      <w:pPr>
+        <w:pStyle w:val="ListBullet"/>
+        <w:spacing w:before="20" w:after="20"/>
+        <w:ind w:left="283"/>
+      </w:pPr>
+      <w:r>
+        <w:rPr>
+          <w:sz w:val="19"/>
+        </w:rPr>
+        <w:t>2. Estimating unknowns: predicting missing ratings from known ones (core ML problem)</w:t>
+      </w:r>
+    </w:p>
+    <w:p>
+      <w:pPr>
+        <w:pStyle w:val="ListBullet"/>
+        <w:spacing w:before="20" w:after="20"/>
+        <w:ind w:left="283"/>
+      </w:pPr>
+      <w:r>
+        <w:rPr>
+          <w:sz w:val="19"/>
+        </w:rPr>
+        <w:t>3. Evaluation: measuring recommendation quality (RMSE, Precision@K, Coverage)</w:t>
+      </w:r>
+    </w:p>
+    <w:p>
+      <w:pPr>
+        <w:spacing w:before="200" w:after="40"/>
+      </w:pPr>
+      <w:r>
+        <w:rPr>
+          <w:b/>
+          <w:color w:val="2563EB"/>
+          <w:sz w:val="22"/>
+        </w:rPr>
+        <w:t>Utility Matrix &amp; Ratings</w:t>
+      </w:r>
+    </w:p>
+    <w:p>
+      <w:pPr>
+        <w:spacing w:before="20" w:after="20"/>
+        <w:ind w:left="0"/>
+      </w:pPr>
+      <w:r>
+        <w:rPr>
+          <w:sz w:val="19"/>
+        </w:rPr>
+        <w:t>Utility matrix: m users × n items; R[i,j] = rating. Most entries UNKNOWN (sparsity &gt;99% on Netflix/Amazon).</w:t>
+      </w:r>
+    </w:p>
+    <w:tbl>
+      <w:tblPr>
+        <w:tblStyle w:val="TableGrid"/>
+        <w:tblW w:type="auto" w:w="0"/>
+        <w:jc w:val="left"/>
+        <w:tblLook w:firstColumn="1" w:firstRow="1" w:lastColumn="0" w:lastRow="0" w:noHBand="0" w:noVBand="1" w:val="04A0"/>
+      </w:tblPr>
+      <w:tblGrid>
+        <w:gridCol w:w="2493"/>
+        <w:gridCol w:w="2493"/>
+        <w:gridCol w:w="2493"/>
+        <w:gridCol w:w="2493"/>
+      </w:tblGrid>
+      <w:tr>
+        <w:tc>
+          <w:tcPr>
+            <w:tcW w:type="dxa" w:w="1587"/>
+            <w:shd w:val="clear" w:color="auto" w:fill="2563EB"/>
+          </w:tcPr>
+          <w:p>
+            <w:r>
+              <w:rPr>
+                <w:b/>
+                <w:color w:val="FFFFFF"/>
+                <w:sz w:val="17"/>
+              </w:rPr>
+              <w:t>Rating type</w:t>
+            </w:r>
+          </w:p>
+        </w:tc>
+        <w:tc>
+          <w:tcPr>
+            <w:tcW w:type="dxa" w:w="2268"/>
+            <w:shd w:val="clear" w:color="auto" w:fill="2563EB"/>
+          </w:tcPr>
+          <w:p>
+            <w:r>
+              <w:rPr>
+                <w:b/>
+                <w:color w:val="FFFFFF"/>
+                <w:sz w:val="17"/>
+              </w:rPr>
+              <w:t>Description</w:t>
+            </w:r>
+          </w:p>
+        </w:tc>
+        <w:tc>
+          <w:tcPr>
+            <w:tcW w:type="dxa" w:w="1984"/>
+            <w:shd w:val="clear" w:color="auto" w:fill="2563EB"/>
+          </w:tcPr>
+          <w:p>
+            <w:r>
+              <w:rPr>
+                <w:b/>
+                <w:color w:val="FFFFFF"/>
+                <w:sz w:val="17"/>
+              </w:rPr>
+              <w:t>Examples</w:t>
+            </w:r>
+          </w:p>
+        </w:tc>
+        <w:tc>
+          <w:tcPr>
+            <w:tcW w:type="dxa" w:w="2778"/>
+            <w:shd w:val="clear" w:color="auto" w:fill="2563EB"/>
+          </w:tcPr>
+          <w:p>
+            <w:r>
+              <w:rPr>
+                <w:b/>
+                <w:color w:val="FFFFFF"/>
+                <w:sz w:val="17"/>
+              </w:rPr>
+              <w:t>Problem</w:t>
+            </w:r>
+          </w:p>
+        </w:tc>
+      </w:tr>
+      <w:tr>
+        <w:tc>
+          <w:tcPr>
+            <w:tcW w:type="dxa" w:w="1587"/>
+          </w:tcPr>
+          <w:p>
+            <w:r>
+              <w:rPr>
+                <w:sz w:val="17"/>
+              </w:rPr>
+              <w:t>Explicit</w:t>
+            </w:r>
+          </w:p>
+        </w:tc>
+        <w:tc>
+          <w:tcPr>
+            <w:tcW w:type="dxa" w:w="2268"/>
+          </w:tcPr>
+          <w:p>
+            <w:r>
+              <w:rPr>
+                <w:sz w:val="17"/>
+              </w:rPr>
+              <w:t>User deliberately provides rating</w:t>
+            </w:r>
+          </w:p>
+        </w:tc>
+        <w:tc>
+          <w:tcPr>
+            <w:tcW w:type="dxa" w:w="1984"/>
+          </w:tcPr>
+          <w:p>
+            <w:r>
+              <w:rPr>
+                <w:sz w:val="17"/>
+              </w:rPr>
+              <w:t>Stars 1-5, thumbs up/down</w:t>
+            </w:r>
+          </w:p>
+        </w:tc>
+        <w:tc>
+          <w:tcPr>
+            <w:tcW w:type="dxa" w:w="2778"/>
+          </w:tcPr>
+          <w:p>
+            <w:r>
+              <w:rPr>
+                <w:sz w:val="17"/>
+              </w:rPr>
+              <w:t>Sparse — users rarely bother</w:t>
+            </w:r>
+          </w:p>
+        </w:tc>
+      </w:tr>
+      <w:tr>
+        <w:tc>
+          <w:tcPr>
+            <w:tcW w:type="dxa" w:w="1587"/>
+            <w:shd w:val="clear" w:color="auto" w:fill="F8FAFC"/>
+          </w:tcPr>
+          <w:p>
+            <w:r>
+              <w:rPr>
+                <w:sz w:val="17"/>
+              </w:rPr>
+              <w:t>Implicit</w:t>
+            </w:r>
+          </w:p>
+        </w:tc>
+        <w:tc>
+          <w:tcPr>
+            <w:tcW w:type="dxa" w:w="2268"/>
+            <w:shd w:val="clear" w:color="auto" w:fill="F8FAFC"/>
+          </w:tcPr>
+          <w:p>
+            <w:r>
+              <w:rPr>
+                <w:sz w:val="17"/>
+              </w:rPr>
+              <w:t>Inferred from behaviour</w:t>
+            </w:r>
+          </w:p>
+        </w:tc>
+        <w:tc>
+          <w:tcPr>
+            <w:tcW w:type="dxa" w:w="1984"/>
+            <w:shd w:val="clear" w:color="auto" w:fill="F8FAFC"/>
+          </w:tcPr>
+          <w:p>
+            <w:r>
+              <w:rPr>
+                <w:sz w:val="17"/>
+              </w:rPr>
+              <w:t>Watch time, clicks, purchases</w:t>
+            </w:r>
+          </w:p>
+        </w:tc>
+        <w:tc>
+          <w:tcPr>
+            <w:tcW w:type="dxa" w:w="2778"/>
+            <w:shd w:val="clear" w:color="auto" w:fill="F8FAFC"/>
+          </w:tcPr>
+          <w:p>
+            <w:r>
+              <w:rPr>
+                <w:sz w:val="17"/>
+              </w:rPr>
+              <w:t>Cannot infer dislikes (not buying ≠ dislike)</w:t>
+            </w:r>
+          </w:p>
+        </w:tc>
+      </w:tr>
+    </w:tbl>
+    <w:p/>
+    <w:p>
       <w:pPr>
         <w:ind w:left="170"/>
-        <w:shd w:val="clear" w:color="auto" w:fill="DBEAFE"/>
+        <w:shd w:val="clear" w:color="auto" w:fill="FEF3C7"/>
       </w:pPr>
       <w:r>
         <w:rPr>
           <w:sz w:val="18"/>
         </w:rPr>
-        <w:t>Trade-off:  Explicit = accurate but sparse (users rarely rate). Implicit = dense but noisy (watching != liking).</w:t>
+        <w:t>Implicit feedback asymmetry:  Can observe positive signals (bought/clicked). Not buying = dislike OR unseen OR unaffordable. Hard to learn from negatives.</w:t>
       </w:r>
     </w:p>
     <w:p>
@@ -12346,6 +13253,18 @@
     <w:p/>
     <w:p>
       <w:pPr>
+        <w:ind w:left="170"/>
+        <w:shd w:val="clear" w:color="auto" w:fill="DBEAFE"/>
+      </w:pPr>
+      <w:r>
+        <w:rPr>
+          <w:sz w:val="18"/>
+        </w:rPr>
+        <w:t>CF Key Assumption:  "If user A has same opinion as user B on item X, A is more likely to agree with B on a different item Y." — Similar past behaviour predicts similar future preferences.</w:t>
+      </w:r>
+    </w:p>
+    <w:p>
+      <w:pPr>
         <w:spacing w:before="200" w:after="40"/>
       </w:pPr>
       <w:r>
@@ -12648,6 +13567,57 @@
           <w:color w:val="2563EB"/>
           <w:sz w:val="22"/>
         </w:rPr>
+        <w:t>KNN-Based Collaborative Filtering</w:t>
+      </w:r>
+    </w:p>
+    <w:p>
+      <w:pPr>
+        <w:spacing w:before="40" w:after="40"/>
+        <w:ind w:left="283"/>
+        <w:shd w:val="clear" w:color="auto" w:fill="1E293B"/>
+      </w:pPr>
+      <w:r>
+        <w:rPr>
+          <w:rFonts w:ascii="Courier New" w:hAnsi="Courier New"/>
+          <w:color w:val="E2E8F0"/>
+          <w:sz w:val="16"/>
+        </w:rPr>
+        <w:t>User-based prediction for user u on item i:</w:t>
+        <w:br/>
+        <w:t xml:space="preserve">  r_hat_ui = r_bar_u  +  Σ_{v in kNN(u)} sim(u,v)*(r_vi - r_bar_v)</w:t>
+        <w:br/>
+        <w:t xml:space="preserve">                         ─────────────────────────────────────────</w:t>
+        <w:br/>
+        <w:t xml:space="preserve">                                 Σ_{v in kNN(u)} |sim(u,v)|</w:t>
+        <w:br/>
+        <w:br/>
+        <w:t>r_bar_u = mean rating of user u (normalises harsh/generous raters)</w:t>
+        <w:br/>
+        <w:t>kNN(u)  = k most similar users (k typically 20-50)</w:t>
+        <w:br/>
+        <w:br/>
+        <w:t>Steps:</w:t>
+        <w:br/>
+        <w:t xml:space="preserve">  1. Compute similarity between u and ALL other users</w:t>
+        <w:br/>
+        <w:t xml:space="preserve">  2. Pick top-k most similar users</w:t>
+        <w:br/>
+        <w:t xml:space="preserve">  3. Weighted average of their ratings for item i</w:t>
+        <w:br/>
+        <w:br/>
+        <w:t>Limitation: O(N) similarity computation per prediction — does not scale to millions of users. ALS is far more scalable.</w:t>
+      </w:r>
+    </w:p>
+    <w:p>
+      <w:pPr>
+        <w:spacing w:before="200" w:after="40"/>
+      </w:pPr>
+      <w:r>
+        <w:rPr>
+          <w:b/>
+          <w:color w:val="2563EB"/>
+          <w:sz w:val="22"/>
+        </w:rPr>
         <w:t>Matrix Factorization (ALS)</w:t>
       </w:r>
     </w:p>
@@ -13620,6 +14590,131 @@
         <w:t>doc_freq = tokenized.flatMapValues(lambda x: x).distinct()\</w:t>
         <w:br/>
         <w:t xml:space="preserve">                    .map(lambda x:(x[1],x[0])).countByKey()</w:t>
+      </w:r>
+    </w:p>
+    <w:p>
+      <w:pPr>
+        <w:spacing w:before="200" w:after="40"/>
+      </w:pPr>
+      <w:r>
+        <w:rPr>
+          <w:b/>
+          <w:color w:val="2563EB"/>
+          <w:sz w:val="22"/>
+        </w:rPr>
+        <w:t>Tutorial 6 — Keras Word Embedding Layer (CBOW)</w:t>
+      </w:r>
+    </w:p>
+    <w:p>
+      <w:pPr>
+        <w:spacing w:before="40" w:after="40"/>
+        <w:ind w:left="283"/>
+        <w:shd w:val="clear" w:color="auto" w:fill="1E293B"/>
+      </w:pPr>
+      <w:r>
+        <w:rPr>
+          <w:rFonts w:ascii="Courier New" w:hAnsi="Courier New"/>
+          <w:color w:val="E2E8F0"/>
+          <w:sz w:val="16"/>
+        </w:rPr>
+        <w:t>from tensorflow.keras.models import Sequential</w:t>
+        <w:br/>
+        <w:t>from tensorflow.keras.layers import Embedding, Lambda, Dense</w:t>
+        <w:br/>
+        <w:t>import tensorflow.keras.backend as K</w:t>
+        <w:br/>
+        <w:br/>
+        <w:t>vocab_size  = 5000   # vocabulary size</w:t>
+        <w:br/>
+        <w:t>embed_dim   = 100    # embedding dimension (typically 50-300)</w:t>
+        <w:br/>
+        <w:t>window_size = 2      # context window on each side</w:t>
+        <w:br/>
+        <w:br/>
+        <w:t># CBOW: context words -&gt; mean pool -&gt; predict center word</w:t>
+        <w:br/>
+        <w:t>model = Sequential([</w:t>
+        <w:br/>
+        <w:t xml:space="preserve">    Embedding(input_dim=vocab_size, output_dim=embed_dim,</w:t>
+        <w:br/>
+        <w:t xml:space="preserve">              input_length=2*window_size),   # 2m context words</w:t>
+        <w:br/>
+        <w:t xml:space="preserve">    Lambda(lambda x: K.mean(x, axis=1)),    # mean pooling</w:t>
+        <w:br/>
+        <w:t xml:space="preserve">    Dense(vocab_size, activation='softmax') # output: prob over vocab</w:t>
+        <w:br/>
+        <w:t>])</w:t>
+        <w:br/>
+        <w:t>model.compile(optimizer='adam', loss='sparse_categorical_crossentropy')</w:t>
+        <w:br/>
+        <w:br/>
+        <w:t># After training: extract embedding weights</w:t>
+        <w:br/>
+        <w:t>embeddings = model.layers[0].get_weights()[0]  # (vocab_size, embed_dim)</w:t>
+      </w:r>
+    </w:p>
+    <w:p>
+      <w:pPr>
+        <w:spacing w:before="200" w:after="40"/>
+      </w:pPr>
+      <w:r>
+        <w:rPr>
+          <w:b/>
+          <w:color w:val="2563EB"/>
+          <w:sz w:val="22"/>
+        </w:rPr>
+        <w:t>Tutorial 7 — PageRank (PySpark + NetworkX)</w:t>
+      </w:r>
+    </w:p>
+    <w:p>
+      <w:pPr>
+        <w:spacing w:before="40" w:after="40"/>
+        <w:ind w:left="283"/>
+        <w:shd w:val="clear" w:color="auto" w:fill="1E293B"/>
+      </w:pPr>
+      <w:r>
+        <w:rPr>
+          <w:rFonts w:ascii="Courier New" w:hAnsi="Courier New"/>
+          <w:color w:val="E2E8F0"/>
+          <w:sz w:val="16"/>
+        </w:rPr>
+        <w:t>import networkx as nx</w:t>
+        <w:br/>
+        <w:br/>
+        <w:t># NetworkX built-in PageRank</w:t>
+        <w:br/>
+        <w:t>G  = nx.read_edgelist('links.txt', create_using=nx.DiGraph())</w:t>
+        <w:br/>
+        <w:t>pr = nx.pagerank(G, alpha=0.85, max_iter=100, tol=1e-6)</w:t>
+        <w:br/>
+        <w:t># alpha=damping factor β; tol=convergence threshold</w:t>
+        <w:br/>
+        <w:br/>
+        <w:t># PySpark iterative with convergence check</w:t>
+        <w:br/>
+        <w:t>beta, N = 0.85, num_nodes</w:t>
+        <w:br/>
+        <w:t>for i in range(max_iter):</w:t>
+        <w:br/>
+        <w:t xml:space="preserve">    contribs = links.join(ranks).flatMap(</w:t>
+        <w:br/>
+        <w:t xml:space="preserve">        lambda u_ls_r: [(dest, u_ls_r[1][1]/len(u_ls_r[1][0]))</w:t>
+        <w:br/>
+        <w:t xml:space="preserve">                        for dest in u_ls_r[1][0]])</w:t>
+        <w:br/>
+        <w:t xml:space="preserve">    new_ranks = contribs.reduceByKey(lambda a,b: a+b)\</w:t>
+        <w:br/>
+        <w:t xml:space="preserve">                        .mapValues(lambda r: beta*r + (1-beta)/N)</w:t>
+        <w:br/>
+        <w:t xml:space="preserve">    # Convergence: ||r_new - r_old||_1 &lt; tol</w:t>
+        <w:br/>
+        <w:t xml:space="preserve">    delta = ranks.join(new_ranks).map(lambda x: abs(x[1][1]-x[1][0])).sum()</w:t>
+        <w:br/>
+        <w:t xml:space="preserve">    ranks = new_ranks</w:t>
+        <w:br/>
+        <w:t xml:space="preserve">    if delta &lt; 1e-6:</w:t>
+        <w:br/>
+        <w:t xml:space="preserve">        break</w:t>
       </w:r>
     </w:p>
     <w:p>

</xml_diff>

<commit_message>
Final comprehensive pass: BPE phases, word analogy arithmetic, skip-gram assumptions, CBOW numerical example, spider trap/dead-end numerical traces, convergence trace, sparse vector ops, complex UDF, manual TF-IDF, Word2Vec nearest-words code, NetworkX graph construction exercises, Tutorial 6 Keras CBOW, Tutorial 7 pagerank convergence loop
Co-Authored-By: Claude Sonnet 4.6 <noreply@anthropic.com>
</commit_message>
<xml_diff>
--- a/DSAI4205_Exam_Review.docx
+++ b/DSAI4205_Exam_Review.docx
@@ -975,46 +975,151 @@
           <w:color w:val="2563EB"/>
           <w:sz w:val="22"/>
         </w:rPr>
-        <w:t>Dask</w:t>
+        <w:t>MapReduce — Detailed 3-Mapper Walkthrough</w:t>
       </w:r>
     </w:p>
     <w:p>
       <w:pPr>
-        <w:pStyle w:val="ListBullet"/>
-        <w:spacing w:before="20" w:after="20"/>
+        <w:spacing w:before="40" w:after="40"/>
         <w:ind w:left="283"/>
+        <w:shd w:val="clear" w:color="auto" w:fill="1E293B"/>
       </w:pPr>
       <w:r>
         <w:rPr>
-          <w:sz w:val="19"/>
+          <w:rFonts w:ascii="Courier New" w:hAnsi="Courier New"/>
+          <w:color w:val="E2E8F0"/>
+          <w:sz w:val="16"/>
         </w:rPr>
-        <w:t>Python-native parallel computing — extends NumPy/Pandas beyond RAM</w:t>
+        <w:t>3 documents across 3 mappers:</w:t>
+        <w:br/>
+        <w:t xml:space="preserve">  Mapper 1: "I often repeat repeat"</w:t>
+        <w:br/>
+        <w:t xml:space="preserve">  Mapper 2: "I do not not"</w:t>
+        <w:br/>
+        <w:t xml:space="preserve">  Mapper 3: "repeat after me"</w:t>
+        <w:br/>
+        <w:br/>
+        <w:t>Map phase (each emits (word,1) pairs):</w:t>
+        <w:br/>
+        <w:t xml:space="preserve">  Mapper 1: (I,1)(often,1)(repeat,1)(repeat,1)</w:t>
+        <w:br/>
+        <w:t xml:space="preserve">  Mapper 2: (I,1)(do,1)(not,1)(not,1)</w:t>
+        <w:br/>
+        <w:t xml:space="preserve">  Mapper 3: (repeat,1)(after,1)(me,1)</w:t>
+        <w:br/>
+        <w:br/>
+        <w:t>Shuffle (group by key, sent across network):</w:t>
+        <w:br/>
+        <w:t xml:space="preserve">  (I,[1,1])  (repeat,[1,1,1])  (not,[1,1])  (often,[1])</w:t>
+        <w:br/>
+        <w:br/>
+        <w:t>Reduce (sum list):</w:t>
+        <w:br/>
+        <w:t xml:space="preserve">  (I,2)  (repeat,3)  (not,2)  (often,1)</w:t>
+        <w:br/>
+        <w:br/>
+        <w:t>Performance cost: ALL intermediate data written to HDFS disk between phases</w:t>
+        <w:br/>
+        <w:t xml:space="preserve">                  (needed for fault tolerance — but makes iterative ML slow)</w:t>
+        <w:br/>
+        <w:t>Spark fix: keep intermediate data in MEMORY → 10-100x faster</w:t>
       </w:r>
     </w:p>
     <w:p>
       <w:pPr>
-        <w:pStyle w:val="ListBullet"/>
-        <w:spacing w:before="20" w:after="20"/>
-        <w:ind w:left="283"/>
+        <w:spacing w:before="200" w:after="40"/>
       </w:pPr>
       <w:r>
         <w:rPr>
-          <w:sz w:val="19"/>
+          <w:b/>
+          <w:color w:val="2563EB"/>
+          <w:sz w:val="22"/>
         </w:rPr>
-        <w:t>Lazy evaluation: builds task graph, executes only on .compute()</w:t>
+        <w:t>Dask — Block Algorithms &amp; Task Graph</w:t>
       </w:r>
     </w:p>
     <w:p>
       <w:pPr>
-        <w:pStyle w:val="ListBullet"/>
-        <w:spacing w:before="20" w:after="20"/>
+        <w:spacing w:before="40" w:after="40"/>
         <w:ind w:left="283"/>
+        <w:shd w:val="clear" w:color="auto" w:fill="1E293B"/>
       </w:pPr>
       <w:r>
         <w:rPr>
-          <w:sz w:val="19"/>
+          <w:rFonts w:ascii="Courier New" w:hAnsi="Courier New"/>
+          <w:color w:val="E2E8F0"/>
+          <w:sz w:val="16"/>
         </w:rPr>
-        <w:t>Block algorithms: splits computation into chunks</w:t>
+        <w:t>Block algorithm example (4x4 array split into 2x2 chunks):</w:t>
+        <w:br/>
+        <w:t xml:space="preserve">  Step 1: each worker computes sum of its 2x2 chunk independently</w:t>
+        <w:br/>
+        <w:t xml:space="preserve">  Step 2: combine chunk results → total</w:t>
+        <w:br/>
+        <w:t xml:space="preserve">  Worker = distinct server / local machine / CPU core</w:t>
+        <w:br/>
+        <w:br/>
+        <w:t>Task Graph:</w:t>
+        <w:br/>
+        <w:t xml:space="preserve">  - Symbolic representation of computations</w:t>
+        <w:br/>
+        <w:t xml:space="preserve">  - Nodes = tasks; Edges = dependencies</w:t>
+        <w:br/>
+        <w:t xml:space="preserve">  - Built lazily; executed only on .compute()</w:t>
+        <w:br/>
+        <w:t xml:space="preserve">  - Visualise: result.visualize()  (uses Graphviz)</w:t>
+      </w:r>
+    </w:p>
+    <w:p>
+      <w:pPr>
+        <w:spacing w:before="200" w:after="40"/>
+      </w:pPr>
+      <w:r>
+        <w:rPr>
+          <w:b/>
+          <w:color w:val="2563EB"/>
+          <w:sz w:val="22"/>
+        </w:rPr>
+        <w:t>Dask Chunk Specification (4 ways)</w:t>
+      </w:r>
+    </w:p>
+    <w:p>
+      <w:pPr>
+        <w:spacing w:before="40" w:after="40"/>
+        <w:ind w:left="283"/>
+        <w:shd w:val="clear" w:color="auto" w:fill="1E293B"/>
+      </w:pPr>
+      <w:r>
+        <w:rPr>
+          <w:rFonts w:ascii="Courier New" w:hAnsi="Courier New"/>
+          <w:color w:val="E2E8F0"/>
+          <w:sz w:val="16"/>
+        </w:rPr>
+        <w:t># 1. Same size for all dimensions</w:t>
+        <w:br/>
+        <w:t>arr = da.ones((10000, 12000), chunks=1000)</w:t>
+        <w:br/>
+        <w:br/>
+        <w:t># 2. Different size per dimension</w:t>
+        <w:br/>
+        <w:t>arr = da.ones((10000, 12000), chunks=(5000, 4000))</w:t>
+        <w:br/>
+        <w:br/>
+        <w:t># 3. Dict per dimension</w:t>
+        <w:br/>
+        <w:t>arr = da.ones((10000, 12000), chunks={0: 1000, 1: 2000})</w:t>
+        <w:br/>
+        <w:br/>
+        <w:t># 4. Fully explicit block sizes</w:t>
+        <w:br/>
+        <w:t>arr = da.ones((10000, 12000), chunks=((5000,5000),(4000,4000,4000,4000)))</w:t>
+        <w:br/>
+        <w:br/>
+        <w:t># Rechunk (EXPENSIVE!)</w:t>
+        <w:br/>
+        <w:t>arr.rechunk({0: -1, 1: 100})  # -1 = keep entire dim as one chunk</w:t>
+        <w:br/>
+        <w:t># WARNING: bad chunk choice → 86ms vs 7min 13s!</w:t>
       </w:r>
     </w:p>
     <w:p>
@@ -1026,7 +1131,76 @@
         <w:rPr>
           <w:sz w:val="18"/>
         </w:rPr>
-        <w:t>Chunk size:  100 MB – 1 GB per chunk recommended. Rechunking is expensive — choose upfront.</w:t>
+        <w:t>Chunk size guideline:  100 MB – 1 GB per chunk. Too small = task graph overhead. Too large = out-of-memory.</w:t>
+      </w:r>
+    </w:p>
+    <w:p>
+      <w:pPr>
+        <w:spacing w:before="200" w:after="40"/>
+      </w:pPr>
+      <w:r>
+        <w:rPr>
+          <w:b/>
+          <w:color w:val="2563EB"/>
+          <w:sz w:val="22"/>
+        </w:rPr>
+        <w:t>Dask Distributed Client &amp; persist()</w:t>
+      </w:r>
+    </w:p>
+    <w:p>
+      <w:pPr>
+        <w:spacing w:before="40" w:after="40"/>
+        <w:ind w:left="283"/>
+        <w:shd w:val="clear" w:color="auto" w:fill="1E293B"/>
+      </w:pPr>
+      <w:r>
+        <w:rPr>
+          <w:rFonts w:ascii="Courier New" w:hAnsi="Courier New"/>
+          <w:color w:val="E2E8F0"/>
+          <w:sz w:val="16"/>
+        </w:rPr>
+        <w:t>from dask.distributed import Client</w:t>
+        <w:br/>
+        <w:t>client = Client(n_workers=4)   # local cluster</w:t>
+        <w:br/>
+        <w:t># Dashboard: http://127.0.0.1:8787/status</w:t>
+        <w:br/>
+        <w:br/>
+        <w:t># persist() — cache intermediate result in distributed memory</w:t>
+        <w:br/>
+        <w:t>ddf_jfk = ddf[ddf['Origin'] == 'JFK']</w:t>
+        <w:br/>
+        <w:t>ddf_jfk = ddf_jfk.persist()   # stays in RAM for multiple downstream ops</w:t>
+      </w:r>
+    </w:p>
+    <w:p>
+      <w:pPr>
+        <w:spacing w:before="200" w:after="40"/>
+      </w:pPr>
+      <w:r>
+        <w:rPr>
+          <w:b/>
+          <w:color w:val="2563EB"/>
+          <w:sz w:val="22"/>
+        </w:rPr>
+        <w:t>Zarr — Chunked Array Storage</w:t>
+      </w:r>
+    </w:p>
+    <w:p>
+      <w:pPr>
+        <w:spacing w:before="40" w:after="40"/>
+        <w:ind w:left="283"/>
+        <w:shd w:val="clear" w:color="auto" w:fill="1E293B"/>
+      </w:pPr>
+      <w:r>
+        <w:rPr>
+          <w:rFonts w:ascii="Courier New" w:hAnsi="Courier New"/>
+          <w:color w:val="E2E8F0"/>
+          <w:sz w:val="16"/>
+        </w:rPr>
+        <w:t>arr.to_zarr('my_array.zarr')      # save to chunked binary format</w:t>
+        <w:br/>
+        <w:t>arr2 = da.from_zarr('my_array.zarr')  # load back</w:t>
       </w:r>
     </w:p>
     <w:p>
@@ -1046,6 +1220,272 @@
           <w:sz w:val="26"/>
         </w:rPr>
         <w:t xml:space="preserve">  L3 · Apache Spark — RDDs &amp; DataFrames  </w:t>
+      </w:r>
+    </w:p>
+    <w:p>
+      <w:pPr>
+        <w:spacing w:before="200" w:after="40"/>
+      </w:pPr>
+      <w:r>
+        <w:rPr>
+          <w:b/>
+          <w:color w:val="2563EB"/>
+          <w:sz w:val="22"/>
+        </w:rPr>
+        <w:t>RDD — Data Lineage &amp; Fault Tolerance</w:t>
+      </w:r>
+    </w:p>
+    <w:p>
+      <w:pPr>
+        <w:spacing w:before="40" w:after="40"/>
+        <w:ind w:left="283"/>
+        <w:shd w:val="clear" w:color="auto" w:fill="1E293B"/>
+      </w:pPr>
+      <w:r>
+        <w:rPr>
+          <w:rFonts w:ascii="Courier New" w:hAnsi="Courier New"/>
+          <w:color w:val="E2E8F0"/>
+          <w:sz w:val="16"/>
+        </w:rPr>
+        <w:t>Problem: a node fails mid-computation — how to recover?</w:t>
+        <w:br/>
+        <w:br/>
+        <w:t>RDD solution — Data Lineage:</w:t>
+        <w:br/>
+        <w:t xml:space="preserve">  Record OPERATIONS (not data) applied to each partition</w:t>
+        <w:br/>
+        <w:t xml:space="preserve">  Each RDD knows: "I was derived from parent X by operation F"</w:t>
+        <w:br/>
+        <w:t xml:space="preserve">  Recovery: re-run F on surviving partitions of X → rebuild lost partition</w:t>
+        <w:br/>
+        <w:t xml:space="preserve">  Cost: just replay operations; no expensive data replication needed</w:t>
+        <w:br/>
+        <w:br/>
+        <w:t>Immutability: cannot modify an RDD → always create a new one</w:t>
+        <w:br/>
+        <w:t xml:space="preserve">  Guarantees deterministic lineage (no side effects)</w:t>
+      </w:r>
+    </w:p>
+    <w:p>
+      <w:pPr>
+        <w:spacing w:before="200" w:after="40"/>
+      </w:pPr>
+      <w:r>
+        <w:rPr>
+          <w:b/>
+          <w:color w:val="2563EB"/>
+          <w:sz w:val="22"/>
+        </w:rPr>
+        <w:t>RDD Granularity of Data Flow</w:t>
+      </w:r>
+    </w:p>
+    <w:tbl>
+      <w:tblPr>
+        <w:tblStyle w:val="TableGrid"/>
+        <w:tblW w:type="auto" w:w="0"/>
+        <w:jc w:val="left"/>
+        <w:tblLook w:firstColumn="1" w:firstRow="1" w:lastColumn="0" w:lastRow="0" w:noHBand="0" w:noVBand="1" w:val="04A0"/>
+      </w:tblPr>
+      <w:tblGrid>
+        <w:gridCol w:w="3324"/>
+        <w:gridCol w:w="3324"/>
+        <w:gridCol w:w="3324"/>
+      </w:tblGrid>
+      <w:tr>
+        <w:tc>
+          <w:tcPr>
+            <w:tcW w:type="dxa" w:w="1701"/>
+            <w:shd w:val="clear" w:color="auto" w:fill="2563EB"/>
+          </w:tcPr>
+          <w:p>
+            <w:r>
+              <w:rPr>
+                <w:b/>
+                <w:color w:val="FFFFFF"/>
+                <w:sz w:val="17"/>
+              </w:rPr>
+              <w:t>Mode</w:t>
+            </w:r>
+          </w:p>
+        </w:tc>
+        <w:tc>
+          <w:tcPr>
+            <w:tcW w:type="dxa" w:w="3685"/>
+            <w:shd w:val="clear" w:color="auto" w:fill="2563EB"/>
+          </w:tcPr>
+          <w:p>
+            <w:r>
+              <w:rPr>
+                <w:b/>
+                <w:color w:val="FFFFFF"/>
+                <w:sz w:val="17"/>
+              </w:rPr>
+              <w:t>Description</w:t>
+            </w:r>
+          </w:p>
+        </w:tc>
+        <w:tc>
+          <w:tcPr>
+            <w:tcW w:type="dxa" w:w="3231"/>
+            <w:shd w:val="clear" w:color="auto" w:fill="2563EB"/>
+          </w:tcPr>
+          <w:p>
+            <w:r>
+              <w:rPr>
+                <w:b/>
+                <w:color w:val="FFFFFF"/>
+                <w:sz w:val="17"/>
+              </w:rPr>
+              <w:t>When to use</w:t>
+            </w:r>
+          </w:p>
+        </w:tc>
+      </w:tr>
+      <w:tr>
+        <w:tc>
+          <w:tcPr>
+            <w:tcW w:type="dxa" w:w="1701"/>
+          </w:tcPr>
+          <w:p>
+            <w:r>
+              <w:rPr>
+                <w:sz w:val="17"/>
+              </w:rPr>
+              <w:t>Whole Dataset</w:t>
+            </w:r>
+          </w:p>
+        </w:tc>
+        <w:tc>
+          <w:tcPr>
+            <w:tcW w:type="dxa" w:w="3685"/>
+          </w:tcPr>
+          <w:p>
+            <w:r>
+              <w:rPr>
+                <w:sz w:val="17"/>
+              </w:rPr>
+              <w:t>Entire dataset through one transformation at once</w:t>
+            </w:r>
+          </w:p>
+        </w:tc>
+        <w:tc>
+          <w:tcPr>
+            <w:tcW w:type="dxa" w:w="3231"/>
+          </w:tcPr>
+          <w:p>
+            <w:r>
+              <w:rPr>
+                <w:sz w:val="17"/>
+              </w:rPr>
+              <w:t>Small data that fits in memory</w:t>
+            </w:r>
+          </w:p>
+        </w:tc>
+      </w:tr>
+      <w:tr>
+        <w:tc>
+          <w:tcPr>
+            <w:tcW w:type="dxa" w:w="1701"/>
+            <w:shd w:val="clear" w:color="auto" w:fill="F8FAFC"/>
+          </w:tcPr>
+          <w:p>
+            <w:r>
+              <w:rPr>
+                <w:sz w:val="17"/>
+              </w:rPr>
+              <w:t>Row</w:t>
+            </w:r>
+          </w:p>
+        </w:tc>
+        <w:tc>
+          <w:tcPr>
+            <w:tcW w:type="dxa" w:w="3685"/>
+            <w:shd w:val="clear" w:color="auto" w:fill="F8FAFC"/>
+          </w:tcPr>
+          <w:p>
+            <w:r>
+              <w:rPr>
+                <w:sz w:val="17"/>
+              </w:rPr>
+              <w:t>Each row processed independently</w:t>
+            </w:r>
+          </w:p>
+        </w:tc>
+        <w:tc>
+          <w:tcPr>
+            <w:tcW w:type="dxa" w:w="3231"/>
+            <w:shd w:val="clear" w:color="auto" w:fill="F8FAFC"/>
+          </w:tcPr>
+          <w:p>
+            <w:r>
+              <w:rPr>
+                <w:sz w:val="17"/>
+              </w:rPr>
+              <w:t>Flexible but slow (high overhead per task)</w:t>
+            </w:r>
+          </w:p>
+        </w:tc>
+      </w:tr>
+      <w:tr>
+        <w:tc>
+          <w:tcPr>
+            <w:tcW w:type="dxa" w:w="1701"/>
+          </w:tcPr>
+          <w:p>
+            <w:r>
+              <w:rPr>
+                <w:sz w:val="17"/>
+              </w:rPr>
+              <w:t>Partition ✓</w:t>
+            </w:r>
+          </w:p>
+        </w:tc>
+        <w:tc>
+          <w:tcPr>
+            <w:tcW w:type="dxa" w:w="3685"/>
+          </w:tcPr>
+          <w:p>
+            <w:r>
+              <w:rPr>
+                <w:sz w:val="17"/>
+              </w:rPr>
+              <w:t>User-defined partition count; each worker handles one</w:t>
+            </w:r>
+          </w:p>
+        </w:tc>
+        <w:tc>
+          <w:tcPr>
+            <w:tcW w:type="dxa" w:w="3231"/>
+          </w:tcPr>
+          <w:p>
+            <w:r>
+              <w:rPr>
+                <w:sz w:val="17"/>
+              </w:rPr>
+              <w:t>Recommended — balances parallelism and overhead</w:t>
+            </w:r>
+          </w:p>
+        </w:tc>
+      </w:tr>
+    </w:tbl>
+    <w:p/>
+    <w:p>
+      <w:pPr>
+        <w:spacing w:before="40" w:after="40"/>
+        <w:ind w:left="283"/>
+        <w:shd w:val="clear" w:color="auto" w:fill="1E293B"/>
+      </w:pPr>
+      <w:r>
+        <w:rPr>
+          <w:rFonts w:ascii="Courier New" w:hAnsi="Courier New"/>
+          <w:color w:val="E2E8F0"/>
+          <w:sz w:val="16"/>
+        </w:rPr>
+        <w:t>rdd.getNumPartitions()    # check current partition count</w:t>
+        <w:br/>
+        <w:t>rdd.repartition(10)       # increase partitions (triggers shuffle)</w:t>
+        <w:br/>
+        <w:t>rdd.coalesce(2)           # reduce partitions (no shuffle)</w:t>
       </w:r>
     </w:p>
     <w:p>
@@ -1957,7 +2397,7 @@
               <w:rPr>
                 <w:sz w:val="17"/>
               </w:rPr>
-              <w:t>groupByKey()</w:t>
+              <w:t>flatMapValues(f)</w:t>
             </w:r>
           </w:p>
         </w:tc>
@@ -1971,7 +2411,7 @@
               <w:rPr>
                 <w:sz w:val="17"/>
               </w:rPr>
-              <w:t>Group values by key into iterable</w:t>
+              <w:t>Like mapValues but flattens list output into individual elements</w:t>
             </w:r>
           </w:p>
         </w:tc>
@@ -1985,7 +2425,7 @@
               <w:rPr>
                 <w:sz w:val="17"/>
               </w:rPr>
-              <w:t>[(a,1),(a,2)] → [(a,[1,2])]</w:t>
+              <w:t>[(a,[1,2])] → [(a,1),(a,2)]</w:t>
             </w:r>
           </w:p>
         </w:tc>
@@ -2000,7 +2440,7 @@
               <w:rPr>
                 <w:sz w:val="17"/>
               </w:rPr>
-              <w:t>join(rdd2)</w:t>
+              <w:t>groupByKey()</w:t>
             </w:r>
           </w:p>
         </w:tc>
@@ -2013,7 +2453,7 @@
               <w:rPr>
                 <w:sz w:val="17"/>
               </w:rPr>
-              <w:t>Inner join on key</w:t>
+              <w:t>Group values by key into iterable</w:t>
             </w:r>
           </w:p>
         </w:tc>
@@ -2026,7 +2466,7 @@
               <w:rPr>
                 <w:sz w:val="17"/>
               </w:rPr>
-              <w:t>[(3,a)] join [(3,b)] → [(3,(a,b))]</w:t>
+              <w:t>[(a,1),(a,2)] → [(a,[1,2])]</w:t>
             </w:r>
           </w:p>
         </w:tc>
@@ -2042,7 +2482,7 @@
               <w:rPr>
                 <w:sz w:val="17"/>
               </w:rPr>
-              <w:t>leftOuterJoin()</w:t>
+              <w:t>join(rdd2)</w:t>
             </w:r>
           </w:p>
         </w:tc>
@@ -2056,7 +2496,7 @@
               <w:rPr>
                 <w:sz w:val="17"/>
               </w:rPr>
-              <w:t>All keys from left; None for missing right</w:t>
+              <w:t>Inner join on key</w:t>
             </w:r>
           </w:p>
         </w:tc>
@@ -2070,7 +2510,7 @@
               <w:rPr>
                 <w:sz w:val="17"/>
               </w:rPr>
-              <w:t>[(1,a)] → [(1,(a,None))]</w:t>
+              <w:t>[(3,a)] join [(3,b)] → [(3,(a,b))]</w:t>
             </w:r>
           </w:p>
         </w:tc>
@@ -2085,7 +2525,7 @@
               <w:rPr>
                 <w:sz w:val="17"/>
               </w:rPr>
-              <w:t>subtractByKey()</w:t>
+              <w:t>leftOuterJoin()</w:t>
             </w:r>
           </w:p>
         </w:tc>
@@ -2098,7 +2538,7 @@
               <w:rPr>
                 <w:sz w:val="17"/>
               </w:rPr>
-              <w:t>Keys in left not in right</w:t>
+              <w:t>All keys from left; None for missing right</w:t>
             </w:r>
           </w:p>
         </w:tc>
@@ -2111,7 +2551,7 @@
               <w:rPr>
                 <w:sz w:val="17"/>
               </w:rPr>
-              <w:t>[(1,a),(3,b)] − [(3,c)] → [(1,a)]</w:t>
+              <w:t>[(1,a)] → [(1,(a,None))]</w:t>
             </w:r>
           </w:p>
         </w:tc>
@@ -2127,7 +2567,7 @@
               <w:rPr>
                 <w:sz w:val="17"/>
               </w:rPr>
-              <w:t>cartesian()</w:t>
+              <w:t>subtractByKey()</w:t>
             </w:r>
           </w:p>
         </w:tc>
@@ -2141,7 +2581,7 @@
               <w:rPr>
                 <w:sz w:val="17"/>
               </w:rPr>
-              <w:t>All pairs (A × B)</w:t>
+              <w:t>Keys in left not in right</w:t>
             </w:r>
           </w:p>
         </w:tc>
@@ -2155,7 +2595,7 @@
               <w:rPr>
                 <w:sz w:val="17"/>
               </w:rPr>
-              <w:t>[1,2]×[3] → [(1,3),(2,3)]</w:t>
+              <w:t>[(1,a),(3,b)] − [(3,c)] → [(1,a)]</w:t>
             </w:r>
           </w:p>
         </w:tc>
@@ -2170,7 +2610,7 @@
               <w:rPr>
                 <w:sz w:val="17"/>
               </w:rPr>
-              <w:t>union()</w:t>
+              <w:t>cartesian()</w:t>
             </w:r>
           </w:p>
         </w:tc>
@@ -2183,7 +2623,7 @@
               <w:rPr>
                 <w:sz w:val="17"/>
               </w:rPr>
-              <w:t>Combine all elements (keeps dupes)</w:t>
+              <w:t>All pairs (A × B)</w:t>
             </w:r>
           </w:p>
         </w:tc>
@@ -2196,7 +2636,7 @@
               <w:rPr>
                 <w:sz w:val="17"/>
               </w:rPr>
-              <w:t>[1,2]∪[3] → [1,2,3]</w:t>
+              <w:t>[1,2]×[3] → [(1,3),(2,3)]</w:t>
             </w:r>
           </w:p>
         </w:tc>
@@ -2212,7 +2652,7 @@
               <w:rPr>
                 <w:sz w:val="17"/>
               </w:rPr>
-              <w:t>intersection()</w:t>
+              <w:t>union()</w:t>
             </w:r>
           </w:p>
         </w:tc>
@@ -2226,7 +2666,7 @@
               <w:rPr>
                 <w:sz w:val="17"/>
               </w:rPr>
-              <w:t>Only shared elements</w:t>
+              <w:t>Combine all elements (keeps dupes)</w:t>
             </w:r>
           </w:p>
         </w:tc>
@@ -2240,7 +2680,7 @@
               <w:rPr>
                 <w:sz w:val="17"/>
               </w:rPr>
-              <w:t>[1,2,3]∩[2,3,4] → [2,3]</w:t>
+              <w:t>[1,2]∪[3] → [1,2,3]</w:t>
             </w:r>
           </w:p>
         </w:tc>
@@ -2255,7 +2695,7 @@
               <w:rPr>
                 <w:sz w:val="17"/>
               </w:rPr>
-              <w:t>distinct()</w:t>
+              <w:t>intersection()</w:t>
             </w:r>
           </w:p>
         </w:tc>
@@ -2268,7 +2708,7 @@
               <w:rPr>
                 <w:sz w:val="17"/>
               </w:rPr>
-              <w:t>Remove duplicates</w:t>
+              <w:t>Only shared elements</w:t>
             </w:r>
           </w:p>
         </w:tc>
@@ -2281,7 +2721,7 @@
               <w:rPr>
                 <w:sz w:val="17"/>
               </w:rPr>
-              <w:t>[1,1,2] → [1,2]</w:t>
+              <w:t>[1,2,3]∩[2,3,4] → [2,3]</w:t>
             </w:r>
           </w:p>
         </w:tc>
@@ -2297,7 +2737,7 @@
               <w:rPr>
                 <w:sz w:val="17"/>
               </w:rPr>
-              <w:t>sortBy(f)</w:t>
+              <w:t>distinct()</w:t>
             </w:r>
           </w:p>
         </w:tc>
@@ -2311,7 +2751,7 @@
               <w:rPr>
                 <w:sz w:val="17"/>
               </w:rPr>
-              <w:t>Sort by key function</w:t>
+              <w:t>Remove duplicates</w:t>
             </w:r>
           </w:p>
         </w:tc>
@@ -2325,7 +2765,7 @@
               <w:rPr>
                 <w:sz w:val="17"/>
               </w:rPr>
-              <w:t>sortBy value descending</w:t>
+              <w:t>[1,1,2] → [1,2]</w:t>
             </w:r>
           </w:p>
         </w:tc>
@@ -2340,7 +2780,7 @@
               <w:rPr>
                 <w:sz w:val="17"/>
               </w:rPr>
-              <w:t>randomSplit([w])</w:t>
+              <w:t>sortBy(f)</w:t>
             </w:r>
           </w:p>
         </w:tc>
@@ -2353,7 +2793,7 @@
               <w:rPr>
                 <w:sz w:val="17"/>
               </w:rPr>
-              <w:t>Split RDD by weights (e.g. train/test)</w:t>
+              <w:t>Sort by key function</w:t>
             </w:r>
           </w:p>
         </w:tc>
@@ -2366,7 +2806,7 @@
               <w:rPr>
                 <w:sz w:val="17"/>
               </w:rPr>
-              <w:t>[0.8, 0.2]</w:t>
+              <w:t>sortBy value descending</w:t>
             </w:r>
           </w:p>
         </w:tc>
@@ -2382,7 +2822,7 @@
               <w:rPr>
                 <w:sz w:val="17"/>
               </w:rPr>
-              <w:t>takeOrdered(n)</w:t>
+              <w:t>randomSplit([w])</w:t>
             </w:r>
           </w:p>
         </w:tc>
@@ -2396,7 +2836,7 @@
               <w:rPr>
                 <w:sz w:val="17"/>
               </w:rPr>
-              <w:t>Smallest n elements (or custom key)</w:t>
+              <w:t>Split RDD by weights (e.g. train/test)</w:t>
             </w:r>
           </w:p>
         </w:tc>
@@ -2410,7 +2850,7 @@
               <w:rPr>
                 <w:sz w:val="17"/>
               </w:rPr>
-              <w:t>[10,1,2,9] → [1,2]</w:t>
+              <w:t>[0.8, 0.2]</w:t>
             </w:r>
           </w:p>
         </w:tc>
@@ -2425,7 +2865,7 @@
               <w:rPr>
                 <w:sz w:val="17"/>
               </w:rPr>
-              <w:t>collect()</w:t>
+              <w:t>takeOrdered(n)</w:t>
             </w:r>
           </w:p>
         </w:tc>
@@ -2438,7 +2878,7 @@
               <w:rPr>
                 <w:sz w:val="17"/>
               </w:rPr>
-              <w:t>★ ACTION: return all as Python list</w:t>
+              <w:t>Smallest n elements (or custom key)</w:t>
             </w:r>
           </w:p>
         </w:tc>
@@ -2451,7 +2891,7 @@
               <w:rPr>
                 <w:sz w:val="17"/>
               </w:rPr>
-              <w:t>triggers computation</w:t>
+              <w:t>[10,1,2,9] → [1,2]</w:t>
             </w:r>
           </w:p>
         </w:tc>
@@ -2467,7 +2907,7 @@
               <w:rPr>
                 <w:sz w:val="17"/>
               </w:rPr>
-              <w:t>count()</w:t>
+              <w:t>collect()</w:t>
             </w:r>
           </w:p>
         </w:tc>
@@ -2481,7 +2921,7 @@
               <w:rPr>
                 <w:sz w:val="17"/>
               </w:rPr>
-              <w:t>★ ACTION: number of elements</w:t>
+              <w:t>★ ACTION: return all as Python list</w:t>
             </w:r>
           </w:p>
         </w:tc>
@@ -2495,7 +2935,7 @@
               <w:rPr>
                 <w:sz w:val="17"/>
               </w:rPr>
-              <w:t>3</w:t>
+              <w:t>triggers computation</w:t>
             </w:r>
           </w:p>
         </w:tc>
@@ -2510,7 +2950,7 @@
               <w:rPr>
                 <w:sz w:val="17"/>
               </w:rPr>
-              <w:t>first()</w:t>
+              <w:t>count()</w:t>
             </w:r>
           </w:p>
         </w:tc>
@@ -2523,7 +2963,7 @@
               <w:rPr>
                 <w:sz w:val="17"/>
               </w:rPr>
-              <w:t>★ ACTION: first element</w:t>
+              <w:t>★ ACTION: number of elements</w:t>
             </w:r>
           </w:p>
         </w:tc>
@@ -2536,7 +2976,7 @@
               <w:rPr>
                 <w:sz w:val="17"/>
               </w:rPr>
-              <w:t>21</w:t>
+              <w:t>3</w:t>
             </w:r>
           </w:p>
         </w:tc>
@@ -2552,7 +2992,7 @@
               <w:rPr>
                 <w:sz w:val="17"/>
               </w:rPr>
-              <w:t>take(n)</w:t>
+              <w:t>first()</w:t>
             </w:r>
           </w:p>
         </w:tc>
@@ -2566,7 +3006,7 @@
               <w:rPr>
                 <w:sz w:val="17"/>
               </w:rPr>
-              <w:t>★ ACTION: first n elements</w:t>
+              <w:t>★ ACTION: first element</w:t>
             </w:r>
           </w:p>
         </w:tc>
@@ -2574,6 +3014,47 @@
           <w:tcPr>
             <w:tcW w:type="dxa" w:w="3231"/>
             <w:shd w:val="clear" w:color="auto" w:fill="F8FAFC"/>
+          </w:tcPr>
+          <w:p>
+            <w:r>
+              <w:rPr>
+                <w:sz w:val="17"/>
+              </w:rPr>
+              <w:t>21</w:t>
+            </w:r>
+          </w:p>
+        </w:tc>
+      </w:tr>
+      <w:tr>
+        <w:tc>
+          <w:tcPr>
+            <w:tcW w:type="dxa" w:w="1984"/>
+          </w:tcPr>
+          <w:p>
+            <w:r>
+              <w:rPr>
+                <w:sz w:val="17"/>
+              </w:rPr>
+              <w:t>take(n)</w:t>
+            </w:r>
+          </w:p>
+        </w:tc>
+        <w:tc>
+          <w:tcPr>
+            <w:tcW w:type="dxa" w:w="3402"/>
+          </w:tcPr>
+          <w:p>
+            <w:r>
+              <w:rPr>
+                <w:sz w:val="17"/>
+              </w:rPr>
+              <w:t>★ ACTION: first n elements</w:t>
+            </w:r>
+          </w:p>
+        </w:tc>
+        <w:tc>
+          <w:tcPr>
+            <w:tcW w:type="dxa" w:w="3231"/>
           </w:tcPr>
           <w:p>
             <w:r>
@@ -3319,6 +3800,160 @@
           <w:color w:val="2563EB"/>
           <w:sz w:val="22"/>
         </w:rPr>
+        <w:t>map() vs mapValues() vs flatMapValues()</w:t>
+      </w:r>
+    </w:p>
+    <w:p>
+      <w:pPr>
+        <w:spacing w:before="40" w:after="40"/>
+        <w:ind w:left="283"/>
+        <w:shd w:val="clear" w:color="auto" w:fill="1E293B"/>
+      </w:pPr>
+      <w:r>
+        <w:rPr>
+          <w:rFonts w:ascii="Courier New" w:hAnsi="Courier New"/>
+          <w:color w:val="E2E8F0"/>
+          <w:sz w:val="16"/>
+        </w:rPr>
+        <w:t>rdd = sc.parallelize([('a',[1,2,3]),('b',[4,5])])</w:t>
+        <w:br/>
+        <w:br/>
+        <w:t># map() — applied to ENTIRE element (key + value)</w:t>
+        <w:br/>
+        <w:t>rdd.map(lambda x: (x[0], len(x[1]))).collect()</w:t>
+        <w:br/>
+        <w:t># [('a',3),('b',2)]</w:t>
+        <w:br/>
+        <w:br/>
+        <w:t># mapValues() — applied to VALUE only; key preserved</w:t>
+        <w:br/>
+        <w:t>rdd.mapValues(lambda v: sum(v)).collect()</w:t>
+        <w:br/>
+        <w:t># [('a',6),('b',9)]</w:t>
+        <w:br/>
+        <w:br/>
+        <w:t># flatMapValues() — like mapValues but FLATTENS the list output</w:t>
+        <w:br/>
+        <w:t>rdd.flatMapValues(lambda v: v).collect()</w:t>
+        <w:br/>
+        <w:t># [('a',1),('a',2),('a',3),('b',4),('b',5)]  each item becomes its own row</w:t>
+      </w:r>
+    </w:p>
+    <w:p>
+      <w:pPr>
+        <w:spacing w:before="200" w:after="40"/>
+      </w:pPr>
+      <w:r>
+        <w:rPr>
+          <w:b/>
+          <w:color w:val="2563EB"/>
+          <w:sz w:val="22"/>
+        </w:rPr>
+        <w:t>More DataFrame Patterns</w:t>
+      </w:r>
+    </w:p>
+    <w:p>
+      <w:pPr>
+        <w:spacing w:before="40" w:after="40"/>
+        <w:ind w:left="283"/>
+        <w:shd w:val="clear" w:color="auto" w:fill="1E293B"/>
+      </w:pPr>
+      <w:r>
+        <w:rPr>
+          <w:rFonts w:ascii="Courier New" w:hAnsi="Courier New"/>
+          <w:color w:val="E2E8F0"/>
+          <w:sz w:val="16"/>
+        </w:rPr>
+        <w:t># Create DataFrame from Python list</w:t>
+        <w:br/>
+        <w:t>data = [('Alice',30),('Bob',25)]</w:t>
+        <w:br/>
+        <w:t>df = spark.createDataFrame(data, ['name','age'])</w:t>
+        <w:br/>
+        <w:br/>
+        <w:t># Rename columns with toDF()</w:t>
+        <w:br/>
+        <w:t>rdd.toDF(['letter','number'])</w:t>
+        <w:br/>
+        <w:br/>
+        <w:t># Join two DataFrames</w:t>
+        <w:br/>
+        <w:t>df1.join(df2, 'id', 'inner').show()</w:t>
+        <w:br/>
+        <w:br/>
+        <w:t># Sort descending</w:t>
+        <w:br/>
+        <w:t>from pyspark.sql.functions import col, desc</w:t>
+        <w:br/>
+        <w:t>df.orderBy(col('price').desc(), col('id').desc()).show()</w:t>
+        <w:br/>
+        <w:br/>
+        <w:t># Unique values</w:t>
+        <w:br/>
+        <w:t>df.select('category').distinct().show()</w:t>
+        <w:br/>
+        <w:br/>
+        <w:t># DataFrame → RDD</w:t>
+        <w:br/>
+        <w:t>rdd = df.rdd</w:t>
+        <w:br/>
+        <w:t>rdd.map(lambda row: (row['name'], row['age'])).collect()</w:t>
+        <w:br/>
+        <w:br/>
+        <w:t># leftOuterJoin — handle None for missing values</w:t>
+        <w:br/>
+        <w:t>joined = rdd1.leftOuterJoin(rdd2)</w:t>
+        <w:br/>
+        <w:t>result = joined.map(lambda x: (x[0], x[1][0], x[1][1] or 'MISSING'))</w:t>
+      </w:r>
+    </w:p>
+    <w:p>
+      <w:pPr>
+        <w:spacing w:before="200" w:after="40"/>
+      </w:pPr>
+      <w:r>
+        <w:rPr>
+          <w:b/>
+          <w:color w:val="2563EB"/>
+          <w:sz w:val="22"/>
+        </w:rPr>
+        <w:t>Pandas — apply() &amp; reset_index()</w:t>
+      </w:r>
+    </w:p>
+    <w:p>
+      <w:pPr>
+        <w:spacing w:before="40" w:after="40"/>
+        <w:ind w:left="283"/>
+        <w:shd w:val="clear" w:color="auto" w:fill="1E293B"/>
+      </w:pPr>
+      <w:r>
+        <w:rPr>
+          <w:rFonts w:ascii="Courier New" w:hAnsi="Courier New"/>
+          <w:color w:val="E2E8F0"/>
+          <w:sz w:val="16"/>
+        </w:rPr>
+        <w:t># apply() row-wise function (axis=1)</w:t>
+        <w:br/>
+        <w:t>df['full_name'] = df.apply(lambda r: r['first']+' '+r['last'], axis=1)</w:t>
+        <w:br/>
+        <w:br/>
+        <w:t># reset_index() — convert grouped index back to column</w:t>
+        <w:br/>
+        <w:t>grouped = df.groupby('dept')['salary'].mean().reset_index()</w:t>
+        <w:br/>
+        <w:t># 'dept' is now a regular column</w:t>
+      </w:r>
+    </w:p>
+    <w:p>
+      <w:pPr>
+        <w:spacing w:before="200" w:after="40"/>
+      </w:pPr>
+      <w:r>
+        <w:rPr>
+          <w:b/>
+          <w:color w:val="2563EB"/>
+          <w:sz w:val="22"/>
+        </w:rPr>
         <w:t>Inverted Index (Take-Home Exercise)</w:t>
       </w:r>
     </w:p>
@@ -5787,9 +6422,199 @@
           <w:color w:val="2563EB"/>
           <w:sz w:val="22"/>
         </w:rPr>
-        <w:t>Byte Pair Encoding (BPE) — Subword Tokenization</w:t>
+        <w:t>Byte Pair Encoding (BPE) — Three-Phase Algorithm</w:t>
       </w:r>
     </w:p>
+    <w:tbl>
+      <w:tblPr>
+        <w:tblStyle w:val="TableGrid"/>
+        <w:tblW w:type="auto" w:w="0"/>
+        <w:jc w:val="left"/>
+        <w:tblLook w:firstColumn="1" w:firstRow="1" w:lastColumn="0" w:lastRow="0" w:noHBand="0" w:noVBand="1" w:val="04A0"/>
+      </w:tblPr>
+      <w:tblGrid>
+        <w:gridCol w:w="3324"/>
+        <w:gridCol w:w="3324"/>
+        <w:gridCol w:w="3324"/>
+      </w:tblGrid>
+      <w:tr>
+        <w:tc>
+          <w:tcPr>
+            <w:tcW w:type="dxa" w:w="2551"/>
+            <w:shd w:val="clear" w:color="auto" w:fill="2563EB"/>
+          </w:tcPr>
+          <w:p>
+            <w:r>
+              <w:rPr>
+                <w:b/>
+                <w:color w:val="FFFFFF"/>
+                <w:sz w:val="17"/>
+              </w:rPr>
+              <w:t>Component</w:t>
+            </w:r>
+          </w:p>
+        </w:tc>
+        <w:tc>
+          <w:tcPr>
+            <w:tcW w:type="dxa" w:w="3969"/>
+            <w:shd w:val="clear" w:color="auto" w:fill="2563EB"/>
+          </w:tcPr>
+          <w:p>
+            <w:r>
+              <w:rPr>
+                <w:b/>
+                <w:color w:val="FFFFFF"/>
+                <w:sz w:val="17"/>
+              </w:rPr>
+              <w:t>Role</w:t>
+            </w:r>
+          </w:p>
+        </w:tc>
+        <w:tc>
+          <w:tcPr>
+            <w:tcW w:type="dxa" w:w="2098"/>
+            <w:shd w:val="clear" w:color="auto" w:fill="2563EB"/>
+          </w:tcPr>
+          <w:p>
+            <w:r>
+              <w:rPr>
+                <w:b/>
+                <w:color w:val="FFFFFF"/>
+                <w:sz w:val="17"/>
+              </w:rPr>
+              <w:t>I/O</w:t>
+            </w:r>
+          </w:p>
+        </w:tc>
+      </w:tr>
+      <w:tr>
+        <w:tc>
+          <w:tcPr>
+            <w:tcW w:type="dxa" w:w="2551"/>
+          </w:tcPr>
+          <w:p>
+            <w:r>
+              <w:rPr>
+                <w:sz w:val="17"/>
+              </w:rPr>
+              <w:t>Token Learner</w:t>
+            </w:r>
+          </w:p>
+        </w:tc>
+        <w:tc>
+          <w:tcPr>
+            <w:tcW w:type="dxa" w:w="3969"/>
+          </w:tcPr>
+          <w:p>
+            <w:r>
+              <w:rPr>
+                <w:sz w:val="17"/>
+              </w:rPr>
+              <w:t>Processes corpus; finds most frequent adjacent pairs; builds merge rules + vocab</w:t>
+            </w:r>
+          </w:p>
+        </w:tc>
+        <w:tc>
+          <w:tcPr>
+            <w:tcW w:type="dxa" w:w="2098"/>
+          </w:tcPr>
+          <w:p>
+            <w:r>
+              <w:rPr>
+                <w:sz w:val="17"/>
+              </w:rPr>
+              <w:t>Raw text → merge rules</w:t>
+            </w:r>
+          </w:p>
+        </w:tc>
+      </w:tr>
+      <w:tr>
+        <w:tc>
+          <w:tcPr>
+            <w:tcW w:type="dxa" w:w="2551"/>
+            <w:shd w:val="clear" w:color="auto" w:fill="F8FAFC"/>
+          </w:tcPr>
+          <w:p>
+            <w:r>
+              <w:rPr>
+                <w:sz w:val="17"/>
+              </w:rPr>
+              <w:t>Token Segmenter/Encoder</w:t>
+            </w:r>
+          </w:p>
+        </w:tc>
+        <w:tc>
+          <w:tcPr>
+            <w:tcW w:type="dxa" w:w="3969"/>
+            <w:shd w:val="clear" w:color="auto" w:fill="F8FAFC"/>
+          </w:tcPr>
+          <w:p>
+            <w:r>
+              <w:rPr>
+                <w:sz w:val="17"/>
+              </w:rPr>
+              <w:t>Applies learned merge rules to encode new sentences</w:t>
+            </w:r>
+          </w:p>
+        </w:tc>
+        <w:tc>
+          <w:tcPr>
+            <w:tcW w:type="dxa" w:w="2098"/>
+            <w:shd w:val="clear" w:color="auto" w:fill="F8FAFC"/>
+          </w:tcPr>
+          <w:p>
+            <w:r>
+              <w:rPr>
+                <w:sz w:val="17"/>
+              </w:rPr>
+              <w:t>New text → token IDs</w:t>
+            </w:r>
+          </w:p>
+        </w:tc>
+      </w:tr>
+      <w:tr>
+        <w:tc>
+          <w:tcPr>
+            <w:tcW w:type="dxa" w:w="2551"/>
+          </w:tcPr>
+          <w:p>
+            <w:r>
+              <w:rPr>
+                <w:sz w:val="17"/>
+              </w:rPr>
+              <w:t>Token Merger/Decoder</w:t>
+            </w:r>
+          </w:p>
+        </w:tc>
+        <w:tc>
+          <w:tcPr>
+            <w:tcW w:type="dxa" w:w="3969"/>
+          </w:tcPr>
+          <w:p>
+            <w:r>
+              <w:rPr>
+                <w:sz w:val="17"/>
+              </w:rPr>
+              <w:t>Reverses encoding back to readable text</w:t>
+            </w:r>
+          </w:p>
+        </w:tc>
+        <w:tc>
+          <w:tcPr>
+            <w:tcW w:type="dxa" w:w="2098"/>
+          </w:tcPr>
+          <w:p>
+            <w:r>
+              <w:rPr>
+                <w:sz w:val="17"/>
+              </w:rPr>
+              <w:t>Token IDs → text</w:t>
+            </w:r>
+          </w:p>
+        </w:tc>
+      </w:tr>
+    </w:tbl>
+    <w:p/>
     <w:p>
       <w:pPr>
         <w:pStyle w:val="ListBullet"/>
@@ -5800,7 +6625,7 @@
         <w:rPr>
           <w:sz w:val="19"/>
         </w:rPr>
-        <w:t>1. Split all words into individual characters</w:t>
+        <w:t>1. Split all words into characters + Ġ (end-of-word boundary marker)</w:t>
       </w:r>
     </w:p>
     <w:p>
@@ -5839,32 +6664,50 @@
         <w:rPr>
           <w:sz w:val="19"/>
         </w:rPr>
-        <w:t>4. Repeat until desired vocabulary size (or no more frequent pairs)</w:t>
+        <w:t>4. Repeat until desired vocabulary size</w:t>
       </w:r>
     </w:p>
     <w:p>
       <w:pPr>
-        <w:pStyle w:val="ListBullet"/>
-        <w:spacing w:before="20" w:after="20"/>
-        <w:ind w:left="283"/>
+        <w:spacing w:before="120" w:after="20"/>
       </w:pPr>
       <w:r>
         <w:rPr>
-          <w:sz w:val="19"/>
+          <w:b/>
+          <w:color w:val="7C3AED"/>
+          <w:sz w:val="20"/>
         </w:rPr>
-        <w:t>5. Token Segmenter uses vocab to encode new sentences; Token Merger decodes back</w:t>
+        <w:t>BPE Worked Example</w:t>
       </w:r>
     </w:p>
     <w:p>
       <w:pPr>
-        <w:spacing w:before="20" w:after="20"/>
-        <w:ind w:left="0"/>
+        <w:spacing w:before="40" w:after="40"/>
+        <w:ind w:left="283"/>
+        <w:shd w:val="clear" w:color="auto" w:fill="1E293B"/>
       </w:pPr>
       <w:r>
         <w:rPr>
-          <w:sz w:val="19"/>
+          <w:rFonts w:ascii="Courier New" w:hAnsi="Courier New"/>
+          <w:color w:val="E2E8F0"/>
+          <w:sz w:val="16"/>
         </w:rPr>
-        <w:t>Handles rare/OOV words gracefully. Used in GPT, BERT.</w:t>
+        <w:t>Corpus: hug(x10), pug(x5), pun(x12), bun(x4), hugs(x5)</w:t>
+        <w:br/>
+        <w:br/>
+        <w:t>Initial tokens: [Ġ,h,u,g] [Ġ,p,u,g] [Ġ,p,u,n] [Ġ,b,u,n] [Ġ,h,u,g,s]</w:t>
+        <w:br/>
+        <w:br/>
+        <w:t>Most frequent pair: (u,g) = 20 times → Merge: ug</w:t>
+        <w:br/>
+        <w:t>Next: (Ġ,h) = 15 times → Merge: Ġh</w:t>
+        <w:br/>
+        <w:t>Next: (Ġh,ug) = 15 times → Merge: Ġhug</w:t>
+        <w:br/>
+        <w:br/>
+        <w:t>Final: "hug" → token_id=7   "pun" → [Ġp,u,n] = [9,3,5]</w:t>
+        <w:br/>
+        <w:t>OOV never happens — unknown words split into known subword tokens</w:t>
       </w:r>
     </w:p>
     <w:p>
@@ -7617,7 +8460,7 @@
           <w:color w:val="2563EB"/>
           <w:sz w:val="22"/>
         </w:rPr>
-        <w:t>Skip-gram Assumptions</w:t>
+        <w:t>Skip-gram — Three Formal Assumptions</w:t>
       </w:r>
     </w:p>
     <w:p>
@@ -7630,7 +8473,7 @@
         <w:rPr>
           <w:sz w:val="19"/>
         </w:rPr>
-        <w:t>Window independence: each context word predicted independently given center word</w:t>
+        <w:t>1. i.i.d. windows: each context window is independent; objective sums log-probs across all windows</w:t>
       </w:r>
     </w:p>
     <w:p>
@@ -7643,7 +8486,77 @@
         <w:rPr>
           <w:sz w:val="19"/>
         </w:rPr>
-        <w:t>Position independence: word order within window does not matter</w:t>
+        <w:t>2. Conditional independence: context words predicted independently given center word — P(o1,o2…|c) = ∏ P(oi|c)</w:t>
+      </w:r>
+    </w:p>
+    <w:p>
+      <w:pPr>
+        <w:pStyle w:val="ListBullet"/>
+        <w:spacing w:before="20" w:after="20"/>
+        <w:ind w:left="283"/>
+      </w:pPr>
+      <w:r>
+        <w:rPr>
+          <w:sz w:val="19"/>
+        </w:rPr>
+        <w:t>3. Position independence: word order / distance within window ignored — same prediction 1 or m steps away</w:t>
+      </w:r>
+    </w:p>
+    <w:p>
+      <w:pPr>
+        <w:ind w:left="170"/>
+        <w:shd w:val="clear" w:color="auto" w:fill="FEF3C7"/>
+      </w:pPr>
+      <w:r>
+        <w:rPr>
+          <w:sz w:val="18"/>
+        </w:rPr>
+        <w:t>Note:  These assumptions are linguistically wrong but make optimization tractable — and embeddings are still very good.</w:t>
+      </w:r>
+    </w:p>
+    <w:p>
+      <w:pPr>
+        <w:spacing w:before="200" w:after="40"/>
+      </w:pPr>
+      <w:r>
+        <w:rPr>
+          <w:b/>
+          <w:color w:val="2563EB"/>
+          <w:sz w:val="22"/>
+        </w:rPr>
+        <w:t>CBOW — Numerical Example</w:t>
+      </w:r>
+    </w:p>
+    <w:p>
+      <w:pPr>
+        <w:spacing w:before="40" w:after="40"/>
+        <w:ind w:left="283"/>
+        <w:shd w:val="clear" w:color="auto" w:fill="1E293B"/>
+      </w:pPr>
+      <w:r>
+        <w:rPr>
+          <w:rFonts w:ascii="Courier New" w:hAnsi="Courier New"/>
+          <w:color w:val="E2E8F0"/>
+          <w:sz w:val="16"/>
+        </w:rPr>
+        <w:t>Vocab: {cat=0, sit=1, on=2, mats=3}   Center word = "on"</w:t>
+        <w:br/>
+        <w:t>Context: sit(1), mats(3)   window=1</w:t>
+        <w:br/>
+        <w:br/>
+        <w:t>One-hot: v_sit=[0,1,0,0]  v_mats=[0,0,0,1]</w:t>
+        <w:br/>
+        <w:t>Embedding lookup: e_sit=[0.2,-0.1,0.5]  e_mats=[-0.3,0.4,0.1]</w:t>
+        <w:br/>
+        <w:t>Mean pooling: x = (e_sit+e_mats)/2 = [-0.05, 0.15, 0.3]</w:t>
+        <w:br/>
+        <w:t>Output logits = U·x → [0.1, 0.8, 0.3, -0.2]</w:t>
+        <w:br/>
+        <w:t>Softmax → P = [0.18, 0.36, 0.22, 0.13]</w:t>
+        <w:br/>
+        <w:t xml:space="preserve">               cat   sit   on   mats</w:t>
+        <w:br/>
+        <w:t>Predicted: "sit" (wrong) → compute loss → backprop → update W, U</w:t>
       </w:r>
     </w:p>
     <w:p>
@@ -8374,6 +9287,131 @@
         <w:t xml:space="preserve">      lambda r: beta*r + (1-beta)/N</w:t>
         <w:br/>
         <w:t xml:space="preserve">  )</w:t>
+      </w:r>
+    </w:p>
+    <w:p>
+      <w:pPr>
+        <w:spacing w:before="200" w:after="40"/>
+      </w:pPr>
+      <w:r>
+        <w:rPr>
+          <w:b/>
+          <w:color w:val="2563EB"/>
+          <w:sz w:val="22"/>
+        </w:rPr>
+        <w:t>Spider Trap — Numerical Example</w:t>
+      </w:r>
+    </w:p>
+    <w:p>
+      <w:pPr>
+        <w:spacing w:before="40" w:after="40"/>
+        <w:ind w:left="283"/>
+        <w:shd w:val="clear" w:color="auto" w:fill="1E293B"/>
+      </w:pPr>
+      <w:r>
+        <w:rPr>
+          <w:rFonts w:ascii="Courier New" w:hAnsi="Courier New"/>
+          <w:color w:val="E2E8F0"/>
+          <w:sz w:val="16"/>
+        </w:rPr>
+        <w:t>Graph: A→B, B→A, B→m, m→m   (m links only to itself)</w:t>
+        <w:br/>
+        <w:t>Start: r = [1/3, 1/3, 1/3]</w:t>
+        <w:br/>
+        <w:br/>
+        <w:t>Iter 1: r_A=1/6, r_B=1/3, r_m=1/2</w:t>
+        <w:br/>
+        <w:t>Iter 2: r_A=1/6, r_B=1/6, r_m=2/3</w:t>
+        <w:br/>
+        <w:t>Converges to: r = [0, 0, 1]   ALL rank absorbed by trap!</w:t>
+        <w:br/>
+        <w:br/>
+        <w:t>Fix: teleport with β=0.85 — surfer occasionally escapes</w:t>
+      </w:r>
+    </w:p>
+    <w:p>
+      <w:pPr>
+        <w:spacing w:before="200" w:after="40"/>
+      </w:pPr>
+      <w:r>
+        <w:rPr>
+          <w:b/>
+          <w:color w:val="2563EB"/>
+          <w:sz w:val="22"/>
+        </w:rPr>
+        <w:t>Dead End — Numerical Example</w:t>
+      </w:r>
+    </w:p>
+    <w:p>
+      <w:pPr>
+        <w:spacing w:before="40" w:after="40"/>
+        <w:ind w:left="283"/>
+        <w:shd w:val="clear" w:color="auto" w:fill="1E293B"/>
+      </w:pPr>
+      <w:r>
+        <w:rPr>
+          <w:rFonts w:ascii="Courier New" w:hAnsi="Courier New"/>
+          <w:color w:val="E2E8F0"/>
+          <w:sz w:val="16"/>
+        </w:rPr>
+        <w:t>Graph: A→B, B→C, C→∅   (C has no outgoing links)</w:t>
+        <w:br/>
+        <w:t>Start: r = [1/3, 1/3, 1/3]</w:t>
+        <w:br/>
+        <w:br/>
+        <w:t>Iter 1: r = [0, 1/3, 1/3]   sum=2/3 — rank leaked!</w:t>
+        <w:br/>
+        <w:t>Iter 2: r = [0, 0, 1/3]</w:t>
+        <w:br/>
+        <w:t>Converges to: r = [0, 0, 0]   rank disappears entirely!</w:t>
+        <w:br/>
+        <w:br/>
+        <w:t>Fix: treat dead-end as teleporting to all N pages uniformly</w:t>
+      </w:r>
+    </w:p>
+    <w:p>
+      <w:pPr>
+        <w:spacing w:before="200" w:after="40"/>
+      </w:pPr>
+      <w:r>
+        <w:rPr>
+          <w:b/>
+          <w:color w:val="2563EB"/>
+          <w:sz w:val="22"/>
+        </w:rPr>
+        <w:t>Convergence — Numerical Trace (β=0.8)</w:t>
+      </w:r>
+    </w:p>
+    <w:p>
+      <w:pPr>
+        <w:spacing w:before="40" w:after="40"/>
+        <w:ind w:left="283"/>
+        <w:shd w:val="clear" w:color="auto" w:fill="1E293B"/>
+      </w:pPr>
+      <w:r>
+        <w:rPr>
+          <w:rFonts w:ascii="Courier New" w:hAnsi="Courier New"/>
+          <w:color w:val="E2E8F0"/>
+          <w:sz w:val="16"/>
+        </w:rPr>
+        <w:t>Graph: A→B, A→C, B→C, C→A</w:t>
+        <w:br/>
+        <w:t>Google Matrix A = 0.8·M + 0.2·[1/3]</w:t>
+        <w:br/>
+        <w:br/>
+        <w:t>Iter 0: r = [0.333, 0.333, 0.333]</w:t>
+        <w:br/>
+        <w:t>Iter 1: r = [0.333, 0.200, 0.467]</w:t>
+        <w:br/>
+        <w:t>Iter 2: r = [0.440, 0.194, 0.367]</w:t>
+        <w:br/>
+        <w:t>Iter 3: r = [0.360, 0.230, 0.410]</w:t>
+        <w:br/>
+        <w:t>...</w:t>
+        <w:br/>
+        <w:t>Converged: r ≈ [7/33, 5/33, 21/33] = [0.212, 0.152, 0.636]</w:t>
+        <w:br/>
+        <w:t>C has highest rank — receives links from both A and B</w:t>
       </w:r>
     </w:p>
     <w:p>
@@ -14590,6 +15628,300 @@
         <w:t>doc_freq = tokenized.flatMapValues(lambda x: x).distinct()\</w:t>
         <w:br/>
         <w:t xml:space="preserve">                    .map(lambda x:(x[1],x[0])).countByKey()</w:t>
+      </w:r>
+    </w:p>
+    <w:p>
+      <w:pPr>
+        <w:spacing w:before="200" w:after="40"/>
+      </w:pPr>
+      <w:r>
+        <w:rPr>
+          <w:b/>
+          <w:color w:val="2563EB"/>
+          <w:sz w:val="22"/>
+        </w:rPr>
+        <w:t>Sparse Vector Operations (CountVectorizer output)</w:t>
+      </w:r>
+    </w:p>
+    <w:p>
+      <w:pPr>
+        <w:spacing w:before="40" w:after="40"/>
+        <w:ind w:left="283"/>
+        <w:shd w:val="clear" w:color="auto" w:fill="1E293B"/>
+      </w:pPr>
+      <w:r>
+        <w:rPr>
+          <w:rFonts w:ascii="Courier New" w:hAnsi="Courier New"/>
+          <w:color w:val="E2E8F0"/>
+          <w:sz w:val="16"/>
+        </w:rPr>
+        <w:t># SparseVector format: (vocabSize, [indices], [values])</w:t>
+        <w:br/>
+        <w:t># e.g. SparseVector(5, [0,2], [1.0,2.0]) = word0 once, word2 twice</w:t>
+        <w:br/>
+        <w:t>vec.toArray()     # [1.0, 0.0, 2.0, 0.0, 0.0]</w:t>
+        <w:br/>
+        <w:t>vec.indices       # [0, 2]</w:t>
+        <w:br/>
+        <w:br/>
+        <w:t># UDF to map index → term using vocabulary</w:t>
+        <w:br/>
+        <w:t>def terms_idx2term(vocab):</w:t>
+        <w:br/>
+        <w:t xml:space="preserve">    def f(indices): return [vocab[i] for i in indices]</w:t>
+        <w:br/>
+        <w:t xml:space="preserve">    return udf(f, ArrayType(StringType()))</w:t>
+        <w:br/>
+        <w:t>df.withColumn('terms', terms_idx2term(cv_model.vocabulary)(df['indices']))</w:t>
+      </w:r>
+    </w:p>
+    <w:p>
+      <w:pPr>
+        <w:spacing w:before="200" w:after="40"/>
+      </w:pPr>
+      <w:r>
+        <w:rPr>
+          <w:b/>
+          <w:color w:val="2563EB"/>
+          <w:sz w:val="22"/>
+        </w:rPr>
+        <w:t>UDF with Complex Return Type</w:t>
+      </w:r>
+    </w:p>
+    <w:p>
+      <w:pPr>
+        <w:spacing w:before="40" w:after="40"/>
+        <w:ind w:left="283"/>
+        <w:shd w:val="clear" w:color="auto" w:fill="1E293B"/>
+      </w:pPr>
+      <w:r>
+        <w:rPr>
+          <w:rFonts w:ascii="Courier New" w:hAnsi="Courier New"/>
+          <w:color w:val="E2E8F0"/>
+          <w:sz w:val="16"/>
+        </w:rPr>
+        <w:t>from pyspark.sql.types import ArrayType, StructType, StructField, StringType</w:t>
+        <w:br/>
+        <w:t>import nltk</w:t>
+        <w:br/>
+        <w:br/>
+        <w:t>pos_schema = ArrayType(StructType([</w:t>
+        <w:br/>
+        <w:t xml:space="preserve">    StructField("word", StringType()),</w:t>
+        <w:br/>
+        <w:t xml:space="preserve">    StructField("tag",  StringType())</w:t>
+        <w:br/>
+        <w:t>]))</w:t>
+        <w:br/>
+        <w:br/>
+        <w:t>@udf(pos_schema)</w:t>
+        <w:br/>
+        <w:t>def pos_tag_udf(words):</w:t>
+        <w:br/>
+        <w:t xml:space="preserve">    return [{"word":w,"tag":t} for w,t in nltk.pos_tag(words)]</w:t>
+        <w:br/>
+        <w:br/>
+        <w:t>df.withColumn("pos_tags", pos_tag_udf(df["words"]))</w:t>
+      </w:r>
+    </w:p>
+    <w:p>
+      <w:pPr>
+        <w:spacing w:before="200" w:after="40"/>
+      </w:pPr>
+      <w:r>
+        <w:rPr>
+          <w:b/>
+          <w:color w:val="2563EB"/>
+          <w:sz w:val="22"/>
+        </w:rPr>
+        <w:t>Manual TF-IDF via RDD</w:t>
+      </w:r>
+    </w:p>
+    <w:p>
+      <w:pPr>
+        <w:spacing w:before="40" w:after="40"/>
+        <w:ind w:left="283"/>
+        <w:shd w:val="clear" w:color="auto" w:fill="1E293B"/>
+      </w:pPr>
+      <w:r>
+        <w:rPr>
+          <w:rFonts w:ascii="Courier New" w:hAnsi="Courier New"/>
+          <w:color w:val="E2E8F0"/>
+          <w:sz w:val="16"/>
+        </w:rPr>
+        <w:t># Tokenize: (doc_id, [word1, word2, ...])</w:t>
+        <w:br/>
+        <w:t>tokenized = data.rdd.map(lambda r: (r.doc_id, r.text.lower().split()))</w:t>
+        <w:br/>
+        <w:br/>
+        <w:t># TF: count occurrences of each (doc, word) pair</w:t>
+        <w:br/>
+        <w:t>tf = tokenized.flatMapValues(lambda w: w).countByValue()</w:t>
+        <w:br/>
+        <w:t># {(doc_id, word): count}</w:t>
+        <w:br/>
+        <w:br/>
+        <w:t># DF: how many docs contain each word</w:t>
+        <w:br/>
+        <w:t>df_cnt = tokenized.flatMapValues(lambda w: set(w))\</w:t>
+        <w:br/>
+        <w:t xml:space="preserve">                  .map(lambda x: (x[1],x[0])).countByKey()</w:t>
+        <w:br/>
+        <w:t># {word: num_docs}</w:t>
+        <w:br/>
+        <w:br/>
+        <w:t># TF-IDF = TF * log((N+1)/(DF+1))</w:t>
+        <w:br/>
+        <w:t>import math</w:t>
+        <w:br/>
+        <w:t>N = tokenized.count()</w:t>
+        <w:br/>
+        <w:t>tfidf = {(doc,w): cnt * math.log((N+1)/(df_cnt[w]+1))</w:t>
+        <w:br/>
+        <w:t xml:space="preserve">         for (doc,w),cnt in tf.items()}</w:t>
+      </w:r>
+    </w:p>
+    <w:p>
+      <w:pPr>
+        <w:spacing w:before="200" w:after="40"/>
+      </w:pPr>
+      <w:r>
+        <w:rPr>
+          <w:b/>
+          <w:color w:val="2563EB"/>
+          <w:sz w:val="22"/>
+        </w:rPr>
+        <w:t>Word2Vec — Nearest Words (Cosine Similarity)</w:t>
+      </w:r>
+    </w:p>
+    <w:p>
+      <w:pPr>
+        <w:spacing w:before="40" w:after="40"/>
+        <w:ind w:left="283"/>
+        <w:shd w:val="clear" w:color="auto" w:fill="1E293B"/>
+      </w:pPr>
+      <w:r>
+        <w:rPr>
+          <w:rFonts w:ascii="Courier New" w:hAnsi="Courier New"/>
+          <w:color w:val="E2E8F0"/>
+          <w:sz w:val="16"/>
+        </w:rPr>
+        <w:t>import numpy as np</w:t>
+        <w:br/>
+        <w:br/>
+        <w:t># Extract embedding matrix after training</w:t>
+        <w:br/>
+        <w:t>W = model.layers[0].get_weights()[0]  # (vocab_size, embed_dim)</w:t>
+        <w:br/>
+        <w:br/>
+        <w:t># L2-normalize for cosine similarity</w:t>
+        <w:br/>
+        <w:t>W_norm = W / (np.linalg.norm(W, axis=1, keepdims=True) + 1e-8)</w:t>
+        <w:br/>
+        <w:br/>
+        <w:t># Pre-compute similarity matrix</w:t>
+        <w:br/>
+        <w:t>sim_matrix = np.dot(W_norm, W_norm.T)  # (vocab_size, vocab_size)</w:t>
+        <w:br/>
+        <w:br/>
+        <w:t>def nearest_words(word, w2i, i2w, k=5):</w:t>
+        <w:br/>
+        <w:t xml:space="preserve">    idx = w2i[word]</w:t>
+        <w:br/>
+        <w:t xml:space="preserve">    sims = sim_matrix[idx]</w:t>
+        <w:br/>
+        <w:t xml:space="preserve">    top_k = np.argsort(sims)[::-1][1:k+1]</w:t>
+        <w:br/>
+        <w:t xml:space="preserve">    return [(i2w[i], sims[i]) for i in top_k]</w:t>
+        <w:br/>
+        <w:br/>
+        <w:t>def compare_words(w1, w2, w2i):</w:t>
+        <w:br/>
+        <w:t xml:space="preserve">    return float(np.dot(W_norm[w2i[w1]], W_norm[w2i[w2]]))</w:t>
+        <w:br/>
+        <w:br/>
+        <w:t># Analogy: king - man + woman ≈ queen</w:t>
+        <w:br/>
+        <w:t>v = W_norm[w2i['king']] - W_norm[w2i['man']] + W_norm[w2i['woman']]</w:t>
+        <w:br/>
+        <w:t>print(i2w[np.argmax(np.dot(W_norm, v))])</w:t>
+      </w:r>
+    </w:p>
+    <w:p>
+      <w:pPr>
+        <w:spacing w:before="200" w:after="40"/>
+      </w:pPr>
+      <w:r>
+        <w:rPr>
+          <w:b/>
+          <w:color w:val="2563EB"/>
+          <w:sz w:val="22"/>
+        </w:rPr>
+        <w:t>NetworkX — Graph Construction Exercises</w:t>
+      </w:r>
+    </w:p>
+    <w:p>
+      <w:pPr>
+        <w:spacing w:before="40" w:after="40"/>
+        <w:ind w:left="283"/>
+        <w:shd w:val="clear" w:color="auto" w:fill="1E293B"/>
+      </w:pPr>
+      <w:r>
+        <w:rPr>
+          <w:rFonts w:ascii="Courier New" w:hAnsi="Courier New"/>
+          <w:color w:val="E2E8F0"/>
+          <w:sz w:val="16"/>
+        </w:rPr>
+        <w:t>import networkx as nx</w:t>
+        <w:br/>
+        <w:br/>
+        <w:t># Star graph: hub at 0, spokes 1-7</w:t>
+        <w:br/>
+        <w:t>g8 = nx.Graph()</w:t>
+        <w:br/>
+        <w:t>for i in range(1,8): g8.add_edge(0, i)</w:t>
+        <w:br/>
+        <w:br/>
+        <w:t># Circle (ring) graph</w:t>
+        <w:br/>
+        <w:t>g9 = nx.cycle_graph(9)</w:t>
+        <w:br/>
+        <w:br/>
+        <w:t># Complete graph (every pair connected)</w:t>
+        <w:br/>
+        <w:t>g10 = nx.complete_graph(10)</w:t>
+        <w:br/>
+        <w:br/>
+        <w:t># Linear chain</w:t>
+        <w:br/>
+        <w:t>g11 = nx.path_graph(11)</w:t>
+        <w:br/>
+        <w:br/>
+        <w:t># Graph metric functions</w:t>
+        <w:br/>
+        <w:t>def avg_degree(g):   return 2*g.number_of_edges() / g.number_of_nodes()</w:t>
+        <w:br/>
+        <w:t>def get_density(g):  N=g.number_of_nodes(); return 2*g.number_of_edges()/(N*(N-1))</w:t>
+        <w:br/>
+        <w:br/>
+        <w:t># Draw with centrality-scaled node sizes</w:t>
+        <w:br/>
+        <w:t>def draw_network(G, centrality):</w:t>
+        <w:br/>
+        <w:t xml:space="preserve">    import matplotlib.pyplot as plt</w:t>
+        <w:br/>
+        <w:t xml:space="preserve">    pos = nx.spring_layout(G)</w:t>
+        <w:br/>
+        <w:t xml:space="preserve">    sizes = [v**2*10000 if v&lt;1 else v*100 for v in centrality.values()]</w:t>
+        <w:br/>
+        <w:t xml:space="preserve">    nx.draw(G, pos, node_size=sizes, with_labels=True)</w:t>
+        <w:br/>
+        <w:t xml:space="preserve">    plt.show()</w:t>
+        <w:br/>
+        <w:br/>
+        <w:t># Average (global) clustering coefficient</w:t>
+        <w:br/>
+        <w:t>nx.average_clustering(g9)</w:t>
       </w:r>
     </w:p>
     <w:p>

</xml_diff>

<commit_message>
Add Exam Format section from Dr. Fong's Apr 11 lecture transcript
Extracts all exam tips from the lecture recording into a new pinned
section: confirmed exam structure (22 MCQ + 10% programming), topic-by-
topic scope table (what's in long Q vs MCQ-only vs excluded), common
orientation mistakes warned about (Levenshtein/PageRank matrix), BPE
exam format, MapReduce 3-stage trace, programming skeleton guidance.

Edge betweenness and word embedding math confirmed out of scope.

Co-Authored-By: Claude Sonnet 4.6 <noreply@anthropic.com>
</commit_message>
<xml_diff>
--- a/DSAI4205_Exam_Review.docx
+++ b/DSAI4205_Exam_Review.docx
@@ -2695,6 +2695,151 @@
           <w:sz w:val="20"/>
         </w:rPr>
         <w:t>Text Preprocessing Checklist</w:t>
+      </w:r>
+    </w:p>
+    <w:p>
+      <w:pPr>
+        <w:ind w:left="0"/>
+      </w:pPr>
+      <w:r>
+        <w:rPr>
+          <w:b/>
+          <w:color w:val="2563EB"/>
+          <w:sz w:val="20"/>
+        </w:rPr>
+        <w:t>Exam Format &amp; Dr. Fong's Tips (Apr 11 Lecture)</w:t>
+      </w:r>
+    </w:p>
+    <w:p>
+      <w:pPr>
+        <w:ind w:left="283"/>
+      </w:pPr>
+      <w:r>
+        <w:rPr>
+          <w:color w:val="2563EB"/>
+          <w:sz w:val="20"/>
+        </w:rPr>
+        <w:t>Exam Structure (confirmed by Dr. Fong)</w:t>
+      </w:r>
+    </w:p>
+    <w:p>
+      <w:pPr>
+        <w:ind w:left="283"/>
+      </w:pPr>
+      <w:r>
+        <w:rPr>
+          <w:color w:val="2563EB"/>
+          <w:sz w:val="20"/>
+        </w:rPr>
+        <w:t>Topic-by-Topic Exam Scope</w:t>
+      </w:r>
+    </w:p>
+    <w:p>
+      <w:pPr>
+        <w:ind w:left="283"/>
+      </w:pPr>
+      <w:r>
+        <w:rPr>
+          <w:color w:val="2563EB"/>
+          <w:sz w:val="20"/>
+        </w:rPr>
+        <w:t>Confirmed NOT in Exam</w:t>
+      </w:r>
+    </w:p>
+    <w:p>
+      <w:pPr>
+        <w:ind w:left="283"/>
+      </w:pPr>
+      <w:r>
+        <w:rPr>
+          <w:color w:val="2563EB"/>
+          <w:sz w:val="20"/>
+        </w:rPr>
+        <w:t>Common Mistakes Dr. Fong Warned About</w:t>
+      </w:r>
+    </w:p>
+    <w:p>
+      <w:pPr>
+        <w:ind w:left="283"/>
+      </w:pPr>
+      <w:r>
+        <w:rPr>
+          <w:color w:val="2563EB"/>
+          <w:sz w:val="20"/>
+        </w:rPr>
+        <w:t>L1 — 6 V's: Exam Question Format</w:t>
+      </w:r>
+    </w:p>
+    <w:p>
+      <w:pPr>
+        <w:ind w:left="283"/>
+      </w:pPr>
+      <w:r>
+        <w:rPr>
+          <w:color w:val="2563EB"/>
+          <w:sz w:val="20"/>
+        </w:rPr>
+        <w:t>L3 — MapReduce: What to Know for Exam</w:t>
+      </w:r>
+    </w:p>
+    <w:p>
+      <w:pPr>
+        <w:ind w:left="283"/>
+      </w:pPr>
+      <w:r>
+        <w:rPr>
+          <w:color w:val="2563EB"/>
+          <w:sz w:val="20"/>
+        </w:rPr>
+        <w:t>L5 — BPE: Exam Question Format</w:t>
+      </w:r>
+    </w:p>
+    <w:p>
+      <w:pPr>
+        <w:ind w:left="283"/>
+      </w:pPr>
+      <w:r>
+        <w:rPr>
+          <w:color w:val="2563EB"/>
+          <w:sz w:val="20"/>
+        </w:rPr>
+        <w:t>L6 — Word Embeddings: Conceptual Points Only</w:t>
+      </w:r>
+    </w:p>
+    <w:p>
+      <w:pPr>
+        <w:ind w:left="283"/>
+      </w:pPr>
+      <w:r>
+        <w:rPr>
+          <w:color w:val="2563EB"/>
+          <w:sz w:val="20"/>
+        </w:rPr>
+        <w:t>L7 — PageRank: How to Build the Adjacency Matrix</w:t>
+      </w:r>
+    </w:p>
+    <w:p>
+      <w:pPr>
+        <w:ind w:left="283"/>
+      </w:pPr>
+      <w:r>
+        <w:rPr>
+          <w:color w:val="2563EB"/>
+          <w:sz w:val="20"/>
+        </w:rPr>
+        <w:t>L8 — Graph Analytics: What's Tested vs Not</w:t>
+      </w:r>
+    </w:p>
+    <w:p>
+      <w:pPr>
+        <w:ind w:left="283"/>
+      </w:pPr>
+      <w:r>
+        <w:rPr>
+          <w:color w:val="2563EB"/>
+          <w:sz w:val="20"/>
+        </w:rPr>
+        <w:t>Programming (10%) — What to Revise</w:t>
       </w:r>
     </w:p>
     <w:p>
@@ -38145,6 +38290,3800 @@
           <w:sz w:val="20"/>
         </w:rPr>
         <w:t>Last-minute revision priority:6 V's with examplesPageRank formula + power iteration + dead ends/spider trapsCAP theorem — which systems are CP vs APCentrality formulas (closeness, betweenness)Spark transformations vs actions; narrow vs wideSkip-gram vs CBOWLevenshtein distance (DP table)Collaborative vs content-based filtering</w:t>
+      </w:r>
+    </w:p>
+    <w:p>
+      <w:r>
+        <w:br w:type="page"/>
+      </w:r>
+    </w:p>
+    <w:p>
+      <w:pPr>
+        <w:pStyle w:val="Heading1"/>
+      </w:pPr>
+      <w:r>
+        <w:t>Exam Format &amp; Dr. Fong's Tips (Apr 11 Lecture)</w:t>
+      </w:r>
+    </w:p>
+    <w:p>
+      <w:pPr>
+        <w:pStyle w:val="Heading3"/>
+      </w:pPr>
+      <w:r>
+        <w:t>Exam Structure (confirmed by Dr. Fong)</w:t>
+      </w:r>
+    </w:p>
+    <w:p>
+      <w:pPr>
+        <w:spacing w:before="40" w:after="80"/>
+        <w:ind w:left="283"/>
+      </w:pPr>
+      <w:r>
+        <w:rPr>
+          <w:b/>
+          <w:color w:val="10B981"/>
+          <w:sz w:val="20"/>
+        </w:rPr>
+        <w:t xml:space="preserve">ELI5: </w:t>
+      </w:r>
+      <w:r>
+        <w:rPr>
+          <w:i/>
+          <w:color w:val="10B981"/>
+          <w:sz w:val="20"/>
+        </w:rPr>
+        <w:t>The exam has two parts: 22 multiple-choice questions (Section A) and long questions (Section B). Only 10% is programming — much less than Semester 1's 30%. The past paper on BEPA is useful but the coverage is different.</w:t>
+      </w:r>
+    </w:p>
+    <w:tbl>
+      <w:tblPr>
+        <w:tblStyle w:val="TableGrid"/>
+        <w:tblW w:type="auto" w:w="0"/>
+        <w:tblLook w:firstColumn="1" w:firstRow="1" w:lastColumn="0" w:lastRow="0" w:noHBand="0" w:noVBand="1" w:val="04A0"/>
+      </w:tblPr>
+      <w:tblGrid>
+        <w:gridCol w:w="4873"/>
+        <w:gridCol w:w="4873"/>
+      </w:tblGrid>
+      <w:tr>
+        <w:tc>
+          <w:tcPr>
+            <w:tcW w:type="dxa" w:w="4873"/>
+            <w:shd w:val="clear" w:color="auto" w:fill="D1D5DB"/>
+          </w:tcPr>
+          <w:p>
+            <w:r>
+              <w:rPr>
+                <w:b/>
+                <w:sz w:val="19"/>
+              </w:rPr>
+            </w:r>
+            <w:r>
+              <w:rPr>
+                <w:b/>
+                <w:sz w:val="19"/>
+              </w:rPr>
+              <w:t>Component</w:t>
+            </w:r>
+          </w:p>
+        </w:tc>
+        <w:tc>
+          <w:tcPr>
+            <w:tcW w:type="dxa" w:w="4873"/>
+            <w:shd w:val="clear" w:color="auto" w:fill="D1D5DB"/>
+          </w:tcPr>
+          <w:p>
+            <w:r>
+              <w:rPr>
+                <w:b/>
+                <w:sz w:val="19"/>
+              </w:rPr>
+            </w:r>
+            <w:r>
+              <w:rPr>
+                <w:b/>
+                <w:sz w:val="19"/>
+              </w:rPr>
+              <w:t>Details</w:t>
+            </w:r>
+          </w:p>
+        </w:tc>
+      </w:tr>
+      <w:tr>
+        <w:tc>
+          <w:tcPr>
+            <w:tcW w:type="dxa" w:w="4873"/>
+          </w:tcPr>
+          <w:p>
+            <w:r>
+              <w:rPr>
+                <w:sz w:val="19"/>
+              </w:rPr>
+            </w:r>
+            <w:r>
+              <w:rPr>
+                <w:b/>
+                <w:sz w:val="19"/>
+              </w:rPr>
+              <w:t>Section A — MCQ</w:t>
+            </w:r>
+          </w:p>
+        </w:tc>
+        <w:tc>
+          <w:tcPr>
+            <w:tcW w:type="dxa" w:w="4873"/>
+          </w:tcPr>
+          <w:p>
+            <w:r>
+              <w:rPr>
+                <w:sz w:val="19"/>
+              </w:rPr>
+            </w:r>
+            <w:r>
+              <w:rPr>
+                <w:sz w:val="19"/>
+              </w:rPr>
+              <w:t>22 multiple-choice questions, 1 mark each</w:t>
+            </w:r>
+          </w:p>
+        </w:tc>
+      </w:tr>
+      <w:tr>
+        <w:tc>
+          <w:tcPr>
+            <w:tcW w:type="dxa" w:w="4873"/>
+          </w:tcPr>
+          <w:p>
+            <w:r>
+              <w:rPr>
+                <w:sz w:val="19"/>
+              </w:rPr>
+            </w:r>
+            <w:r>
+              <w:rPr>
+                <w:b/>
+                <w:sz w:val="19"/>
+              </w:rPr>
+              <w:t>Section B — Long Questions</w:t>
+            </w:r>
+          </w:p>
+        </w:tc>
+        <w:tc>
+          <w:tcPr>
+            <w:tcW w:type="dxa" w:w="4873"/>
+          </w:tcPr>
+          <w:p>
+            <w:r>
+              <w:rPr>
+                <w:sz w:val="19"/>
+              </w:rPr>
+            </w:r>
+            <w:r>
+              <w:rPr>
+                <w:sz w:val="19"/>
+              </w:rPr>
+              <w:t>Problem solving, scenario analysis, computations</w:t>
+            </w:r>
+          </w:p>
+        </w:tc>
+      </w:tr>
+      <w:tr>
+        <w:tc>
+          <w:tcPr>
+            <w:tcW w:type="dxa" w:w="4873"/>
+          </w:tcPr>
+          <w:p>
+            <w:r>
+              <w:rPr>
+                <w:sz w:val="19"/>
+              </w:rPr>
+            </w:r>
+            <w:r>
+              <w:rPr>
+                <w:b/>
+                <w:sz w:val="19"/>
+              </w:rPr>
+              <w:t>Programming</w:t>
+            </w:r>
+          </w:p>
+        </w:tc>
+        <w:tc>
+          <w:tcPr>
+            <w:tcW w:type="dxa" w:w="4873"/>
+          </w:tcPr>
+          <w:p>
+            <w:r>
+              <w:rPr>
+                <w:sz w:val="19"/>
+              </w:rPr>
+            </w:r>
+            <w:r>
+              <w:rPr>
+                <w:sz w:val="19"/>
+              </w:rPr>
+              <w:t>~10% only (reduced from 30% in Semester 1). RDD-based only — NOT DataFrame.</w:t>
+            </w:r>
+          </w:p>
+        </w:tc>
+      </w:tr>
+      <w:tr>
+        <w:tc>
+          <w:tcPr>
+            <w:tcW w:type="dxa" w:w="4873"/>
+          </w:tcPr>
+          <w:p>
+            <w:r>
+              <w:rPr>
+                <w:sz w:val="19"/>
+              </w:rPr>
+            </w:r>
+            <w:r>
+              <w:rPr>
+                <w:b/>
+                <w:sz w:val="19"/>
+              </w:rPr>
+              <w:t>Past paper</w:t>
+            </w:r>
+          </w:p>
+        </w:tc>
+        <w:tc>
+          <w:tcPr>
+            <w:tcW w:type="dxa" w:w="4873"/>
+          </w:tcPr>
+          <w:p>
+            <w:r>
+              <w:rPr>
+                <w:sz w:val="19"/>
+              </w:rPr>
+            </w:r>
+            <w:r>
+              <w:rPr>
+                <w:sz w:val="19"/>
+              </w:rPr>
+              <w:t>Available on BEPA — but Sem 1 coverage is different (had 30% programming, L10 in long question)</w:t>
+            </w:r>
+          </w:p>
+        </w:tc>
+      </w:tr>
+    </w:tbl>
+    <w:p/>
+    <w:p>
+      <w:pPr>
+        <w:spacing w:before="40" w:after="80"/>
+        <w:ind w:left="283"/>
+      </w:pPr>
+      <w:r>
+        <w:rPr>
+          <w:b/>
+          <w:color w:val="F59E0B"/>
+        </w:rPr>
+        <w:t xml:space="preserve">NOTE: </w:t>
+      </w:r>
+      <w:r>
+        <w:rPr>
+          <w:color w:val="92400E"/>
+          <w:sz w:val="20"/>
+        </w:rPr>
+        <w:t>Key change from Sem 1:Programming reduced 30% → 10%. Recommendation Systems moved out of long question. Only 10% programming — all RDD (not DataFrame).</w:t>
+      </w:r>
+    </w:p>
+    <w:p>
+      <w:pPr>
+        <w:pStyle w:val="Heading3"/>
+      </w:pPr>
+      <w:r>
+        <w:t>Topic-by-Topic Exam Scope</w:t>
+      </w:r>
+    </w:p>
+    <w:p>
+      <w:pPr>
+        <w:spacing w:before="40" w:after="80"/>
+        <w:ind w:left="283"/>
+      </w:pPr>
+      <w:r>
+        <w:rPr>
+          <w:b/>
+          <w:color w:val="10B981"/>
+          <w:sz w:val="20"/>
+        </w:rPr>
+        <w:t xml:space="preserve">ELI5: </w:t>
+      </w:r>
+      <w:r>
+        <w:rPr>
+          <w:i/>
+          <w:color w:val="10B981"/>
+          <w:sz w:val="20"/>
+        </w:rPr>
+        <w:t>Use this table as your revision checklist. Green = definitely in long question. MCQ-only topics still need to be understood but don't need deep computational practice.</w:t>
+      </w:r>
+    </w:p>
+    <w:tbl>
+      <w:tblPr>
+        <w:tblStyle w:val="TableGrid"/>
+        <w:tblW w:type="auto" w:w="0"/>
+        <w:tblLook w:firstColumn="1" w:firstRow="1" w:lastColumn="0" w:lastRow="0" w:noHBand="0" w:noVBand="1" w:val="04A0"/>
+      </w:tblPr>
+      <w:tblGrid>
+        <w:gridCol w:w="2436"/>
+        <w:gridCol w:w="2436"/>
+        <w:gridCol w:w="2436"/>
+        <w:gridCol w:w="2436"/>
+      </w:tblGrid>
+      <w:tr>
+        <w:tc>
+          <w:tcPr>
+            <w:tcW w:type="dxa" w:w="2436"/>
+            <w:shd w:val="clear" w:color="auto" w:fill="D1D5DB"/>
+          </w:tcPr>
+          <w:p>
+            <w:r>
+              <w:rPr>
+                <w:b/>
+                <w:sz w:val="19"/>
+              </w:rPr>
+            </w:r>
+            <w:r>
+              <w:rPr>
+                <w:b/>
+                <w:sz w:val="19"/>
+              </w:rPr>
+              <w:t>Lecture</w:t>
+            </w:r>
+          </w:p>
+        </w:tc>
+        <w:tc>
+          <w:tcPr>
+            <w:tcW w:type="dxa" w:w="2436"/>
+            <w:shd w:val="clear" w:color="auto" w:fill="D1D5DB"/>
+          </w:tcPr>
+          <w:p>
+            <w:r>
+              <w:rPr>
+                <w:b/>
+                <w:sz w:val="19"/>
+              </w:rPr>
+            </w:r>
+            <w:r>
+              <w:rPr>
+                <w:b/>
+                <w:sz w:val="19"/>
+              </w:rPr>
+              <w:t>In Long Q?</w:t>
+            </w:r>
+          </w:p>
+        </w:tc>
+        <w:tc>
+          <w:tcPr>
+            <w:tcW w:type="dxa" w:w="2436"/>
+            <w:shd w:val="clear" w:color="auto" w:fill="D1D5DB"/>
+          </w:tcPr>
+          <w:p>
+            <w:r>
+              <w:rPr>
+                <w:b/>
+                <w:sz w:val="19"/>
+              </w:rPr>
+            </w:r>
+            <w:r>
+              <w:rPr>
+                <w:b/>
+                <w:sz w:val="19"/>
+              </w:rPr>
+              <w:t>In MCQ?</w:t>
+            </w:r>
+          </w:p>
+        </w:tc>
+        <w:tc>
+          <w:tcPr>
+            <w:tcW w:type="dxa" w:w="2436"/>
+            <w:shd w:val="clear" w:color="auto" w:fill="D1D5DB"/>
+          </w:tcPr>
+          <w:p>
+            <w:r>
+              <w:rPr>
+                <w:b/>
+                <w:sz w:val="19"/>
+              </w:rPr>
+            </w:r>
+            <w:r>
+              <w:rPr>
+                <w:b/>
+                <w:sz w:val="19"/>
+              </w:rPr>
+              <w:t>What Dr. Fong said</w:t>
+            </w:r>
+          </w:p>
+        </w:tc>
+      </w:tr>
+      <w:tr>
+        <w:tc>
+          <w:tcPr>
+            <w:tcW w:type="dxa" w:w="2436"/>
+          </w:tcPr>
+          <w:p>
+            <w:r>
+              <w:rPr>
+                <w:sz w:val="19"/>
+              </w:rPr>
+            </w:r>
+            <w:r>
+              <w:rPr>
+                <w:b/>
+                <w:sz w:val="19"/>
+              </w:rPr>
+              <w:t>L1 — 6 V's</w:t>
+            </w:r>
+          </w:p>
+        </w:tc>
+        <w:tc>
+          <w:tcPr>
+            <w:tcW w:type="dxa" w:w="2436"/>
+          </w:tcPr>
+          <w:p>
+            <w:r>
+              <w:rPr>
+                <w:sz w:val="19"/>
+              </w:rPr>
+            </w:r>
+            <w:r>
+              <w:rPr>
+                <w:sz w:val="19"/>
+              </w:rPr>
+              <w:t>YES</w:t>
+            </w:r>
+          </w:p>
+        </w:tc>
+        <w:tc>
+          <w:tcPr>
+            <w:tcW w:type="dxa" w:w="2436"/>
+          </w:tcPr>
+          <w:p>
+            <w:r>
+              <w:rPr>
+                <w:sz w:val="19"/>
+              </w:rPr>
+            </w:r>
+            <w:r>
+              <w:rPr>
+                <w:sz w:val="19"/>
+              </w:rPr>
+              <w:t>YES</w:t>
+            </w:r>
+          </w:p>
+        </w:tc>
+        <w:tc>
+          <w:tcPr>
+            <w:tcW w:type="dxa" w:w="2436"/>
+          </w:tcPr>
+          <w:p>
+            <w:r>
+              <w:rPr>
+                <w:sz w:val="19"/>
+              </w:rPr>
+            </w:r>
+            <w:r>
+              <w:rPr>
+                <w:sz w:val="19"/>
+              </w:rPr>
+              <w:t>Given a company passage → identify which V's apply + propose solutions (not definitions). Same format as L1 practice question.</w:t>
+            </w:r>
+          </w:p>
+        </w:tc>
+      </w:tr>
+      <w:tr>
+        <w:tc>
+          <w:tcPr>
+            <w:tcW w:type="dxa" w:w="2436"/>
+          </w:tcPr>
+          <w:p>
+            <w:r>
+              <w:rPr>
+                <w:sz w:val="19"/>
+              </w:rPr>
+            </w:r>
+            <w:r>
+              <w:rPr>
+                <w:b/>
+                <w:sz w:val="19"/>
+              </w:rPr>
+              <w:t>L2 — HDFS</w:t>
+            </w:r>
+          </w:p>
+        </w:tc>
+        <w:tc>
+          <w:tcPr>
+            <w:tcW w:type="dxa" w:w="2436"/>
+          </w:tcPr>
+          <w:p>
+            <w:r>
+              <w:rPr>
+                <w:sz w:val="19"/>
+              </w:rPr>
+            </w:r>
+            <w:r>
+              <w:rPr>
+                <w:sz w:val="19"/>
+              </w:rPr>
+              <w:t>Possibly</w:t>
+            </w:r>
+          </w:p>
+        </w:tc>
+        <w:tc>
+          <w:tcPr>
+            <w:tcW w:type="dxa" w:w="2436"/>
+          </w:tcPr>
+          <w:p>
+            <w:r>
+              <w:rPr>
+                <w:sz w:val="19"/>
+              </w:rPr>
+            </w:r>
+            <w:r>
+              <w:rPr>
+                <w:sz w:val="19"/>
+              </w:rPr>
+              <w:t>YES</w:t>
+            </w:r>
+          </w:p>
+        </w:tc>
+        <w:tc>
+          <w:tcPr>
+            <w:tcW w:type="dxa" w:w="2436"/>
+          </w:tcPr>
+          <w:p>
+            <w:r>
+              <w:rPr>
+                <w:sz w:val="19"/>
+              </w:rPr>
+            </w:r>
+            <w:r>
+              <w:rPr>
+                <w:sz w:val="19"/>
+              </w:rPr>
+              <w:t>Know 3-way replication, fault tolerance via replicas.</w:t>
+            </w:r>
+          </w:p>
+        </w:tc>
+      </w:tr>
+      <w:tr>
+        <w:tc>
+          <w:tcPr>
+            <w:tcW w:type="dxa" w:w="2436"/>
+          </w:tcPr>
+          <w:p>
+            <w:r>
+              <w:rPr>
+                <w:sz w:val="19"/>
+              </w:rPr>
+            </w:r>
+            <w:r>
+              <w:rPr>
+                <w:b/>
+                <w:sz w:val="19"/>
+              </w:rPr>
+              <w:t>L2 — Dask</w:t>
+            </w:r>
+          </w:p>
+        </w:tc>
+        <w:tc>
+          <w:tcPr>
+            <w:tcW w:type="dxa" w:w="2436"/>
+          </w:tcPr>
+          <w:p>
+            <w:r>
+              <w:rPr>
+                <w:sz w:val="19"/>
+              </w:rPr>
+            </w:r>
+            <w:r>
+              <w:rPr>
+                <w:sz w:val="19"/>
+              </w:rPr>
+              <w:t>NO</w:t>
+            </w:r>
+          </w:p>
+        </w:tc>
+        <w:tc>
+          <w:tcPr>
+            <w:tcW w:type="dxa" w:w="2436"/>
+          </w:tcPr>
+          <w:p>
+            <w:r>
+              <w:rPr>
+                <w:sz w:val="19"/>
+              </w:rPr>
+            </w:r>
+            <w:r>
+              <w:rPr>
+                <w:sz w:val="19"/>
+              </w:rPr>
+              <w:t>YES (1–2 Qs)</w:t>
+            </w:r>
+          </w:p>
+        </w:tc>
+        <w:tc>
+          <w:tcPr>
+            <w:tcW w:type="dxa" w:w="2436"/>
+          </w:tcPr>
+          <w:p>
+            <w:r>
+              <w:rPr>
+                <w:sz w:val="19"/>
+              </w:rPr>
+            </w:r>
+            <w:r>
+              <w:rPr>
+                <w:sz w:val="19"/>
+              </w:rPr>
+              <w:t>MCQ only. Focus: map_overlap, lazy execution, chunk size trade-offs, task graph concept.</w:t>
+            </w:r>
+          </w:p>
+        </w:tc>
+      </w:tr>
+      <w:tr>
+        <w:tc>
+          <w:tcPr>
+            <w:tcW w:type="dxa" w:w="2436"/>
+          </w:tcPr>
+          <w:p>
+            <w:r>
+              <w:rPr>
+                <w:sz w:val="19"/>
+              </w:rPr>
+            </w:r>
+            <w:r>
+              <w:rPr>
+                <w:b/>
+                <w:sz w:val="19"/>
+              </w:rPr>
+              <w:t>L3 — MapReduce</w:t>
+            </w:r>
+          </w:p>
+        </w:tc>
+        <w:tc>
+          <w:tcPr>
+            <w:tcW w:type="dxa" w:w="2436"/>
+          </w:tcPr>
+          <w:p>
+            <w:r>
+              <w:rPr>
+                <w:sz w:val="19"/>
+              </w:rPr>
+            </w:r>
+            <w:r>
+              <w:rPr>
+                <w:sz w:val="19"/>
+              </w:rPr>
+              <w:t>YES (key topic)</w:t>
+            </w:r>
+          </w:p>
+        </w:tc>
+        <w:tc>
+          <w:tcPr>
+            <w:tcW w:type="dxa" w:w="2436"/>
+          </w:tcPr>
+          <w:p>
+            <w:r>
+              <w:rPr>
+                <w:sz w:val="19"/>
+              </w:rPr>
+            </w:r>
+            <w:r>
+              <w:rPr>
+                <w:sz w:val="19"/>
+              </w:rPr>
+              <w:t>YES</w:t>
+            </w:r>
+          </w:p>
+        </w:tc>
+        <w:tc>
+          <w:tcPr>
+            <w:tcW w:type="dxa" w:w="2436"/>
+          </w:tcPr>
+          <w:p>
+            <w:r>
+              <w:rPr>
+                <w:sz w:val="19"/>
+              </w:rPr>
+            </w:r>
+            <w:r>
+              <w:rPr>
+                <w:sz w:val="19"/>
+              </w:rPr>
+              <w:t>"Make sure you understand the flow" — mapper → shuffle → reducer. Intermediate key-values. Word count example. Common mistake: forgetting the shuffle step.</w:t>
+            </w:r>
+          </w:p>
+        </w:tc>
+      </w:tr>
+      <w:tr>
+        <w:tc>
+          <w:tcPr>
+            <w:tcW w:type="dxa" w:w="2436"/>
+          </w:tcPr>
+          <w:p>
+            <w:r>
+              <w:rPr>
+                <w:sz w:val="19"/>
+              </w:rPr>
+            </w:r>
+            <w:r>
+              <w:rPr>
+                <w:b/>
+                <w:sz w:val="19"/>
+              </w:rPr>
+              <w:t>L3 — RDD / Spark</w:t>
+            </w:r>
+          </w:p>
+        </w:tc>
+        <w:tc>
+          <w:tcPr>
+            <w:tcW w:type="dxa" w:w="2436"/>
+          </w:tcPr>
+          <w:p>
+            <w:r>
+              <w:rPr>
+                <w:sz w:val="19"/>
+              </w:rPr>
+            </w:r>
+            <w:r>
+              <w:rPr>
+                <w:sz w:val="19"/>
+              </w:rPr>
+              <w:t>YES (programming 10%)</w:t>
+            </w:r>
+          </w:p>
+        </w:tc>
+        <w:tc>
+          <w:tcPr>
+            <w:tcW w:type="dxa" w:w="2436"/>
+          </w:tcPr>
+          <w:p>
+            <w:r>
+              <w:rPr>
+                <w:sz w:val="19"/>
+              </w:rPr>
+            </w:r>
+            <w:r>
+              <w:rPr>
+                <w:sz w:val="19"/>
+              </w:rPr>
+              <w:t>YES</w:t>
+            </w:r>
+          </w:p>
+        </w:tc>
+        <w:tc>
+          <w:tcPr>
+            <w:tcW w:type="dxa" w:w="2436"/>
+          </w:tcPr>
+          <w:p>
+            <w:r>
+              <w:rPr>
+                <w:sz w:val="19"/>
+              </w:rPr>
+            </w:r>
+            <w:r>
+              <w:rPr>
+                <w:sz w:val="19"/>
+              </w:rPr>
+              <w:t>Programming = RDD only. Revise Tutorial 3. Transformations vs actions, narrow vs wide, map/flatMap/mapValues/flatMapValues differences.</w:t>
+            </w:r>
+          </w:p>
+        </w:tc>
+      </w:tr>
+      <w:tr>
+        <w:tc>
+          <w:tcPr>
+            <w:tcW w:type="dxa" w:w="2436"/>
+          </w:tcPr>
+          <w:p>
+            <w:r>
+              <w:rPr>
+                <w:sz w:val="19"/>
+              </w:rPr>
+            </w:r>
+            <w:r>
+              <w:rPr>
+                <w:b/>
+                <w:sz w:val="19"/>
+              </w:rPr>
+              <w:t>L3/L4 — DataFrame / SparkSQL</w:t>
+            </w:r>
+          </w:p>
+        </w:tc>
+        <w:tc>
+          <w:tcPr>
+            <w:tcW w:type="dxa" w:w="2436"/>
+          </w:tcPr>
+          <w:p>
+            <w:r>
+              <w:rPr>
+                <w:sz w:val="19"/>
+              </w:rPr>
+            </w:r>
+            <w:r>
+              <w:rPr>
+                <w:sz w:val="19"/>
+              </w:rPr>
+              <w:t>NO</w:t>
+            </w:r>
+          </w:p>
+        </w:tc>
+        <w:tc>
+          <w:tcPr>
+            <w:tcW w:type="dxa" w:w="2436"/>
+          </w:tcPr>
+          <w:p>
+            <w:r>
+              <w:rPr>
+                <w:sz w:val="19"/>
+              </w:rPr>
+            </w:r>
+            <w:r>
+              <w:rPr>
+                <w:sz w:val="19"/>
+              </w:rPr>
+              <w:t>YES (3–4 Qs, ~4–5%)</w:t>
+            </w:r>
+          </w:p>
+        </w:tc>
+        <w:tc>
+          <w:tcPr>
+            <w:tcW w:type="dxa" w:w="2436"/>
+          </w:tcPr>
+          <w:p>
+            <w:r>
+              <w:rPr>
+                <w:sz w:val="19"/>
+              </w:rPr>
+            </w:r>
+            <w:r>
+              <w:rPr>
+                <w:sz w:val="19"/>
+              </w:rPr>
+              <w:t>MCQ only. Know the operations, optimizer (Catalyst), key API differences vs RDD.</w:t>
+            </w:r>
+          </w:p>
+        </w:tc>
+      </w:tr>
+      <w:tr>
+        <w:tc>
+          <w:tcPr>
+            <w:tcW w:type="dxa" w:w="2436"/>
+          </w:tcPr>
+          <w:p>
+            <w:r>
+              <w:rPr>
+                <w:sz w:val="19"/>
+              </w:rPr>
+            </w:r>
+            <w:r>
+              <w:rPr>
+                <w:b/>
+                <w:sz w:val="19"/>
+              </w:rPr>
+              <w:t>L5 — NLP</w:t>
+            </w:r>
+          </w:p>
+        </w:tc>
+        <w:tc>
+          <w:tcPr>
+            <w:tcW w:type="dxa" w:w="2436"/>
+          </w:tcPr>
+          <w:p>
+            <w:r>
+              <w:rPr>
+                <w:sz w:val="19"/>
+              </w:rPr>
+            </w:r>
+            <w:r>
+              <w:rPr>
+                <w:sz w:val="19"/>
+              </w:rPr>
+              <w:t>YES</w:t>
+            </w:r>
+          </w:p>
+        </w:tc>
+        <w:tc>
+          <w:tcPr>
+            <w:tcW w:type="dxa" w:w="2436"/>
+          </w:tcPr>
+          <w:p>
+            <w:r>
+              <w:rPr>
+                <w:sz w:val="19"/>
+              </w:rPr>
+            </w:r>
+            <w:r>
+              <w:rPr>
+                <w:sz w:val="19"/>
+              </w:rPr>
+              <w:t>YES</w:t>
+            </w:r>
+          </w:p>
+        </w:tc>
+        <w:tc>
+          <w:tcPr>
+            <w:tcW w:type="dxa" w:w="2436"/>
+          </w:tcPr>
+          <w:p>
+            <w:r>
+              <w:rPr>
+                <w:sz w:val="19"/>
+              </w:rPr>
+            </w:r>
+            <w:r>
+              <w:rPr>
+                <w:sz w:val="19"/>
+              </w:rPr>
+              <w:t>BPE algorithm (run to vocabulary size 10 in exam), Levenshtein DP table, stemming vs lemmatization. Stopwords, POS tagging.</w:t>
+            </w:r>
+          </w:p>
+        </w:tc>
+      </w:tr>
+      <w:tr>
+        <w:tc>
+          <w:tcPr>
+            <w:tcW w:type="dxa" w:w="2436"/>
+          </w:tcPr>
+          <w:p>
+            <w:r>
+              <w:rPr>
+                <w:sz w:val="19"/>
+              </w:rPr>
+            </w:r>
+            <w:r>
+              <w:rPr>
+                <w:b/>
+                <w:sz w:val="19"/>
+              </w:rPr>
+              <w:t>L6 — Word Embeddings</w:t>
+            </w:r>
+          </w:p>
+        </w:tc>
+        <w:tc>
+          <w:tcPr>
+            <w:tcW w:type="dxa" w:w="2436"/>
+          </w:tcPr>
+          <w:p>
+            <w:r>
+              <w:rPr>
+                <w:sz w:val="19"/>
+              </w:rPr>
+            </w:r>
+            <w:r>
+              <w:rPr>
+                <w:sz w:val="19"/>
+              </w:rPr>
+              <w:t>Conceptual only</w:t>
+            </w:r>
+          </w:p>
+        </w:tc>
+        <w:tc>
+          <w:tcPr>
+            <w:tcW w:type="dxa" w:w="2436"/>
+          </w:tcPr>
+          <w:p>
+            <w:r>
+              <w:rPr>
+                <w:sz w:val="19"/>
+              </w:rPr>
+            </w:r>
+            <w:r>
+              <w:rPr>
+                <w:sz w:val="19"/>
+              </w:rPr>
+              <w:t>YES</w:t>
+            </w:r>
+          </w:p>
+        </w:tc>
+        <w:tc>
+          <w:tcPr>
+            <w:tcW w:type="dxa" w:w="2436"/>
+          </w:tcPr>
+          <w:p>
+            <w:r>
+              <w:rPr>
+                <w:sz w:val="19"/>
+              </w:rPr>
+            </w:r>
+            <w:r>
+              <w:rPr>
+                <w:sz w:val="19"/>
+              </w:rPr>
+              <w:t>"Low math for test embedding." No equation memorisation. Know: Skip-gram vs CBOW (which predicts what), why softmax (ensures 0–1), why negative sampling (efficiency), M = window size (not total context words).</w:t>
+            </w:r>
+          </w:p>
+        </w:tc>
+      </w:tr>
+      <w:tr>
+        <w:tc>
+          <w:tcPr>
+            <w:tcW w:type="dxa" w:w="2436"/>
+          </w:tcPr>
+          <w:p>
+            <w:r>
+              <w:rPr>
+                <w:sz w:val="19"/>
+              </w:rPr>
+            </w:r>
+            <w:r>
+              <w:rPr>
+                <w:b/>
+                <w:sz w:val="19"/>
+              </w:rPr>
+              <w:t>L7 — PageRank</w:t>
+            </w:r>
+          </w:p>
+        </w:tc>
+        <w:tc>
+          <w:tcPr>
+            <w:tcW w:type="dxa" w:w="2436"/>
+          </w:tcPr>
+          <w:p>
+            <w:r>
+              <w:rPr>
+                <w:sz w:val="19"/>
+              </w:rPr>
+            </w:r>
+            <w:r>
+              <w:rPr>
+                <w:sz w:val="19"/>
+              </w:rPr>
+              <w:t>YES (computation)</w:t>
+            </w:r>
+          </w:p>
+        </w:tc>
+        <w:tc>
+          <w:tcPr>
+            <w:tcW w:type="dxa" w:w="2436"/>
+          </w:tcPr>
+          <w:p>
+            <w:r>
+              <w:rPr>
+                <w:sz w:val="19"/>
+              </w:rPr>
+            </w:r>
+            <w:r>
+              <w:rPr>
+                <w:sz w:val="19"/>
+              </w:rPr>
+              <w:t>YES</w:t>
+            </w:r>
+          </w:p>
+        </w:tc>
+        <w:tc>
+          <w:tcPr>
+            <w:tcW w:type="dxa" w:w="2436"/>
+          </w:tcPr>
+          <w:p>
+            <w:r>
+              <w:rPr>
+                <w:sz w:val="19"/>
+              </w:rPr>
+            </w:r>
+            <w:r>
+              <w:rPr>
+                <w:sz w:val="19"/>
+              </w:rPr>
+              <w:t>Build adjacency matrix → power iteration → convergence. Dead end fix + spider trap fix (teleportation). Know why teleportation works.</w:t>
+            </w:r>
+          </w:p>
+        </w:tc>
+      </w:tr>
+      <w:tr>
+        <w:tc>
+          <w:tcPr>
+            <w:tcW w:type="dxa" w:w="2436"/>
+          </w:tcPr>
+          <w:p>
+            <w:r>
+              <w:rPr>
+                <w:sz w:val="19"/>
+              </w:rPr>
+            </w:r>
+            <w:r>
+              <w:rPr>
+                <w:b/>
+                <w:sz w:val="19"/>
+              </w:rPr>
+              <w:t>L8 — Graph Analytics</w:t>
+            </w:r>
+          </w:p>
+        </w:tc>
+        <w:tc>
+          <w:tcPr>
+            <w:tcW w:type="dxa" w:w="2436"/>
+          </w:tcPr>
+          <w:p>
+            <w:r>
+              <w:rPr>
+                <w:sz w:val="19"/>
+              </w:rPr>
+            </w:r>
+            <w:r>
+              <w:rPr>
+                <w:sz w:val="19"/>
+              </w:rPr>
+              <w:t>YES (computation)</w:t>
+            </w:r>
+          </w:p>
+        </w:tc>
+        <w:tc>
+          <w:tcPr>
+            <w:tcW w:type="dxa" w:w="2436"/>
+          </w:tcPr>
+          <w:p>
+            <w:r>
+              <w:rPr>
+                <w:sz w:val="19"/>
+              </w:rPr>
+            </w:r>
+            <w:r>
+              <w:rPr>
+                <w:sz w:val="19"/>
+              </w:rPr>
+              <w:t>YES</w:t>
+            </w:r>
+          </w:p>
+        </w:tc>
+        <w:tc>
+          <w:tcPr>
+            <w:tcW w:type="dxa" w:w="2436"/>
+          </w:tcPr>
+          <w:p>
+            <w:r>
+              <w:rPr>
+                <w:sz w:val="19"/>
+              </w:rPr>
+            </w:r>
+            <w:r>
+              <w:rPr>
+                <w:sz w:val="19"/>
+              </w:rPr>
+              <w:t>Density (K/N formula), degree distribution, clustering coefficient, betweenness centrality (VERTEX only — edge betweenness NOT tested), closeness + harmonic centrality.</w:t>
+            </w:r>
+          </w:p>
+        </w:tc>
+      </w:tr>
+      <w:tr>
+        <w:tc>
+          <w:tcPr>
+            <w:tcW w:type="dxa" w:w="2436"/>
+          </w:tcPr>
+          <w:p>
+            <w:r>
+              <w:rPr>
+                <w:sz w:val="19"/>
+              </w:rPr>
+            </w:r>
+            <w:r>
+              <w:rPr>
+                <w:b/>
+                <w:sz w:val="19"/>
+              </w:rPr>
+              <w:t>L9 — NoSQL / CAP</w:t>
+            </w:r>
+          </w:p>
+        </w:tc>
+        <w:tc>
+          <w:tcPr>
+            <w:tcW w:type="dxa" w:w="2436"/>
+          </w:tcPr>
+          <w:p>
+            <w:r>
+              <w:rPr>
+                <w:sz w:val="19"/>
+              </w:rPr>
+            </w:r>
+            <w:r>
+              <w:rPr>
+                <w:sz w:val="19"/>
+              </w:rPr>
+              <w:t>NO</w:t>
+            </w:r>
+          </w:p>
+        </w:tc>
+        <w:tc>
+          <w:tcPr>
+            <w:tcW w:type="dxa" w:w="2436"/>
+          </w:tcPr>
+          <w:p>
+            <w:r>
+              <w:rPr>
+                <w:sz w:val="19"/>
+              </w:rPr>
+            </w:r>
+            <w:r>
+              <w:rPr>
+                <w:sz w:val="19"/>
+              </w:rPr>
+              <w:t>YES</w:t>
+            </w:r>
+          </w:p>
+        </w:tc>
+        <w:tc>
+          <w:tcPr>
+            <w:tcW w:type="dxa" w:w="2436"/>
+          </w:tcPr>
+          <w:p>
+            <w:r>
+              <w:rPr>
+                <w:sz w:val="19"/>
+              </w:rPr>
+            </w:r>
+            <w:r>
+              <w:rPr>
+                <w:sz w:val="19"/>
+              </w:rPr>
+              <w:t>MCQ only. CAP theorem, BASE model, strong vs eventual consistency, partition vs replication trade-offs, CP vs AP behaviour when disconnected.</w:t>
+            </w:r>
+          </w:p>
+        </w:tc>
+      </w:tr>
+      <w:tr>
+        <w:tc>
+          <w:tcPr>
+            <w:tcW w:type="dxa" w:w="2436"/>
+          </w:tcPr>
+          <w:p>
+            <w:r>
+              <w:rPr>
+                <w:sz w:val="19"/>
+              </w:rPr>
+            </w:r>
+            <w:r>
+              <w:rPr>
+                <w:b/>
+                <w:sz w:val="19"/>
+              </w:rPr>
+              <w:t>L10 — RecSys</w:t>
+            </w:r>
+          </w:p>
+        </w:tc>
+        <w:tc>
+          <w:tcPr>
+            <w:tcW w:type="dxa" w:w="2436"/>
+          </w:tcPr>
+          <w:p>
+            <w:r>
+              <w:rPr>
+                <w:sz w:val="19"/>
+              </w:rPr>
+            </w:r>
+            <w:r>
+              <w:rPr>
+                <w:sz w:val="19"/>
+              </w:rPr>
+              <w:t>NOT this semester</w:t>
+            </w:r>
+          </w:p>
+        </w:tc>
+        <w:tc>
+          <w:tcPr>
+            <w:tcW w:type="dxa" w:w="2436"/>
+          </w:tcPr>
+          <w:p>
+            <w:r>
+              <w:rPr>
+                <w:sz w:val="19"/>
+              </w:rPr>
+            </w:r>
+            <w:r>
+              <w:rPr>
+                <w:sz w:val="19"/>
+              </w:rPr>
+              <w:t>Possibly some</w:t>
+            </w:r>
+          </w:p>
+        </w:tc>
+        <w:tc>
+          <w:tcPr>
+            <w:tcW w:type="dxa" w:w="2436"/>
+          </w:tcPr>
+          <w:p>
+            <w:r>
+              <w:rPr>
+                <w:sz w:val="19"/>
+              </w:rPr>
+            </w:r>
+            <w:r>
+              <w:rPr>
+                <w:sz w:val="19"/>
+              </w:rPr>
+              <w:t>Was in long question in Sem 1. Coverage different this semester — not explicitly confirmed in long question.</w:t>
+            </w:r>
+          </w:p>
+        </w:tc>
+      </w:tr>
+    </w:tbl>
+    <w:p/>
+    <w:p>
+      <w:pPr>
+        <w:pStyle w:val="Heading3"/>
+      </w:pPr>
+      <w:r>
+        <w:t>Confirmed NOT in Exam</w:t>
+      </w:r>
+    </w:p>
+    <w:p>
+      <w:pPr>
+        <w:spacing w:before="40" w:after="80"/>
+        <w:ind w:left="283"/>
+      </w:pPr>
+      <w:r>
+        <w:rPr>
+          <w:b/>
+          <w:color w:val="10B981"/>
+          <w:sz w:val="20"/>
+        </w:rPr>
+        <w:t xml:space="preserve">ELI5: </w:t>
+      </w:r>
+      <w:r>
+        <w:rPr>
+          <w:i/>
+          <w:color w:val="10B981"/>
+          <w:sz w:val="20"/>
+        </w:rPr>
+        <w:t>Edge betweenness centrality, word embedding math equations, DataFrame/SparkSQL in long question, and Dask in long question are all explicitly excluded.</w:t>
+      </w:r>
+    </w:p>
+    <w:p>
+      <w:pPr>
+        <w:pStyle w:val="ListBullet"/>
+      </w:pPr>
+      <w:r>
+        <w:rPr>
+          <w:b/>
+          <w:sz w:val="21"/>
+        </w:rPr>
+        <w:t>Edge/arc betweenness centrality</w:t>
+      </w:r>
+      <w:r>
+        <w:rPr>
+          <w:sz w:val="21"/>
+        </w:rPr>
+        <w:t xml:space="preserve"> — "ash centrality will not be answered in your final exam"</w:t>
+      </w:r>
+    </w:p>
+    <w:p>
+      <w:pPr>
+        <w:pStyle w:val="ListBullet"/>
+      </w:pPr>
+      <w:r>
+        <w:rPr>
+          <w:b/>
+          <w:sz w:val="21"/>
+        </w:rPr>
+        <w:t>Word embedding math/equations</w:t>
+      </w:r>
+      <w:r>
+        <w:rPr>
+          <w:sz w:val="21"/>
+        </w:rPr>
+        <w:t xml:space="preserve"> — "low math for test embedding, you do not need to memorize any equation"</w:t>
+      </w:r>
+    </w:p>
+    <w:p>
+      <w:pPr>
+        <w:pStyle w:val="ListBullet"/>
+      </w:pPr>
+      <w:r>
+        <w:rPr>
+          <w:b/>
+          <w:sz w:val="21"/>
+        </w:rPr>
+        <w:t>DataFrame / SparkSQL in long question</w:t>
+      </w:r>
+      <w:r>
+        <w:rPr>
+          <w:sz w:val="21"/>
+        </w:rPr>
+        <w:t xml:space="preserve"> — MCQ only</w:t>
+      </w:r>
+    </w:p>
+    <w:p>
+      <w:pPr>
+        <w:pStyle w:val="ListBullet"/>
+      </w:pPr>
+      <w:r>
+        <w:rPr>
+          <w:b/>
+          <w:sz w:val="21"/>
+        </w:rPr>
+        <w:t>Dask in long question</w:t>
+      </w:r>
+      <w:r>
+        <w:rPr>
+          <w:sz w:val="21"/>
+        </w:rPr>
+        <w:t xml:space="preserve"> — MCQ only (1–2 questions)</w:t>
+      </w:r>
+    </w:p>
+    <w:p>
+      <w:pPr>
+        <w:pStyle w:val="Heading3"/>
+      </w:pPr>
+      <w:r>
+        <w:t>Common Mistakes Dr. Fong Warned About</w:t>
+      </w:r>
+    </w:p>
+    <w:p>
+      <w:pPr>
+        <w:spacing w:before="40" w:after="80"/>
+        <w:ind w:left="283"/>
+      </w:pPr>
+      <w:r>
+        <w:rPr>
+          <w:b/>
+          <w:color w:val="10B981"/>
+          <w:sz w:val="20"/>
+        </w:rPr>
+        <w:t xml:space="preserve">ELI5: </w:t>
+      </w:r>
+      <w:r>
+        <w:rPr>
+          <w:i/>
+          <w:color w:val="10B981"/>
+          <w:sz w:val="20"/>
+        </w:rPr>
+        <w:t>Dr. Fong personally warned about four recurring mistakes every semester. Memorise the orientation rules for Levenshtein and PageRank matrices — getting them backwards loses the entire question.</w:t>
+      </w:r>
+    </w:p>
+    <w:p>
+      <w:pPr>
+        <w:spacing w:before="40" w:after="80"/>
+        <w:ind w:left="283"/>
+      </w:pPr>
+      <w:r>
+        <w:rPr>
+          <w:b/>
+          <w:color w:val="F59E0B"/>
+        </w:rPr>
+        <w:t xml:space="preserve">NOTE: </w:t>
+      </w:r>
+      <w:r>
+        <w:rPr>
+          <w:color w:val="92400E"/>
+          <w:sz w:val="20"/>
+        </w:rPr>
+        <w:t>Levenshtein DP table orientation:Source word ALWAYS at the TOP (columns). Target word ALWAYS on the LEFT (rows). "Every semester some students mix up — your whole question will be wrong."</w:t>
+      </w:r>
+    </w:p>
+    <w:p>
+      <w:pPr>
+        <w:spacing w:before="40" w:after="80"/>
+        <w:ind w:left="283"/>
+      </w:pPr>
+      <w:r>
+        <w:rPr>
+          <w:b/>
+          <w:color w:val="F59E0B"/>
+        </w:rPr>
+        <w:t xml:space="preserve">NOTE: </w:t>
+      </w:r>
+      <w:r>
+        <w:rPr>
+          <w:color w:val="92400E"/>
+          <w:sz w:val="20"/>
+        </w:rPr>
+        <w:t>PageRank adjacency matrix orientation:Source node at TOP (columns). Destination node on the LEFT (rows). Column sums must equal 1.</w:t>
+      </w:r>
+    </w:p>
+    <w:p>
+      <w:pPr>
+        <w:spacing w:before="40" w:after="80"/>
+        <w:ind w:left="283"/>
+      </w:pPr>
+      <w:r>
+        <w:rPr>
+          <w:b/>
+          <w:color w:val="F59E0B"/>
+        </w:rPr>
+        <w:t xml:space="preserve">NOTE: </w:t>
+      </w:r>
+      <w:r>
+        <w:rPr>
+          <w:color w:val="92400E"/>
+          <w:sz w:val="20"/>
+        </w:rPr>
+        <w:t>CBOW window size M:If you include 2 words before and 2 words after the centre word, M = 2. NOT 4. M is the half-window size.</w:t>
+      </w:r>
+    </w:p>
+    <w:p>
+      <w:pPr>
+        <w:spacing w:before="40" w:after="80"/>
+        <w:ind w:left="283"/>
+      </w:pPr>
+      <w:r>
+        <w:rPr>
+          <w:b/>
+          <w:color w:val="F59E0B"/>
+        </w:rPr>
+        <w:t xml:space="preserve">NOTE: </w:t>
+      </w:r>
+      <w:r>
+        <w:rPr>
+          <w:color w:val="92400E"/>
+          <w:sz w:val="20"/>
+        </w:rPr>
+        <w:t>MapReduce shuffle:"Many students forget about the shuffle." The 3 stages are mapper →shuffle→ reducer. Shuffle is automatic (system-handled) but you must describe it.</w:t>
+      </w:r>
+    </w:p>
+    <w:p>
+      <w:pPr>
+        <w:pStyle w:val="Heading3"/>
+      </w:pPr>
+      <w:r>
+        <w:t>L1 — 6 V's: Exam Question Format</w:t>
+      </w:r>
+    </w:p>
+    <w:p>
+      <w:pPr>
+        <w:spacing w:before="40" w:after="80"/>
+        <w:ind w:left="283"/>
+      </w:pPr>
+      <w:r>
+        <w:rPr>
+          <w:b/>
+          <w:color w:val="10B981"/>
+          <w:sz w:val="20"/>
+        </w:rPr>
+        <w:t xml:space="preserve">ELI5: </w:t>
+      </w:r>
+      <w:r>
+        <w:rPr>
+          <w:i/>
+          <w:color w:val="10B981"/>
+          <w:sz w:val="20"/>
+        </w:rPr>
+        <w:t>You'll get a company description paragraph. Your job: quote evidence for each V present, then suggest a technical fix. Think Volume=Spark, Velocity=streaming, Variety=data lake, Veracity=validation, Value=feature selection, Variability=retraining.</w:t>
+      </w:r>
+    </w:p>
+    <w:p>
+      <w:pPr>
+        <w:spacing w:after="80"/>
+      </w:pPr>
+      <w:r>
+        <w:rPr>
+          <w:sz w:val="21"/>
+        </w:rPr>
+        <w:t>Dr. Fong will give a short company paragraph. You need to:</w:t>
+      </w:r>
+    </w:p>
+    <w:p>
+      <w:pPr>
+        <w:pStyle w:val="ListNumber"/>
+      </w:pPr>
+      <w:r>
+        <w:rPr>
+          <w:sz w:val="21"/>
+        </w:rPr>
+        <w:t>Identify which V's are evidenced in the passage (highlight/quote specific phrases)</w:t>
+      </w:r>
+    </w:p>
+    <w:p>
+      <w:pPr>
+        <w:pStyle w:val="ListNumber"/>
+      </w:pPr>
+      <w:r>
+        <w:rPr>
+          <w:sz w:val="21"/>
+        </w:rPr>
+        <w:t>Propose a solution for each V identified</w:t>
+      </w:r>
+    </w:p>
+    <w:tbl>
+      <w:tblPr>
+        <w:tblStyle w:val="TableGrid"/>
+        <w:tblW w:type="auto" w:w="0"/>
+        <w:tblLook w:firstColumn="1" w:firstRow="1" w:lastColumn="0" w:lastRow="0" w:noHBand="0" w:noVBand="1" w:val="04A0"/>
+      </w:tblPr>
+      <w:tblGrid>
+        <w:gridCol w:w="3249"/>
+        <w:gridCol w:w="3249"/>
+        <w:gridCol w:w="3249"/>
+      </w:tblGrid>
+      <w:tr>
+        <w:tc>
+          <w:tcPr>
+            <w:tcW w:type="dxa" w:w="3249"/>
+            <w:shd w:val="clear" w:color="auto" w:fill="D1D5DB"/>
+          </w:tcPr>
+          <w:p>
+            <w:r>
+              <w:rPr>
+                <w:b/>
+                <w:sz w:val="19"/>
+              </w:rPr>
+            </w:r>
+            <w:r>
+              <w:rPr>
+                <w:b/>
+                <w:sz w:val="19"/>
+              </w:rPr>
+              <w:t>V</w:t>
+            </w:r>
+          </w:p>
+        </w:tc>
+        <w:tc>
+          <w:tcPr>
+            <w:tcW w:type="dxa" w:w="3249"/>
+            <w:shd w:val="clear" w:color="auto" w:fill="D1D5DB"/>
+          </w:tcPr>
+          <w:p>
+            <w:r>
+              <w:rPr>
+                <w:b/>
+                <w:sz w:val="19"/>
+              </w:rPr>
+            </w:r>
+            <w:r>
+              <w:rPr>
+                <w:b/>
+                <w:sz w:val="19"/>
+              </w:rPr>
+              <w:t>Evidence to look for in passage</w:t>
+            </w:r>
+          </w:p>
+        </w:tc>
+        <w:tc>
+          <w:tcPr>
+            <w:tcW w:type="dxa" w:w="3249"/>
+            <w:shd w:val="clear" w:color="auto" w:fill="D1D5DB"/>
+          </w:tcPr>
+          <w:p>
+            <w:r>
+              <w:rPr>
+                <w:b/>
+                <w:sz w:val="19"/>
+              </w:rPr>
+            </w:r>
+            <w:r>
+              <w:rPr>
+                <w:b/>
+                <w:sz w:val="19"/>
+              </w:rPr>
+              <w:t>Suggested solution to propose</w:t>
+            </w:r>
+          </w:p>
+        </w:tc>
+      </w:tr>
+      <w:tr>
+        <w:tc>
+          <w:tcPr>
+            <w:tcW w:type="dxa" w:w="3249"/>
+          </w:tcPr>
+          <w:p>
+            <w:r>
+              <w:rPr>
+                <w:sz w:val="19"/>
+              </w:rPr>
+            </w:r>
+            <w:r>
+              <w:rPr>
+                <w:sz w:val="19"/>
+              </w:rPr>
+              <w:t>Volume</w:t>
+            </w:r>
+          </w:p>
+        </w:tc>
+        <w:tc>
+          <w:tcPr>
+            <w:tcW w:type="dxa" w:w="3249"/>
+          </w:tcPr>
+          <w:p>
+            <w:r>
+              <w:rPr>
+                <w:sz w:val="19"/>
+              </w:rPr>
+            </w:r>
+            <w:r>
+              <w:rPr>
+                <w:sz w:val="19"/>
+              </w:rPr>
+              <w:t>Large amounts of data, millions of records, petabytes</w:t>
+            </w:r>
+          </w:p>
+        </w:tc>
+        <w:tc>
+          <w:tcPr>
+            <w:tcW w:type="dxa" w:w="3249"/>
+          </w:tcPr>
+          <w:p>
+            <w:r>
+              <w:rPr>
+                <w:sz w:val="19"/>
+              </w:rPr>
+            </w:r>
+            <w:r>
+              <w:rPr>
+                <w:sz w:val="19"/>
+              </w:rPr>
+              <w:t>Hadoop/HDFS for storage; Spark for batch processing</w:t>
+            </w:r>
+          </w:p>
+        </w:tc>
+      </w:tr>
+      <w:tr>
+        <w:tc>
+          <w:tcPr>
+            <w:tcW w:type="dxa" w:w="3249"/>
+          </w:tcPr>
+          <w:p>
+            <w:r>
+              <w:rPr>
+                <w:sz w:val="19"/>
+              </w:rPr>
+            </w:r>
+            <w:r>
+              <w:rPr>
+                <w:sz w:val="19"/>
+              </w:rPr>
+              <w:t>Velocity</w:t>
+            </w:r>
+          </w:p>
+        </w:tc>
+        <w:tc>
+          <w:tcPr>
+            <w:tcW w:type="dxa" w:w="3249"/>
+          </w:tcPr>
+          <w:p>
+            <w:r>
+              <w:rPr>
+                <w:sz w:val="19"/>
+              </w:rPr>
+            </w:r>
+            <w:r>
+              <w:rPr>
+                <w:sz w:val="19"/>
+              </w:rPr>
+              <w:t>"Real-time", fast-arriving data, streaming</w:t>
+            </w:r>
+          </w:p>
+        </w:tc>
+        <w:tc>
+          <w:tcPr>
+            <w:tcW w:type="dxa" w:w="3249"/>
+          </w:tcPr>
+          <w:p>
+            <w:r>
+              <w:rPr>
+                <w:sz w:val="19"/>
+              </w:rPr>
+            </w:r>
+            <w:r>
+              <w:rPr>
+                <w:sz w:val="19"/>
+              </w:rPr>
+              <w:t>Streaming pipeline; Spark Streaming / Kafka</w:t>
+            </w:r>
+          </w:p>
+        </w:tc>
+      </w:tr>
+      <w:tr>
+        <w:tc>
+          <w:tcPr>
+            <w:tcW w:type="dxa" w:w="3249"/>
+          </w:tcPr>
+          <w:p>
+            <w:r>
+              <w:rPr>
+                <w:sz w:val="19"/>
+              </w:rPr>
+            </w:r>
+            <w:r>
+              <w:rPr>
+                <w:sz w:val="19"/>
+              </w:rPr>
+              <w:t>Variety</w:t>
+            </w:r>
+          </w:p>
+        </w:tc>
+        <w:tc>
+          <w:tcPr>
+            <w:tcW w:type="dxa" w:w="3249"/>
+          </w:tcPr>
+          <w:p>
+            <w:r>
+              <w:rPr>
+                <w:sz w:val="19"/>
+              </w:rPr>
+            </w:r>
+            <w:r>
+              <w:rPr>
+                <w:sz w:val="19"/>
+              </w:rPr>
+              <w:t>Multiple formats: JSON, CSV, video, text, structured + unstructured</w:t>
+            </w:r>
+          </w:p>
+        </w:tc>
+        <w:tc>
+          <w:tcPr>
+            <w:tcW w:type="dxa" w:w="3249"/>
+          </w:tcPr>
+          <w:p>
+            <w:r>
+              <w:rPr>
+                <w:sz w:val="19"/>
+              </w:rPr>
+            </w:r>
+            <w:r>
+              <w:rPr>
+                <w:sz w:val="19"/>
+              </w:rPr>
+              <w:t>Data Lake; flexible NoSQL schema</w:t>
+            </w:r>
+          </w:p>
+        </w:tc>
+      </w:tr>
+      <w:tr>
+        <w:tc>
+          <w:tcPr>
+            <w:tcW w:type="dxa" w:w="3249"/>
+          </w:tcPr>
+          <w:p>
+            <w:r>
+              <w:rPr>
+                <w:sz w:val="19"/>
+              </w:rPr>
+            </w:r>
+            <w:r>
+              <w:rPr>
+                <w:sz w:val="19"/>
+              </w:rPr>
+              <w:t>Veracity</w:t>
+            </w:r>
+          </w:p>
+        </w:tc>
+        <w:tc>
+          <w:tcPr>
+            <w:tcW w:type="dxa" w:w="3249"/>
+          </w:tcPr>
+          <w:p>
+            <w:r>
+              <w:rPr>
+                <w:sz w:val="19"/>
+              </w:rPr>
+            </w:r>
+            <w:r>
+              <w:rPr>
+                <w:sz w:val="19"/>
+              </w:rPr>
+              <w:t>"Noisy", inaccurate, inconsistent, missing values</w:t>
+            </w:r>
+          </w:p>
+        </w:tc>
+        <w:tc>
+          <w:tcPr>
+            <w:tcW w:type="dxa" w:w="3249"/>
+          </w:tcPr>
+          <w:p>
+            <w:r>
+              <w:rPr>
+                <w:sz w:val="19"/>
+              </w:rPr>
+            </w:r>
+            <w:r>
+              <w:rPr>
+                <w:sz w:val="19"/>
+              </w:rPr>
+              <w:t>Data validation pipeline; data cleaning; quality checks</w:t>
+            </w:r>
+          </w:p>
+        </w:tc>
+      </w:tr>
+      <w:tr>
+        <w:tc>
+          <w:tcPr>
+            <w:tcW w:type="dxa" w:w="3249"/>
+          </w:tcPr>
+          <w:p>
+            <w:r>
+              <w:rPr>
+                <w:sz w:val="19"/>
+              </w:rPr>
+            </w:r>
+            <w:r>
+              <w:rPr>
+                <w:sz w:val="19"/>
+              </w:rPr>
+              <w:t>Value</w:t>
+            </w:r>
+          </w:p>
+        </w:tc>
+        <w:tc>
+          <w:tcPr>
+            <w:tcW w:type="dxa" w:w="3249"/>
+          </w:tcPr>
+          <w:p>
+            <w:r>
+              <w:rPr>
+                <w:sz w:val="19"/>
+              </w:rPr>
+            </w:r>
+            <w:r>
+              <w:rPr>
+                <w:sz w:val="19"/>
+              </w:rPr>
+              <w:t>Not all data is useful; long processing = less value</w:t>
+            </w:r>
+          </w:p>
+        </w:tc>
+        <w:tc>
+          <w:tcPr>
+            <w:tcW w:type="dxa" w:w="3249"/>
+          </w:tcPr>
+          <w:p>
+            <w:r>
+              <w:rPr>
+                <w:sz w:val="19"/>
+              </w:rPr>
+            </w:r>
+            <w:r>
+              <w:rPr>
+                <w:sz w:val="19"/>
+              </w:rPr>
+              <w:t>Feature selection; prioritise high-value data processing</w:t>
+            </w:r>
+          </w:p>
+        </w:tc>
+      </w:tr>
+      <w:tr>
+        <w:tc>
+          <w:tcPr>
+            <w:tcW w:type="dxa" w:w="3249"/>
+          </w:tcPr>
+          <w:p>
+            <w:r>
+              <w:rPr>
+                <w:sz w:val="19"/>
+              </w:rPr>
+            </w:r>
+            <w:r>
+              <w:rPr>
+                <w:sz w:val="19"/>
+              </w:rPr>
+              <w:t>Variability</w:t>
+            </w:r>
+          </w:p>
+        </w:tc>
+        <w:tc>
+          <w:tcPr>
+            <w:tcW w:type="dxa" w:w="3249"/>
+          </w:tcPr>
+          <w:p>
+            <w:r>
+              <w:rPr>
+                <w:sz w:val="19"/>
+              </w:rPr>
+            </w:r>
+            <w:r>
+              <w:rPr>
+                <w:sz w:val="19"/>
+              </w:rPr>
+              <w:t>User preferences change, data meaning shifts over time</w:t>
+            </w:r>
+          </w:p>
+        </w:tc>
+        <w:tc>
+          <w:tcPr>
+            <w:tcW w:type="dxa" w:w="3249"/>
+          </w:tcPr>
+          <w:p>
+            <w:r>
+              <w:rPr>
+                <w:sz w:val="19"/>
+              </w:rPr>
+            </w:r>
+            <w:r>
+              <w:rPr>
+                <w:sz w:val="19"/>
+              </w:rPr>
+              <w:t>Re-training models periodically; adaptive systems</w:t>
+            </w:r>
+          </w:p>
+        </w:tc>
+      </w:tr>
+    </w:tbl>
+    <w:p/>
+    <w:p>
+      <w:pPr>
+        <w:pStyle w:val="Heading3"/>
+      </w:pPr>
+      <w:r>
+        <w:t>L3 — MapReduce: What to Know for Exam</w:t>
+      </w:r>
+    </w:p>
+    <w:p>
+      <w:pPr>
+        <w:spacing w:before="40" w:after="80"/>
+        <w:ind w:left="283"/>
+      </w:pPr>
+      <w:r>
+        <w:rPr>
+          <w:b/>
+          <w:color w:val="10B981"/>
+          <w:sz w:val="20"/>
+        </w:rPr>
+        <w:t xml:space="preserve">ELI5: </w:t>
+      </w:r>
+      <w:r>
+        <w:rPr>
+          <w:i/>
+          <w:color w:val="10B981"/>
+          <w:sz w:val="20"/>
+        </w:rPr>
+        <w:t>Three stages: Mapper (emit key-value pairs) → Shuffle (system groups same keys together automatically) → Reducer (aggregate). The shuffle is automatic but you MUST mention it — many students forget and lose marks.</w:t>
+      </w:r>
+    </w:p>
+    <w:p>
+      <w:pPr>
+        <w:spacing w:after="80"/>
+      </w:pPr>
+      <w:r>
+        <w:rPr>
+          <w:sz w:val="21"/>
+        </w:rPr>
+        <w:t xml:space="preserve">The exam question will ask you to trace through a MapReduce job. Know the </w:t>
+      </w:r>
+      <w:r>
+        <w:rPr>
+          <w:b/>
+          <w:sz w:val="21"/>
+        </w:rPr>
+        <w:t>3 stages</w:t>
+      </w:r>
+      <w:r>
+        <w:rPr>
+          <w:sz w:val="21"/>
+        </w:rPr>
+        <w:t>:</w:t>
+      </w:r>
+    </w:p>
+    <w:p>
+      <w:pPr>
+        <w:ind w:left="170"/>
+      </w:pPr>
+      <w:r>
+        <w:rPr>
+          <w:b/>
+          <w:color w:val="2563EB"/>
+        </w:rPr>
+        <w:t xml:space="preserve">Step 1: </w:t>
+      </w:r>
+      <w:r>
+        <w:rPr>
+          <w:sz w:val="21"/>
+        </w:rPr>
+        <w:t>Mapper— processes each input record, emits (key, value) pairs. E.g., word count: emit (word, 1) for every word.</w:t>
+      </w:r>
+    </w:p>
+    <w:p>
+      <w:pPr>
+        <w:ind w:left="170"/>
+      </w:pPr>
+      <w:r>
+        <w:rPr>
+          <w:b/>
+          <w:color w:val="2563EB"/>
+        </w:rPr>
+        <w:t xml:space="preserve">Step 2: </w:t>
+      </w:r>
+      <w:r>
+        <w:rPr>
+          <w:sz w:val="21"/>
+        </w:rPr>
+        <w:t>Shuffle &amp; Sort— system automatically groups all values for the same key together. E.g., ("hello", [1,1,1]). This step is automatic — you don't code it but MUST describe it.</w:t>
+      </w:r>
+    </w:p>
+    <w:p>
+      <w:pPr>
+        <w:ind w:left="170"/>
+      </w:pPr>
+      <w:r>
+        <w:rPr>
+          <w:b/>
+          <w:color w:val="2563EB"/>
+        </w:rPr>
+        <w:t xml:space="preserve">Step 3: </w:t>
+      </w:r>
+      <w:r>
+        <w:rPr>
+          <w:sz w:val="21"/>
+        </w:rPr>
+        <w:t>Reducer— receives (key, [list of values]) and aggregates. E.g., sum the list → ("hello", 3).</w:t>
+      </w:r>
+    </w:p>
+    <w:p>
+      <w:pPr>
+        <w:spacing w:before="40" w:after="80"/>
+        <w:ind w:left="283"/>
+      </w:pPr>
+      <w:r>
+        <w:rPr>
+          <w:b/>
+          <w:color w:val="F59E0B"/>
+        </w:rPr>
+        <w:t xml:space="preserve">NOTE: </w:t>
+      </w:r>
+      <w:r>
+        <w:rPr>
+          <w:color w:val="92400E"/>
+          <w:sz w:val="20"/>
+        </w:rPr>
+        <w:t>Intermediate result format:After mapper: (word, 1). After shuffle: (word, [1, 1, 1, …]). After reducer: (word, count). Know these intermediate formats.</w:t>
+      </w:r>
+    </w:p>
+    <w:p>
+      <w:pPr>
+        <w:spacing w:after="80"/>
+      </w:pPr>
+      <w:r>
+        <w:rPr>
+          <w:sz w:val="21"/>
+        </w:rPr>
+        <w:t>Why MapReduce is slow:</w:t>
+      </w:r>
+    </w:p>
+    <w:p>
+      <w:pPr>
+        <w:pStyle w:val="ListBullet"/>
+      </w:pPr>
+      <w:r>
+        <w:rPr>
+          <w:sz w:val="21"/>
+        </w:rPr>
+        <w:t>Writes intermediate results to disk after every stage (3× replication via HDFS)</w:t>
+      </w:r>
+    </w:p>
+    <w:p>
+      <w:pPr>
+        <w:pStyle w:val="ListBullet"/>
+      </w:pPr>
+      <w:r>
+        <w:rPr>
+          <w:sz w:val="21"/>
+        </w:rPr>
+        <w:t>Must express everything as mapper + reducer — no flexibility</w:t>
+      </w:r>
+    </w:p>
+    <w:p>
+      <w:pPr>
+        <w:pStyle w:val="ListBullet"/>
+      </w:pPr>
+      <w:r>
+        <w:rPr>
+          <w:sz w:val="21"/>
+        </w:rPr>
+        <w:t>Disk I/O is the bottleneck → Spark fixes this with in-memory RDD lineage</w:t>
+      </w:r>
+    </w:p>
+    <w:p>
+      <w:pPr>
+        <w:pStyle w:val="Heading3"/>
+      </w:pPr>
+      <w:r>
+        <w:t>L5 — BPE: Exam Question Format</w:t>
+      </w:r>
+    </w:p>
+    <w:p>
+      <w:pPr>
+        <w:spacing w:before="40" w:after="80"/>
+        <w:ind w:left="283"/>
+      </w:pPr>
+      <w:r>
+        <w:rPr>
+          <w:b/>
+          <w:color w:val="10B981"/>
+          <w:sz w:val="20"/>
+        </w:rPr>
+        <w:t xml:space="preserve">ELI5: </w:t>
+      </w:r>
+      <w:r>
+        <w:rPr>
+          <w:i/>
+          <w:color w:val="10B981"/>
+          <w:sz w:val="20"/>
+        </w:rPr>
+        <w:t>Dr. Fong sets vocabulary target size = 10. Start with characters, merge most-frequent pair each round, stop at 10 tokens. Unknown characters map to [UNK] shown as '?' in exam.</w:t>
+      </w:r>
+    </w:p>
+    <w:p>
+      <w:pPr>
+        <w:spacing w:after="80"/>
+      </w:pPr>
+      <w:r>
+        <w:rPr>
+          <w:sz w:val="21"/>
+        </w:rPr>
+        <w:t>Dr. Fong said: "In your examination, I only set to the 10 [vocabulary size], not 20." Steps:</w:t>
+      </w:r>
+    </w:p>
+    <w:p>
+      <w:pPr>
+        <w:ind w:left="170"/>
+      </w:pPr>
+      <w:r>
+        <w:rPr>
+          <w:b/>
+          <w:color w:val="2563EB"/>
+        </w:rPr>
+        <w:t xml:space="preserve">Step 1: </w:t>
+      </w:r>
+      <w:r>
+        <w:rPr>
+          <w:sz w:val="21"/>
+        </w:rPr>
+        <w:t>Split all words into individual characters (base vocabulary = all unique characters)</w:t>
+      </w:r>
+    </w:p>
+    <w:p>
+      <w:pPr>
+        <w:ind w:left="170"/>
+      </w:pPr>
+      <w:r>
+        <w:rPr>
+          <w:b/>
+          <w:color w:val="2563EB"/>
+        </w:rPr>
+        <w:t xml:space="preserve">Step 2: </w:t>
+      </w:r>
+      <w:r>
+        <w:rPr>
+          <w:sz w:val="21"/>
+        </w:rPr>
+        <w:t>Count all adjacent character pair frequencies across the corpus</w:t>
+      </w:r>
+    </w:p>
+    <w:p>
+      <w:pPr>
+        <w:ind w:left="170"/>
+      </w:pPr>
+      <w:r>
+        <w:rPr>
+          <w:b/>
+          <w:color w:val="2563EB"/>
+        </w:rPr>
+        <w:t xml:space="preserve">Step 3: </w:t>
+      </w:r>
+      <w:r>
+        <w:rPr>
+          <w:sz w:val="21"/>
+        </w:rPr>
+        <w:t>Merge the most frequent pair into a single token, add to vocabulary</w:t>
+      </w:r>
+    </w:p>
+    <w:p>
+      <w:pPr>
+        <w:ind w:left="170"/>
+      </w:pPr>
+      <w:r>
+        <w:rPr>
+          <w:b/>
+          <w:color w:val="2563EB"/>
+        </w:rPr>
+        <w:t xml:space="preserve">Step 4: </w:t>
+      </w:r>
+      <w:r>
+        <w:rPr>
+          <w:sz w:val="21"/>
+        </w:rPr>
+        <w:t>Repeat until vocabulary reaches target size (10 in exam)</w:t>
+      </w:r>
+    </w:p>
+    <w:p>
+      <w:pPr>
+        <w:spacing w:before="40" w:after="80"/>
+        <w:ind w:left="283"/>
+      </w:pPr>
+      <w:r>
+        <w:rPr>
+          <w:b/>
+          <w:color w:val="F59E0B"/>
+        </w:rPr>
+        <w:t xml:space="preserve">NOTE: </w:t>
+      </w:r>
+      <w:r>
+        <w:rPr>
+          <w:color w:val="92400E"/>
+          <w:sz w:val="20"/>
+        </w:rPr>
+        <w:t>Unknown token:If a character/pair doesn't appear in the trained vocabulary, it maps to [UNK] (shown as ? in Dr. Fong's slides). This is why BPE handles unknown words — it can always fall back to individual characters.</w:t>
+      </w:r>
+    </w:p>
+    <w:p>
+      <w:pPr>
+        <w:pStyle w:val="Heading3"/>
+      </w:pPr>
+      <w:r>
+        <w:t>L6 — Word Embeddings: Conceptual Points Only</w:t>
+      </w:r>
+    </w:p>
+    <w:p>
+      <w:pPr>
+        <w:spacing w:before="40" w:after="80"/>
+        <w:ind w:left="283"/>
+      </w:pPr>
+      <w:r>
+        <w:rPr>
+          <w:b/>
+          <w:color w:val="10B981"/>
+          <w:sz w:val="20"/>
+        </w:rPr>
+        <w:t xml:space="preserve">ELI5: </w:t>
+      </w:r>
+      <w:r>
+        <w:rPr>
+          <w:i/>
+          <w:color w:val="10B981"/>
+          <w:sz w:val="20"/>
+        </w:rPr>
+        <w:t>No math required. Know Skip-gram (centre→context) vs CBOW (context→centre), why softmax (probability distribution), why negative sampling (speed), and M = half-window size (2 words each side = M=2, not 4).</w:t>
+      </w:r>
+    </w:p>
+    <w:tbl>
+      <w:tblPr>
+        <w:tblStyle w:val="TableGrid"/>
+        <w:tblW w:type="auto" w:w="0"/>
+        <w:tblLook w:firstColumn="1" w:firstRow="1" w:lastColumn="0" w:lastRow="0" w:noHBand="0" w:noVBand="1" w:val="04A0"/>
+      </w:tblPr>
+      <w:tblGrid>
+        <w:gridCol w:w="4873"/>
+        <w:gridCol w:w="4873"/>
+      </w:tblGrid>
+      <w:tr>
+        <w:tc>
+          <w:tcPr>
+            <w:tcW w:type="dxa" w:w="4873"/>
+            <w:shd w:val="clear" w:color="auto" w:fill="D1D5DB"/>
+          </w:tcPr>
+          <w:p>
+            <w:r>
+              <w:rPr>
+                <w:b/>
+                <w:sz w:val="19"/>
+              </w:rPr>
+            </w:r>
+            <w:r>
+              <w:rPr>
+                <w:b/>
+                <w:sz w:val="19"/>
+              </w:rPr>
+              <w:t>Concept</w:t>
+            </w:r>
+          </w:p>
+        </w:tc>
+        <w:tc>
+          <w:tcPr>
+            <w:tcW w:type="dxa" w:w="4873"/>
+            <w:shd w:val="clear" w:color="auto" w:fill="D1D5DB"/>
+          </w:tcPr>
+          <w:p>
+            <w:r>
+              <w:rPr>
+                <w:b/>
+                <w:sz w:val="19"/>
+              </w:rPr>
+            </w:r>
+            <w:r>
+              <w:rPr>
+                <w:b/>
+                <w:sz w:val="19"/>
+              </w:rPr>
+              <w:t>What to know (no equations needed)</w:t>
+            </w:r>
+          </w:p>
+        </w:tc>
+      </w:tr>
+      <w:tr>
+        <w:tc>
+          <w:tcPr>
+            <w:tcW w:type="dxa" w:w="4873"/>
+          </w:tcPr>
+          <w:p>
+            <w:r>
+              <w:rPr>
+                <w:sz w:val="19"/>
+              </w:rPr>
+            </w:r>
+            <w:r>
+              <w:rPr>
+                <w:sz w:val="19"/>
+              </w:rPr>
+              <w:t>Skip-gram</w:t>
+            </w:r>
+          </w:p>
+        </w:tc>
+        <w:tc>
+          <w:tcPr>
+            <w:tcW w:type="dxa" w:w="4873"/>
+          </w:tcPr>
+          <w:p>
+            <w:r>
+              <w:rPr>
+                <w:sz w:val="19"/>
+              </w:rPr>
+            </w:r>
+            <w:r>
+              <w:rPr>
+                <w:sz w:val="19"/>
+              </w:rPr>
+              <w:t>Input = centre word → predict context (surrounding) words</w:t>
+            </w:r>
+          </w:p>
+        </w:tc>
+      </w:tr>
+      <w:tr>
+        <w:tc>
+          <w:tcPr>
+            <w:tcW w:type="dxa" w:w="4873"/>
+          </w:tcPr>
+          <w:p>
+            <w:r>
+              <w:rPr>
+                <w:sz w:val="19"/>
+              </w:rPr>
+            </w:r>
+            <w:r>
+              <w:rPr>
+                <w:sz w:val="19"/>
+              </w:rPr>
+              <w:t>CBOW</w:t>
+            </w:r>
+          </w:p>
+        </w:tc>
+        <w:tc>
+          <w:tcPr>
+            <w:tcW w:type="dxa" w:w="4873"/>
+          </w:tcPr>
+          <w:p>
+            <w:r>
+              <w:rPr>
+                <w:sz w:val="19"/>
+              </w:rPr>
+            </w:r>
+            <w:r>
+              <w:rPr>
+                <w:sz w:val="19"/>
+              </w:rPr>
+              <w:t>Input = context words → predict centre word. Average context embeddings in hidden layer.</w:t>
+            </w:r>
+          </w:p>
+        </w:tc>
+      </w:tr>
+      <w:tr>
+        <w:tc>
+          <w:tcPr>
+            <w:tcW w:type="dxa" w:w="4873"/>
+          </w:tcPr>
+          <w:p>
+            <w:r>
+              <w:rPr>
+                <w:sz w:val="19"/>
+              </w:rPr>
+            </w:r>
+            <w:r>
+              <w:rPr>
+                <w:sz w:val="19"/>
+              </w:rPr>
+              <w:t>Why softmax?</w:t>
+            </w:r>
+          </w:p>
+        </w:tc>
+        <w:tc>
+          <w:tcPr>
+            <w:tcW w:type="dxa" w:w="4873"/>
+          </w:tcPr>
+          <w:p>
+            <w:r>
+              <w:rPr>
+                <w:sz w:val="19"/>
+              </w:rPr>
+            </w:r>
+            <w:r>
+              <w:rPr>
+                <w:sz w:val="19"/>
+              </w:rPr>
+              <w:t>Ensures output probabilities sum to 1 and are in [0, 1]. Converts raw scores to probability distribution.</w:t>
+            </w:r>
+          </w:p>
+        </w:tc>
+      </w:tr>
+      <w:tr>
+        <w:tc>
+          <w:tcPr>
+            <w:tcW w:type="dxa" w:w="4873"/>
+          </w:tcPr>
+          <w:p>
+            <w:r>
+              <w:rPr>
+                <w:sz w:val="19"/>
+              </w:rPr>
+            </w:r>
+            <w:r>
+              <w:rPr>
+                <w:sz w:val="19"/>
+              </w:rPr>
+              <w:t>Why negative sampling?</w:t>
+            </w:r>
+          </w:p>
+        </w:tc>
+        <w:tc>
+          <w:tcPr>
+            <w:tcW w:type="dxa" w:w="4873"/>
+          </w:tcPr>
+          <w:p>
+            <w:r>
+              <w:rPr>
+                <w:sz w:val="19"/>
+              </w:rPr>
+            </w:r>
+            <w:r>
+              <w:rPr>
+                <w:sz w:val="19"/>
+              </w:rPr>
+              <w:t>Full softmax over large vocabulary is too slow. Sample k random "negative" words instead.</w:t>
+            </w:r>
+          </w:p>
+        </w:tc>
+      </w:tr>
+      <w:tr>
+        <w:tc>
+          <w:tcPr>
+            <w:tcW w:type="dxa" w:w="4873"/>
+          </w:tcPr>
+          <w:p>
+            <w:r>
+              <w:rPr>
+                <w:sz w:val="19"/>
+              </w:rPr>
+            </w:r>
+            <w:r>
+              <w:rPr>
+                <w:sz w:val="19"/>
+              </w:rPr>
+              <w:t>Two embeddings per word</w:t>
+            </w:r>
+          </w:p>
+        </w:tc>
+        <w:tc>
+          <w:tcPr>
+            <w:tcW w:type="dxa" w:w="4873"/>
+          </w:tcPr>
+          <w:p>
+            <w:r>
+              <w:rPr>
+                <w:sz w:val="19"/>
+              </w:rPr>
+            </w:r>
+            <w:r>
+              <w:rPr>
+                <w:sz w:val="19"/>
+              </w:rPr>
+              <w:t>Centre word embedding (W) + Context word embedding (W'). Usually use centre embeddings as final vectors.</w:t>
+            </w:r>
+          </w:p>
+        </w:tc>
+      </w:tr>
+      <w:tr>
+        <w:tc>
+          <w:tcPr>
+            <w:tcW w:type="dxa" w:w="4873"/>
+          </w:tcPr>
+          <w:p>
+            <w:r>
+              <w:rPr>
+                <w:sz w:val="19"/>
+              </w:rPr>
+            </w:r>
+            <w:r>
+              <w:rPr>
+                <w:sz w:val="19"/>
+              </w:rPr>
+              <w:t>Window size M</w:t>
+            </w:r>
+          </w:p>
+        </w:tc>
+        <w:tc>
+          <w:tcPr>
+            <w:tcW w:type="dxa" w:w="4873"/>
+          </w:tcPr>
+          <w:p>
+            <w:r>
+              <w:rPr>
+                <w:sz w:val="19"/>
+              </w:rPr>
+            </w:r>
+            <w:r>
+              <w:rPr>
+                <w:sz w:val="19"/>
+              </w:rPr>
+              <w:t>M = half-window. If 2 words each side, M = 2. Total context = 2M words. CBOW averages 2M vectors, divides by 2M.</w:t>
+            </w:r>
+          </w:p>
+        </w:tc>
+      </w:tr>
+    </w:tbl>
+    <w:p/>
+    <w:p>
+      <w:pPr>
+        <w:pStyle w:val="Heading3"/>
+      </w:pPr>
+      <w:r>
+        <w:t>L7 — PageRank: How to Build the Adjacency Matrix</w:t>
+      </w:r>
+    </w:p>
+    <w:p>
+      <w:pPr>
+        <w:spacing w:before="40" w:after="80"/>
+        <w:ind w:left="283"/>
+      </w:pPr>
+      <w:r>
+        <w:rPr>
+          <w:b/>
+          <w:color w:val="10B981"/>
+          <w:sz w:val="20"/>
+        </w:rPr>
+        <w:t xml:space="preserve">ELI5: </w:t>
+      </w:r>
+      <w:r>
+        <w:rPr>
+          <w:i/>
+          <w:color w:val="10B981"/>
+          <w:sz w:val="20"/>
+        </w:rPr>
+        <w:t>SOURCE at TOP (columns), DESTINATION at LEFT (rows). Column sums must equal 1. This is the same orientation as the Levenshtein table. Memorise: source=top, target/destination=left.</w:t>
+      </w:r>
+    </w:p>
+    <w:p>
+      <w:pPr>
+        <w:spacing w:before="40" w:after="80"/>
+        <w:ind w:left="283"/>
+      </w:pPr>
+      <w:r>
+        <w:rPr>
+          <w:b/>
+          <w:color w:val="F59E0B"/>
+        </w:rPr>
+        <w:t xml:space="preserve">NOTE: </w:t>
+      </w:r>
+      <w:r>
+        <w:rPr>
+          <w:color w:val="92400E"/>
+          <w:sz w:val="20"/>
+        </w:rPr>
+        <w:t>Orientation rule (from Dr. Fong):Source node = TOP (columns). Destination node = LEFT (rows). Column sums = 1. "Every semester students mix this up."</w:t>
+      </w:r>
+    </w:p>
+    <w:p>
+      <w:pPr>
+        <w:spacing w:after="80"/>
+      </w:pPr>
+      <w:r>
+        <w:rPr>
+          <w:sz w:val="21"/>
+        </w:rPr>
+        <w:t>Example — 3 nodes, edges: A→B, A→C, B→C, C→A:</w:t>
+      </w:r>
+    </w:p>
+    <w:tbl>
+      <w:tblPr>
+        <w:tblStyle w:val="TableGrid"/>
+        <w:tblW w:type="auto" w:w="0"/>
+        <w:tblLook w:firstColumn="1" w:firstRow="1" w:lastColumn="0" w:lastRow="0" w:noHBand="0" w:noVBand="1" w:val="04A0"/>
+      </w:tblPr>
+      <w:tblGrid>
+        <w:gridCol w:w="2436"/>
+        <w:gridCol w:w="2436"/>
+        <w:gridCol w:w="2436"/>
+        <w:gridCol w:w="2436"/>
+      </w:tblGrid>
+      <w:tr>
+        <w:tc>
+          <w:tcPr>
+            <w:tcW w:type="dxa" w:w="2436"/>
+            <w:shd w:val="clear" w:color="auto" w:fill="D1D5DB"/>
+          </w:tcPr>
+          <w:p>
+            <w:r>
+              <w:rPr>
+                <w:b/>
+                <w:sz w:val="19"/>
+              </w:rPr>
+            </w:r>
+            <w:r>
+              <w:rPr>
+                <w:b/>
+                <w:sz w:val="19"/>
+              </w:rPr>
+              <w:t>From→ / To↓</w:t>
+            </w:r>
+          </w:p>
+        </w:tc>
+        <w:tc>
+          <w:tcPr>
+            <w:tcW w:type="dxa" w:w="2436"/>
+            <w:shd w:val="clear" w:color="auto" w:fill="D1D5DB"/>
+          </w:tcPr>
+          <w:p>
+            <w:r>
+              <w:rPr>
+                <w:b/>
+                <w:sz w:val="19"/>
+              </w:rPr>
+            </w:r>
+            <w:r>
+              <w:rPr>
+                <w:b/>
+                <w:sz w:val="19"/>
+              </w:rPr>
+              <w:t>A (source)</w:t>
+            </w:r>
+          </w:p>
+        </w:tc>
+        <w:tc>
+          <w:tcPr>
+            <w:tcW w:type="dxa" w:w="2436"/>
+            <w:shd w:val="clear" w:color="auto" w:fill="D1D5DB"/>
+          </w:tcPr>
+          <w:p>
+            <w:r>
+              <w:rPr>
+                <w:b/>
+                <w:sz w:val="19"/>
+              </w:rPr>
+            </w:r>
+            <w:r>
+              <w:rPr>
+                <w:b/>
+                <w:sz w:val="19"/>
+              </w:rPr>
+              <w:t>B (source)</w:t>
+            </w:r>
+          </w:p>
+        </w:tc>
+        <w:tc>
+          <w:tcPr>
+            <w:tcW w:type="dxa" w:w="2436"/>
+            <w:shd w:val="clear" w:color="auto" w:fill="D1D5DB"/>
+          </w:tcPr>
+          <w:p>
+            <w:r>
+              <w:rPr>
+                <w:b/>
+                <w:sz w:val="19"/>
+              </w:rPr>
+            </w:r>
+            <w:r>
+              <w:rPr>
+                <w:b/>
+                <w:sz w:val="19"/>
+              </w:rPr>
+              <w:t>C (source)</w:t>
+            </w:r>
+          </w:p>
+        </w:tc>
+      </w:tr>
+      <w:tr>
+        <w:tc>
+          <w:tcPr>
+            <w:tcW w:type="dxa" w:w="2436"/>
+          </w:tcPr>
+          <w:p>
+            <w:r>
+              <w:rPr>
+                <w:sz w:val="19"/>
+              </w:rPr>
+            </w:r>
+            <w:r>
+              <w:rPr>
+                <w:b/>
+                <w:sz w:val="19"/>
+              </w:rPr>
+              <w:t>A (dest)</w:t>
+            </w:r>
+          </w:p>
+        </w:tc>
+        <w:tc>
+          <w:tcPr>
+            <w:tcW w:type="dxa" w:w="2436"/>
+          </w:tcPr>
+          <w:p>
+            <w:r>
+              <w:rPr>
+                <w:sz w:val="19"/>
+              </w:rPr>
+            </w:r>
+            <w:r>
+              <w:rPr>
+                <w:sz w:val="19"/>
+              </w:rPr>
+              <w:t>0</w:t>
+            </w:r>
+          </w:p>
+        </w:tc>
+        <w:tc>
+          <w:tcPr>
+            <w:tcW w:type="dxa" w:w="2436"/>
+          </w:tcPr>
+          <w:p>
+            <w:r>
+              <w:rPr>
+                <w:sz w:val="19"/>
+              </w:rPr>
+            </w:r>
+            <w:r>
+              <w:rPr>
+                <w:sz w:val="19"/>
+              </w:rPr>
+              <w:t>0</w:t>
+            </w:r>
+          </w:p>
+        </w:tc>
+        <w:tc>
+          <w:tcPr>
+            <w:tcW w:type="dxa" w:w="2436"/>
+          </w:tcPr>
+          <w:p>
+            <w:r>
+              <w:rPr>
+                <w:sz w:val="19"/>
+              </w:rPr>
+            </w:r>
+            <w:r>
+              <w:rPr>
+                <w:sz w:val="19"/>
+              </w:rPr>
+              <w:t>1</w:t>
+            </w:r>
+          </w:p>
+        </w:tc>
+      </w:tr>
+      <w:tr>
+        <w:tc>
+          <w:tcPr>
+            <w:tcW w:type="dxa" w:w="2436"/>
+          </w:tcPr>
+          <w:p>
+            <w:r>
+              <w:rPr>
+                <w:sz w:val="19"/>
+              </w:rPr>
+            </w:r>
+            <w:r>
+              <w:rPr>
+                <w:b/>
+                <w:sz w:val="19"/>
+              </w:rPr>
+              <w:t>B (dest)</w:t>
+            </w:r>
+          </w:p>
+        </w:tc>
+        <w:tc>
+          <w:tcPr>
+            <w:tcW w:type="dxa" w:w="2436"/>
+          </w:tcPr>
+          <w:p>
+            <w:r>
+              <w:rPr>
+                <w:sz w:val="19"/>
+              </w:rPr>
+            </w:r>
+            <w:r>
+              <w:rPr>
+                <w:sz w:val="19"/>
+              </w:rPr>
+              <w:t>1/2</w:t>
+            </w:r>
+          </w:p>
+        </w:tc>
+        <w:tc>
+          <w:tcPr>
+            <w:tcW w:type="dxa" w:w="2436"/>
+          </w:tcPr>
+          <w:p>
+            <w:r>
+              <w:rPr>
+                <w:sz w:val="19"/>
+              </w:rPr>
+            </w:r>
+            <w:r>
+              <w:rPr>
+                <w:sz w:val="19"/>
+              </w:rPr>
+              <w:t>0</w:t>
+            </w:r>
+          </w:p>
+        </w:tc>
+        <w:tc>
+          <w:tcPr>
+            <w:tcW w:type="dxa" w:w="2436"/>
+          </w:tcPr>
+          <w:p>
+            <w:r>
+              <w:rPr>
+                <w:sz w:val="19"/>
+              </w:rPr>
+            </w:r>
+            <w:r>
+              <w:rPr>
+                <w:sz w:val="19"/>
+              </w:rPr>
+              <w:t>0</w:t>
+            </w:r>
+          </w:p>
+        </w:tc>
+      </w:tr>
+      <w:tr>
+        <w:tc>
+          <w:tcPr>
+            <w:tcW w:type="dxa" w:w="2436"/>
+          </w:tcPr>
+          <w:p>
+            <w:r>
+              <w:rPr>
+                <w:sz w:val="19"/>
+              </w:rPr>
+            </w:r>
+            <w:r>
+              <w:rPr>
+                <w:b/>
+                <w:sz w:val="19"/>
+              </w:rPr>
+              <w:t>C (dest)</w:t>
+            </w:r>
+          </w:p>
+        </w:tc>
+        <w:tc>
+          <w:tcPr>
+            <w:tcW w:type="dxa" w:w="2436"/>
+          </w:tcPr>
+          <w:p>
+            <w:r>
+              <w:rPr>
+                <w:sz w:val="19"/>
+              </w:rPr>
+            </w:r>
+            <w:r>
+              <w:rPr>
+                <w:sz w:val="19"/>
+              </w:rPr>
+              <w:t>1/2</w:t>
+            </w:r>
+          </w:p>
+        </w:tc>
+        <w:tc>
+          <w:tcPr>
+            <w:tcW w:type="dxa" w:w="2436"/>
+          </w:tcPr>
+          <w:p>
+            <w:r>
+              <w:rPr>
+                <w:sz w:val="19"/>
+              </w:rPr>
+            </w:r>
+            <w:r>
+              <w:rPr>
+                <w:sz w:val="19"/>
+              </w:rPr>
+              <w:t>1</w:t>
+            </w:r>
+          </w:p>
+        </w:tc>
+        <w:tc>
+          <w:tcPr>
+            <w:tcW w:type="dxa" w:w="2436"/>
+          </w:tcPr>
+          <w:p>
+            <w:r>
+              <w:rPr>
+                <w:sz w:val="19"/>
+              </w:rPr>
+            </w:r>
+            <w:r>
+              <w:rPr>
+                <w:sz w:val="19"/>
+              </w:rPr>
+              <w:t>0</w:t>
+            </w:r>
+          </w:p>
+        </w:tc>
+      </w:tr>
+    </w:tbl>
+    <w:p/>
+    <w:p>
+      <w:pPr>
+        <w:spacing w:after="80"/>
+      </w:pPr>
+      <w:r>
+        <w:rPr>
+          <w:sz w:val="21"/>
+        </w:rPr>
+        <w:t>Column A sums to 1 (A has 2 outlinks, each gets 1/2). Column C sums to 1 (C has 1 outlink to A).</w:t>
+      </w:r>
+    </w:p>
+    <w:p>
+      <w:pPr>
+        <w:pStyle w:val="Heading3"/>
+      </w:pPr>
+      <w:r>
+        <w:t>L8 — Graph Analytics: What's Tested vs Not</w:t>
+      </w:r>
+    </w:p>
+    <w:p>
+      <w:pPr>
+        <w:spacing w:before="40" w:after="80"/>
+        <w:ind w:left="283"/>
+      </w:pPr>
+      <w:r>
+        <w:rPr>
+          <w:b/>
+          <w:color w:val="10B981"/>
+          <w:sz w:val="20"/>
+        </w:rPr>
+        <w:t xml:space="preserve">ELI5: </w:t>
+      </w:r>
+      <w:r>
+        <w:rPr>
+          <w:i/>
+          <w:color w:val="10B981"/>
+          <w:sz w:val="20"/>
+        </w:rPr>
+        <w:t>Edge betweenness is NOT tested. Vertex betweenness IS tested. Closeness centrality: know the disconnected graph problem and harmonic centrality fix. Density formula: 2|E|/N(N-1) for undirected.</w:t>
+      </w:r>
+    </w:p>
+    <w:tbl>
+      <w:tblPr>
+        <w:tblStyle w:val="TableGrid"/>
+        <w:tblW w:type="auto" w:w="0"/>
+        <w:tblLook w:firstColumn="1" w:firstRow="1" w:lastColumn="0" w:lastRow="0" w:noHBand="0" w:noVBand="1" w:val="04A0"/>
+      </w:tblPr>
+      <w:tblGrid>
+        <w:gridCol w:w="3249"/>
+        <w:gridCol w:w="3249"/>
+        <w:gridCol w:w="3249"/>
+      </w:tblGrid>
+      <w:tr>
+        <w:tc>
+          <w:tcPr>
+            <w:tcW w:type="dxa" w:w="3249"/>
+            <w:shd w:val="clear" w:color="auto" w:fill="D1D5DB"/>
+          </w:tcPr>
+          <w:p>
+            <w:r>
+              <w:rPr>
+                <w:b/>
+                <w:sz w:val="19"/>
+              </w:rPr>
+            </w:r>
+            <w:r>
+              <w:rPr>
+                <w:b/>
+                <w:sz w:val="19"/>
+              </w:rPr>
+              <w:t>Measure</w:t>
+            </w:r>
+          </w:p>
+        </w:tc>
+        <w:tc>
+          <w:tcPr>
+            <w:tcW w:type="dxa" w:w="3249"/>
+            <w:shd w:val="clear" w:color="auto" w:fill="D1D5DB"/>
+          </w:tcPr>
+          <w:p>
+            <w:r>
+              <w:rPr>
+                <w:b/>
+                <w:sz w:val="19"/>
+              </w:rPr>
+            </w:r>
+            <w:r>
+              <w:rPr>
+                <w:b/>
+                <w:sz w:val="19"/>
+              </w:rPr>
+              <w:t>Tested?</w:t>
+            </w:r>
+          </w:p>
+        </w:tc>
+        <w:tc>
+          <w:tcPr>
+            <w:tcW w:type="dxa" w:w="3249"/>
+            <w:shd w:val="clear" w:color="auto" w:fill="D1D5DB"/>
+          </w:tcPr>
+          <w:p>
+            <w:r>
+              <w:rPr>
+                <w:b/>
+                <w:sz w:val="19"/>
+              </w:rPr>
+            </w:r>
+            <w:r>
+              <w:rPr>
+                <w:b/>
+                <w:sz w:val="19"/>
+              </w:rPr>
+              <w:t>Notes</w:t>
+            </w:r>
+          </w:p>
+        </w:tc>
+      </w:tr>
+      <w:tr>
+        <w:tc>
+          <w:tcPr>
+            <w:tcW w:type="dxa" w:w="3249"/>
+          </w:tcPr>
+          <w:p>
+            <w:r>
+              <w:rPr>
+                <w:sz w:val="19"/>
+              </w:rPr>
+            </w:r>
+            <w:r>
+              <w:rPr>
+                <w:sz w:val="19"/>
+              </w:rPr>
+              <w:t>Degree centrality</w:t>
+            </w:r>
+          </w:p>
+        </w:tc>
+        <w:tc>
+          <w:tcPr>
+            <w:tcW w:type="dxa" w:w="3249"/>
+          </w:tcPr>
+          <w:p>
+            <w:r>
+              <w:rPr>
+                <w:sz w:val="19"/>
+              </w:rPr>
+            </w:r>
+            <w:r>
+              <w:rPr>
+                <w:sz w:val="19"/>
+              </w:rPr>
+              <w:t>YES</w:t>
+            </w:r>
+          </w:p>
+        </w:tc>
+        <w:tc>
+          <w:tcPr>
+            <w:tcW w:type="dxa" w:w="3249"/>
+          </w:tcPr>
+          <w:p>
+            <w:r>
+              <w:rPr>
+                <w:sz w:val="19"/>
+              </w:rPr>
+            </w:r>
+            <w:r>
+              <w:rPr>
+                <w:sz w:val="19"/>
+              </w:rPr>
+              <w:t>In-degree and out-degree for directed graphs</w:t>
+            </w:r>
+          </w:p>
+        </w:tc>
+      </w:tr>
+      <w:tr>
+        <w:tc>
+          <w:tcPr>
+            <w:tcW w:type="dxa" w:w="3249"/>
+          </w:tcPr>
+          <w:p>
+            <w:r>
+              <w:rPr>
+                <w:sz w:val="19"/>
+              </w:rPr>
+            </w:r>
+            <w:r>
+              <w:rPr>
+                <w:sz w:val="19"/>
+              </w:rPr>
+              <w:t>Clustering coefficient</w:t>
+            </w:r>
+          </w:p>
+        </w:tc>
+        <w:tc>
+          <w:tcPr>
+            <w:tcW w:type="dxa" w:w="3249"/>
+          </w:tcPr>
+          <w:p>
+            <w:r>
+              <w:rPr>
+                <w:sz w:val="19"/>
+              </w:rPr>
+            </w:r>
+            <w:r>
+              <w:rPr>
+                <w:sz w:val="19"/>
+              </w:rPr>
+              <w:t>YES</w:t>
+            </w:r>
+          </w:p>
+        </w:tc>
+        <w:tc>
+          <w:tcPr>
+            <w:tcW w:type="dxa" w:w="3249"/>
+          </w:tcPr>
+          <w:p>
+            <w:r>
+              <w:rPr>
+                <w:sz w:val="19"/>
+              </w:rPr>
+            </w:r>
+            <w:r>
+              <w:rPr>
+                <w:sz w:val="19"/>
+              </w:rPr>
+              <w:t>Formula: 2m_v / (d_v(d_v−1)). Know how to compute for a node.</w:t>
+            </w:r>
+          </w:p>
+        </w:tc>
+      </w:tr>
+      <w:tr>
+        <w:tc>
+          <w:tcPr>
+            <w:tcW w:type="dxa" w:w="3249"/>
+          </w:tcPr>
+          <w:p>
+            <w:r>
+              <w:rPr>
+                <w:sz w:val="19"/>
+              </w:rPr>
+            </w:r>
+            <w:r>
+              <w:rPr>
+                <w:sz w:val="19"/>
+              </w:rPr>
+              <w:t>Closeness centrality</w:t>
+            </w:r>
+          </w:p>
+        </w:tc>
+        <w:tc>
+          <w:tcPr>
+            <w:tcW w:type="dxa" w:w="3249"/>
+          </w:tcPr>
+          <w:p>
+            <w:r>
+              <w:rPr>
+                <w:sz w:val="19"/>
+              </w:rPr>
+            </w:r>
+            <w:r>
+              <w:rPr>
+                <w:sz w:val="19"/>
+              </w:rPr>
+              <w:t>YES</w:t>
+            </w:r>
+          </w:p>
+        </w:tc>
+        <w:tc>
+          <w:tcPr>
+            <w:tcW w:type="dxa" w:w="3249"/>
+          </w:tcPr>
+          <w:p>
+            <w:r>
+              <w:rPr>
+                <w:sz w:val="19"/>
+              </w:rPr>
+            </w:r>
+            <w:r>
+              <w:rPr>
+                <w:sz w:val="19"/>
+              </w:rPr>
+              <w:t>= (N−1) / sum of shortest path distances. Know the disconnected graph problem → use harmonic centrality instead.</w:t>
+            </w:r>
+          </w:p>
+        </w:tc>
+      </w:tr>
+      <w:tr>
+        <w:tc>
+          <w:tcPr>
+            <w:tcW w:type="dxa" w:w="3249"/>
+          </w:tcPr>
+          <w:p>
+            <w:r>
+              <w:rPr>
+                <w:sz w:val="19"/>
+              </w:rPr>
+            </w:r>
+            <w:r>
+              <w:rPr>
+                <w:sz w:val="19"/>
+              </w:rPr>
+              <w:t>Betweenness centrality (vertex)</w:t>
+            </w:r>
+          </w:p>
+        </w:tc>
+        <w:tc>
+          <w:tcPr>
+            <w:tcW w:type="dxa" w:w="3249"/>
+          </w:tcPr>
+          <w:p>
+            <w:r>
+              <w:rPr>
+                <w:sz w:val="19"/>
+              </w:rPr>
+            </w:r>
+            <w:r>
+              <w:rPr>
+                <w:sz w:val="19"/>
+              </w:rPr>
+              <w:t>YES</w:t>
+            </w:r>
+          </w:p>
+        </w:tc>
+        <w:tc>
+          <w:tcPr>
+            <w:tcW w:type="dxa" w:w="3249"/>
+          </w:tcPr>
+          <w:p>
+            <w:r>
+              <w:rPr>
+                <w:sz w:val="19"/>
+              </w:rPr>
+            </w:r>
+            <w:r>
+              <w:rPr>
+                <w:sz w:val="19"/>
+              </w:rPr>
+              <w:t>Count shortest paths passing through a vertex ÷ total shortest paths between all pairs.</w:t>
+            </w:r>
+          </w:p>
+        </w:tc>
+      </w:tr>
+      <w:tr>
+        <w:tc>
+          <w:tcPr>
+            <w:tcW w:type="dxa" w:w="3249"/>
+          </w:tcPr>
+          <w:p>
+            <w:r>
+              <w:rPr>
+                <w:sz w:val="19"/>
+              </w:rPr>
+            </w:r>
+            <w:r>
+              <w:rPr>
+                <w:sz w:val="19"/>
+              </w:rPr>
+              <w:t>Eigenvector centrality</w:t>
+            </w:r>
+          </w:p>
+        </w:tc>
+        <w:tc>
+          <w:tcPr>
+            <w:tcW w:type="dxa" w:w="3249"/>
+          </w:tcPr>
+          <w:p>
+            <w:r>
+              <w:rPr>
+                <w:sz w:val="19"/>
+              </w:rPr>
+            </w:r>
+            <w:r>
+              <w:rPr>
+                <w:sz w:val="19"/>
+              </w:rPr>
+              <w:t>Conceptual</w:t>
+            </w:r>
+          </w:p>
+        </w:tc>
+        <w:tc>
+          <w:tcPr>
+            <w:tcW w:type="dxa" w:w="3249"/>
+          </w:tcPr>
+          <w:p>
+            <w:r>
+              <w:rPr>
+                <w:sz w:val="19"/>
+              </w:rPr>
+            </w:r>
+            <w:r>
+              <w:rPr>
+                <w:sz w:val="19"/>
+              </w:rPr>
+              <w:t>Know the idea (importance from important neighbours). Power iteration concept.</w:t>
+            </w:r>
+          </w:p>
+        </w:tc>
+      </w:tr>
+      <w:tr>
+        <w:tc>
+          <w:tcPr>
+            <w:tcW w:type="dxa" w:w="3249"/>
+          </w:tcPr>
+          <w:p>
+            <w:r>
+              <w:rPr>
+                <w:sz w:val="19"/>
+              </w:rPr>
+            </w:r>
+            <w:r>
+              <w:rPr>
+                <w:b/>
+                <w:sz w:val="19"/>
+              </w:rPr>
+              <w:t>Edge betweenness</w:t>
+            </w:r>
+          </w:p>
+        </w:tc>
+        <w:tc>
+          <w:tcPr>
+            <w:tcW w:type="dxa" w:w="3249"/>
+          </w:tcPr>
+          <w:p>
+            <w:r>
+              <w:rPr>
+                <w:sz w:val="19"/>
+              </w:rPr>
+            </w:r>
+            <w:r>
+              <w:rPr>
+                <w:b/>
+                <w:sz w:val="19"/>
+              </w:rPr>
+              <w:t>NO</w:t>
+            </w:r>
+          </w:p>
+        </w:tc>
+        <w:tc>
+          <w:tcPr>
+            <w:tcW w:type="dxa" w:w="3249"/>
+          </w:tcPr>
+          <w:p>
+            <w:r>
+              <w:rPr>
+                <w:sz w:val="19"/>
+              </w:rPr>
+            </w:r>
+            <w:r>
+              <w:rPr>
+                <w:sz w:val="19"/>
+              </w:rPr>
+              <w:t>"Ash centrality will not be answered in your final exam."</w:t>
+            </w:r>
+          </w:p>
+        </w:tc>
+      </w:tr>
+      <w:tr>
+        <w:tc>
+          <w:tcPr>
+            <w:tcW w:type="dxa" w:w="3249"/>
+          </w:tcPr>
+          <w:p>
+            <w:r>
+              <w:rPr>
+                <w:sz w:val="19"/>
+              </w:rPr>
+            </w:r>
+            <w:r>
+              <w:rPr>
+                <w:sz w:val="19"/>
+              </w:rPr>
+              <w:t>Graph density</w:t>
+            </w:r>
+          </w:p>
+        </w:tc>
+        <w:tc>
+          <w:tcPr>
+            <w:tcW w:type="dxa" w:w="3249"/>
+          </w:tcPr>
+          <w:p>
+            <w:r>
+              <w:rPr>
+                <w:sz w:val="19"/>
+              </w:rPr>
+            </w:r>
+            <w:r>
+              <w:rPr>
+                <w:sz w:val="19"/>
+              </w:rPr>
+              <w:t>YES</w:t>
+            </w:r>
+          </w:p>
+        </w:tc>
+        <w:tc>
+          <w:tcPr>
+            <w:tcW w:type="dxa" w:w="3249"/>
+          </w:tcPr>
+          <w:p>
+            <w:r>
+              <w:rPr>
+                <w:sz w:val="19"/>
+              </w:rPr>
+            </w:r>
+            <w:r>
+              <w:rPr>
+                <w:sz w:val="19"/>
+              </w:rPr>
+              <w:t>= K / N (edges / nodes) — or 2|E| / N(N−1) for undirected. Know which formula Dr. Fong uses.</w:t>
+            </w:r>
+          </w:p>
+        </w:tc>
+      </w:tr>
+    </w:tbl>
+    <w:p/>
+    <w:p>
+      <w:pPr>
+        <w:pStyle w:val="Heading3"/>
+      </w:pPr>
+      <w:r>
+        <w:t>Programming (10%) — What to Revise</w:t>
+      </w:r>
+    </w:p>
+    <w:p>
+      <w:pPr>
+        <w:spacing w:before="40" w:after="80"/>
+        <w:ind w:left="283"/>
+      </w:pPr>
+      <w:r>
+        <w:rPr>
+          <w:b/>
+          <w:color w:val="10B981"/>
+          <w:sz w:val="20"/>
+        </w:rPr>
+        <w:t xml:space="preserve">ELI5: </w:t>
+      </w:r>
+      <w:r>
+        <w:rPr>
+          <w:i/>
+          <w:color w:val="10B981"/>
+          <w:sz w:val="20"/>
+        </w:rPr>
+        <w:t>Revise Tutorial 3 (Q2, Q3, Q4) and the take-home inverted index exercise. Questions give a skeleton with TO-DO gaps to fill. Focus on: textFile, map, flatMap, filter, reduceByKey, groupByKey, sortByKey syntax.</w:t>
+      </w:r>
+    </w:p>
+    <w:p>
+      <w:pPr>
+        <w:spacing w:after="80"/>
+      </w:pPr>
+      <w:r>
+        <w:rPr>
+          <w:sz w:val="21"/>
+        </w:rPr>
+        <w:t xml:space="preserve">Dr. Fong specifically said: revise </w:t>
+      </w:r>
+      <w:r>
+        <w:rPr>
+          <w:b/>
+          <w:sz w:val="21"/>
+        </w:rPr>
+        <w:t>Tutorial 3</w:t>
+      </w:r>
+      <w:r>
+        <w:rPr>
+          <w:sz w:val="21"/>
+        </w:rPr>
+        <w:t>. The take-home exercise is a past exam question (makeup version).</w:t>
+      </w:r>
+    </w:p>
+    <w:tbl>
+      <w:tblPr>
+        <w:tblStyle w:val="TableGrid"/>
+        <w:tblW w:type="auto" w:w="0"/>
+        <w:tblLook w:firstColumn="1" w:firstRow="1" w:lastColumn="0" w:lastRow="0" w:noHBand="0" w:noVBand="1" w:val="04A0"/>
+      </w:tblPr>
+      <w:tblGrid>
+        <w:gridCol w:w="4873"/>
+        <w:gridCol w:w="4873"/>
+      </w:tblGrid>
+      <w:tr>
+        <w:tc>
+          <w:tcPr>
+            <w:tcW w:type="dxa" w:w="4873"/>
+            <w:shd w:val="clear" w:color="auto" w:fill="D1D5DB"/>
+          </w:tcPr>
+          <w:p>
+            <w:r>
+              <w:rPr>
+                <w:b/>
+                <w:sz w:val="19"/>
+              </w:rPr>
+            </w:r>
+            <w:r>
+              <w:rPr>
+                <w:b/>
+                <w:sz w:val="19"/>
+              </w:rPr>
+              <w:t>Exercise</w:t>
+            </w:r>
+          </w:p>
+        </w:tc>
+        <w:tc>
+          <w:tcPr>
+            <w:tcW w:type="dxa" w:w="4873"/>
+            <w:shd w:val="clear" w:color="auto" w:fill="D1D5DB"/>
+          </w:tcPr>
+          <w:p>
+            <w:r>
+              <w:rPr>
+                <w:b/>
+                <w:sz w:val="19"/>
+              </w:rPr>
+            </w:r>
+            <w:r>
+              <w:rPr>
+                <w:b/>
+                <w:sz w:val="19"/>
+              </w:rPr>
+              <w:t>Skills tested</w:t>
+            </w:r>
+          </w:p>
+        </w:tc>
+      </w:tr>
+      <w:tr>
+        <w:tc>
+          <w:tcPr>
+            <w:tcW w:type="dxa" w:w="4873"/>
+          </w:tcPr>
+          <w:p>
+            <w:r>
+              <w:rPr>
+                <w:sz w:val="19"/>
+              </w:rPr>
+            </w:r>
+            <w:r>
+              <w:rPr>
+                <w:sz w:val="19"/>
+              </w:rPr>
+              <w:t>Tutorial 3 Q2</w:t>
+            </w:r>
+          </w:p>
+        </w:tc>
+        <w:tc>
+          <w:tcPr>
+            <w:tcW w:type="dxa" w:w="4873"/>
+          </w:tcPr>
+          <w:p>
+            <w:r>
+              <w:rPr>
+                <w:sz w:val="19"/>
+              </w:rPr>
+            </w:r>
+            <w:r>
+              <w:rPr>
+                <w:sz w:val="19"/>
+              </w:rPr>
+              <w:t>Basic RDD operations: textFile, map, filter, reduceByKey</w:t>
+            </w:r>
+          </w:p>
+        </w:tc>
+      </w:tr>
+      <w:tr>
+        <w:tc>
+          <w:tcPr>
+            <w:tcW w:type="dxa" w:w="4873"/>
+          </w:tcPr>
+          <w:p>
+            <w:r>
+              <w:rPr>
+                <w:sz w:val="19"/>
+              </w:rPr>
+            </w:r>
+            <w:r>
+              <w:rPr>
+                <w:sz w:val="19"/>
+              </w:rPr>
+              <w:t>Tutorial 3 Q3</w:t>
+            </w:r>
+          </w:p>
+        </w:tc>
+        <w:tc>
+          <w:tcPr>
+            <w:tcW w:type="dxa" w:w="4873"/>
+          </w:tcPr>
+          <w:p>
+            <w:r>
+              <w:rPr>
+                <w:sz w:val="19"/>
+              </w:rPr>
+            </w:r>
+            <w:r>
+              <w:rPr>
+                <w:sz w:val="19"/>
+              </w:rPr>
+              <w:t>DNA pattern counting with RDD</w:t>
+            </w:r>
+          </w:p>
+        </w:tc>
+      </w:tr>
+      <w:tr>
+        <w:tc>
+          <w:tcPr>
+            <w:tcW w:type="dxa" w:w="4873"/>
+          </w:tcPr>
+          <w:p>
+            <w:r>
+              <w:rPr>
+                <w:sz w:val="19"/>
+              </w:rPr>
+            </w:r>
+            <w:r>
+              <w:rPr>
+                <w:sz w:val="19"/>
+              </w:rPr>
+              <w:t>Tutorial 3 Q4</w:t>
+            </w:r>
+          </w:p>
+        </w:tc>
+        <w:tc>
+          <w:tcPr>
+            <w:tcW w:type="dxa" w:w="4873"/>
+          </w:tcPr>
+          <w:p>
+            <w:r>
+              <w:rPr>
+                <w:sz w:val="19"/>
+              </w:rPr>
+            </w:r>
+            <w:r>
+              <w:rPr>
+                <w:sz w:val="19"/>
+              </w:rPr>
+              <w:t>More complex RDD pipelines</w:t>
+            </w:r>
+          </w:p>
+        </w:tc>
+      </w:tr>
+      <w:tr>
+        <w:tc>
+          <w:tcPr>
+            <w:tcW w:type="dxa" w:w="4873"/>
+          </w:tcPr>
+          <w:p>
+            <w:r>
+              <w:rPr>
+                <w:sz w:val="19"/>
+              </w:rPr>
+            </w:r>
+            <w:r>
+              <w:rPr>
+                <w:sz w:val="19"/>
+              </w:rPr>
+              <w:t>Take-home inverted index</w:t>
+            </w:r>
+          </w:p>
+        </w:tc>
+        <w:tc>
+          <w:tcPr>
+            <w:tcW w:type="dxa" w:w="4873"/>
+          </w:tcPr>
+          <w:p>
+            <w:r>
+              <w:rPr>
+                <w:sz w:val="19"/>
+              </w:rPr>
+            </w:r>
+            <w:r>
+              <w:rPr>
+                <w:sz w:val="19"/>
+              </w:rPr>
+              <w:t>flatMap → (word, docID) → groupByKey → sort</w:t>
+            </w:r>
+          </w:p>
+        </w:tc>
+      </w:tr>
+    </w:tbl>
+    <w:p/>
+    <w:p>
+      <w:pPr>
+        <w:spacing w:before="40" w:after="80"/>
+        <w:ind w:left="283"/>
+      </w:pPr>
+      <w:r>
+        <w:rPr>
+          <w:b/>
+          <w:color w:val="F59E0B"/>
+        </w:rPr>
+        <w:t xml:space="preserve">NOTE: </w:t>
+      </w:r>
+      <w:r>
+        <w:rPr>
+          <w:color w:val="92400E"/>
+          <w:sz w:val="20"/>
+        </w:rPr>
+        <w:t>The programming question gives you a series of TO-DO steps to fill in. You won't be writing from scratch — you'll complete gaps in a provided skeleton. Focus on knowing what each RDD operation does and its syntax.</w:t>
       </w:r>
     </w:p>
     <w:p>

</xml_diff>